<commit_message>
docs: complete report C audit design and export regression evidence
</commit_message>
<xml_diff>
--- a/reports/成员C_可视化交互与选票审计模块_报告.docx
+++ b/reports/成员C_可视化交互与选票审计模块_报告.docx
@@ -187,7 +187,7 @@
         <w:tabs>
           <w:tab w:val="left" w:pos="6870"/>
         </w:tabs>
-        <w:ind w:firstLine="1078" w:firstLineChars="245"/>
+        <w:ind w:firstLine="0" w:left="1080"/>
         <w:rPr>
           <w:sz w:val="44"/>
           <w:szCs w:val="44"/>
@@ -196,14 +196,18 @@
       </w:pPr>
       <w:r>
         <w:rPr>
-          <w:rFonts w:hint="eastAsia" w:ascii="黑体" w:eastAsia="黑体"/>
+          <w:rFonts w:hint="eastAsia" w:ascii="黑体" w:eastAsia="黑体" w:hAnsi="黑体"/>
+          <w:b w:val="0"/>
+          <w:color w:val="000000"/>
           <w:sz w:val="44"/>
         </w:rPr>
         <w:t>题   目：基于同态加密的</w:t>
       </w:r>
       <w:r>
         <w:rPr>
-          <w:rFonts w:hint="eastAsia"/>
+          <w:rFonts w:hint="eastAsia" w:ascii="黑体" w:hAnsi="黑体" w:eastAsia="黑体"/>
+          <w:b w:val="0"/>
+          <w:color w:val="000000"/>
           <w:sz w:val="44"/>
           <w:szCs w:val="44"/>
           <w:u w:val="single"/>
@@ -211,6 +215,9 @@
       </w:r>
       <w:r>
         <w:rPr>
+          <w:rFonts w:ascii="黑体" w:hAnsi="黑体" w:eastAsia="黑体"/>
+          <w:b w:val="0"/>
+          <w:color w:val="000000"/>
           <w:sz w:val="44"/>
           <w:szCs w:val="44"/>
           <w:u w:val="single"/>
@@ -218,7 +225,9 @@
       </w:r>
       <w:r>
         <w:rPr>
-          <w:rFonts w:hint="eastAsia"/>
+          <w:rFonts w:hint="eastAsia" w:ascii="黑体" w:hAnsi="黑体" w:eastAsia="黑体"/>
+          <w:b w:val="0"/>
+          <w:color w:val="000000"/>
           <w:sz w:val="44"/>
           <w:szCs w:val="44"/>
           <w:u w:val="single"/>
@@ -230,7 +239,7 @@
         <w:tabs>
           <w:tab w:val="left" w:pos="6870"/>
         </w:tabs>
-        <w:ind w:firstLine="1078" w:firstLineChars="245"/>
+        <w:ind w:firstLine="0" w:left="3060"/>
         <w:rPr>
           <w:sz w:val="44"/>
           <w:szCs w:val="44"/>
@@ -239,7 +248,9 @@
       </w:pPr>
       <w:r>
         <w:rPr>
-          <w:rFonts w:hint="eastAsia"/>
+          <w:rFonts w:hint="eastAsia" w:ascii="黑体" w:hAnsi="黑体" w:eastAsia="黑体"/>
+          <w:b w:val="0"/>
+          <w:color w:val="000000"/>
           <w:sz w:val="44"/>
           <w:szCs w:val="44"/>
         </w:rPr>
@@ -247,7 +258,9 @@
       </w:r>
       <w:r>
         <w:rPr>
-          <w:rFonts w:hint="eastAsia"/>
+          <w:rFonts w:hint="eastAsia" w:ascii="黑体" w:hAnsi="黑体" w:eastAsia="黑体"/>
+          <w:b w:val="0"/>
+          <w:color w:val="000000"/>
           <w:sz w:val="44"/>
           <w:szCs w:val="44"/>
           <w:u w:val="single"/>
@@ -255,6 +268,9 @@
       </w:r>
       <w:r>
         <w:rPr>
+          <w:rFonts w:ascii="黑体" w:hAnsi="黑体" w:eastAsia="黑体"/>
+          <w:b w:val="0"/>
+          <w:color w:val="000000"/>
           <w:sz w:val="44"/>
           <w:szCs w:val="44"/>
           <w:u w:val="single"/>
@@ -262,7 +278,9 @@
       </w:r>
       <w:r>
         <w:rPr>
-          <w:rFonts w:hint="eastAsia"/>
+          <w:rFonts w:hint="eastAsia" w:ascii="黑体" w:hAnsi="黑体" w:eastAsia="黑体"/>
+          <w:b w:val="0"/>
+          <w:color w:val="000000"/>
           <w:sz w:val="44"/>
           <w:szCs w:val="44"/>
           <w:u w:val="single"/>
@@ -450,10 +468,10 @@
             </w:pPr>
             <w:r>
               <w:rPr>
-                <w:rFonts w:ascii="宋体" w:hAnsi="宋体" w:eastAsia="宋体"/>
+                <w:rFonts w:ascii="Times New Roman" w:hAnsi="Times New Roman" w:eastAsia="宋体"/>
                 <w:b w:val="0"/>
                 <w:color w:val="000000"/>
-                <w:sz w:val="24"/>
+                <w:sz w:val="30"/>
               </w:rPr>
               <w:t>成员C  姓名：________</w:t>
             </w:r>
@@ -522,10 +540,10 @@
             </w:pPr>
             <w:r>
               <w:rPr>
-                <w:rFonts w:ascii="宋体" w:hAnsi="宋体" w:eastAsia="宋体"/>
+                <w:rFonts w:ascii="Times New Roman" w:hAnsi="Times New Roman" w:eastAsia="宋体"/>
                 <w:b w:val="0"/>
                 <w:color w:val="000000"/>
-                <w:sz w:val="24"/>
+                <w:sz w:val="30"/>
               </w:rPr>
               <w:t>B230414  学号：________</w:t>
             </w:r>
@@ -738,67 +756,67 @@
             </w:pPr>
             <w:r>
               <w:rPr>
-                <w:rFonts w:ascii="宋体" w:hAnsi="宋体" w:cs="Times New Roman" w:eastAsia="宋体"/>
+                <w:rFonts w:ascii="Times New Roman" w:hAnsi="Times New Roman" w:cs="Times New Roman" w:eastAsia="宋体"/>
                 <w:b w:val="0"/>
                 <w:color w:val="000000"/>
-                <w:sz w:val="24"/>
+                <w:sz w:val="30"/>
                 <w:szCs w:val="30"/>
               </w:rPr>
               <w:t>2026.10.26—2026.11.06</w:t>
             </w:r>
             <w:r>
               <w:rPr>
-                <w:rFonts w:hint="eastAsia" w:ascii="宋体" w:hAnsi="宋体" w:cs="Times New Roman" w:eastAsia="宋体"/>
+                <w:rFonts w:hint="eastAsia" w:ascii="Times New Roman" w:hAnsi="Times New Roman" w:cs="Times New Roman" w:eastAsia="宋体"/>
                 <w:b w:val="0"/>
                 <w:color w:val="000000"/>
-                <w:sz w:val="24"/>
+                <w:sz w:val="30"/>
                 <w:szCs w:val="30"/>
                 <w:lang w:val="en-US" w:eastAsia="zh-CN"/>
               </w:rPr>
             </w:r>
             <w:r>
               <w:rPr>
-                <w:rFonts w:ascii="宋体" w:hAnsi="宋体" w:cs="Times New Roman" w:eastAsia="宋体"/>
+                <w:rFonts w:ascii="Times New Roman" w:hAnsi="Times New Roman" w:cs="Times New Roman" w:eastAsia="宋体"/>
                 <w:b w:val="0"/>
                 <w:color w:val="000000"/>
-                <w:sz w:val="24"/>
+                <w:sz w:val="30"/>
                 <w:szCs w:val="30"/>
               </w:rPr>
             </w:r>
             <w:r>
               <w:rPr>
-                <w:rFonts w:hint="eastAsia" w:ascii="宋体" w:hAnsi="宋体" w:cs="Times New Roman" w:eastAsia="宋体"/>
+                <w:rFonts w:hint="eastAsia" w:ascii="Times New Roman" w:hAnsi="Times New Roman" w:cs="Times New Roman" w:eastAsia="宋体"/>
                 <w:b w:val="0"/>
                 <w:color w:val="000000"/>
-                <w:sz w:val="24"/>
+                <w:sz w:val="30"/>
                 <w:szCs w:val="30"/>
                 <w:lang w:val="en-US" w:eastAsia="zh-CN"/>
               </w:rPr>
             </w:r>
             <w:r>
               <w:rPr>
-                <w:rFonts w:ascii="宋体" w:hAnsi="宋体" w:cs="Times New Roman" w:eastAsia="宋体"/>
+                <w:rFonts w:ascii="Times New Roman" w:hAnsi="Times New Roman" w:cs="Times New Roman" w:eastAsia="宋体"/>
                 <w:b w:val="0"/>
                 <w:color w:val="000000"/>
-                <w:sz w:val="24"/>
+                <w:sz w:val="30"/>
                 <w:szCs w:val="30"/>
               </w:rPr>
             </w:r>
             <w:r>
               <w:rPr>
-                <w:rFonts w:hint="eastAsia" w:ascii="宋体" w:hAnsi="宋体" w:cs="Times New Roman" w:eastAsia="宋体"/>
+                <w:rFonts w:hint="eastAsia" w:ascii="Times New Roman" w:hAnsi="Times New Roman" w:cs="Times New Roman" w:eastAsia="宋体"/>
                 <w:b w:val="0"/>
                 <w:color w:val="000000"/>
-                <w:sz w:val="24"/>
+                <w:sz w:val="30"/>
                 <w:szCs w:val="30"/>
               </w:rPr>
             </w:r>
             <w:r>
               <w:rPr>
-                <w:rFonts w:ascii="宋体" w:hAnsi="宋体" w:cs="Times New Roman" w:eastAsia="宋体"/>
+                <w:rFonts w:ascii="Times New Roman" w:hAnsi="Times New Roman" w:cs="Times New Roman" w:eastAsia="宋体"/>
                 <w:b w:val="0"/>
                 <w:color w:val="000000"/>
-                <w:sz w:val="24"/>
+                <w:sz w:val="30"/>
                 <w:szCs w:val="30"/>
               </w:rPr>
             </w:r>
@@ -808,27 +826,14 @@
     </w:tbl>
     <w:p>
       <w:pPr>
-        <w:tabs>
-          <w:tab w:val="left" w:pos="6870"/>
-        </w:tabs>
-        <w:rPr>
-          <w:rFonts w:ascii="黑体" w:eastAsia="黑体"/>
-          <w:sz w:val="21"/>
-          <w:szCs w:val="21"/>
-        </w:rPr>
-      </w:pPr>
-    </w:p>
-    <w:p>
-      <w:pPr>
-        <w:tabs>
-          <w:tab w:val="left" w:pos="6870"/>
-        </w:tabs>
-        <w:rPr>
-          <w:rFonts w:ascii="黑体" w:eastAsia="黑体"/>
-          <w:sz w:val="21"/>
-          <w:szCs w:val="21"/>
-        </w:rPr>
-      </w:pPr>
+        <w:pageBreakBefore/>
+        <w:spacing w:after="0" w:before="0" w:line="20" w:lineRule="exact"/>
+      </w:pPr>
+      <w:r>
+        <w:rPr>
+          <w:sz w:val="2"/>
+        </w:rPr>
+      </w:r>
     </w:p>
     <w:tbl>
       <w:tblPr>
@@ -2146,154 +2151,193 @@
     </w:tbl>
     <w:p>
       <w:pPr>
+        <w:pStyle w:val="ReportTitle"/>
+        <w:pageBreakBefore/>
+      </w:pPr>
+      <w:r>
+        <w:rPr>
+          <w:rFonts w:ascii="Times New Roman" w:hAnsi="Times New Roman" w:eastAsia="宋体"/>
+          <w:b/>
+          <w:color w:val="000000"/>
+          <w:sz w:val="32"/>
+        </w:rPr>
+        <w:t>基于同态加密的隐私保护投票系统</w:t>
+      </w:r>
+    </w:p>
+    <w:p>
+      <w:pPr>
+        <w:pStyle w:val="ReportH2"/>
+        <w:spacing w:after="120"/>
+      </w:pPr>
+      <w:r>
+        <w:rPr>
+          <w:rFonts w:ascii="Times New Roman" w:hAnsi="Times New Roman" w:eastAsia="宋体"/>
+          <w:b/>
+          <w:color w:val="000000"/>
+          <w:sz w:val="24"/>
+        </w:rPr>
+        <w:t>成员C分工报告  可视化交互与选票审计模块</w:t>
+      </w:r>
+    </w:p>
+    <w:p>
+      <w:pPr>
+        <w:pStyle w:val="ReportH1"/>
+      </w:pPr>
+      <w:r>
+        <w:rPr>
+          <w:rFonts w:ascii="Times New Roman" w:hAnsi="Times New Roman" w:eastAsia="宋体"/>
+          <w:b/>
+          <w:color w:val="000000"/>
+          <w:sz w:val="28"/>
+        </w:rPr>
+        <w:t>一、课题内容和要求</w:t>
+      </w:r>
+    </w:p>
+    <w:p>
+      <w:pPr>
+        <w:pStyle w:val="ReportH2"/>
+      </w:pPr>
+      <w:r>
+        <w:rPr>
+          <w:rFonts w:ascii="Times New Roman" w:hAnsi="Times New Roman" w:eastAsia="宋体"/>
+          <w:b/>
+          <w:color w:val="000000"/>
+          <w:sz w:val="24"/>
+        </w:rPr>
+        <w:t>1.1 课题内容</w:t>
+      </w:r>
+    </w:p>
+    <w:p>
+      <w:pPr>
+        <w:pStyle w:val="ReportBody"/>
+      </w:pPr>
+      <w:r>
+        <w:rPr>
+          <w:rFonts w:ascii="Times New Roman" w:hAnsi="Times New Roman" w:eastAsia="宋体"/>
+          <w:b w:val="0"/>
+          <w:color w:val="000000"/>
+          <w:sz w:val="24"/>
+        </w:rPr>
+        <w:t>系统使用Paillier加法同态加密实现本地可视化投票。投票端生成加密选票，计票端只访问公开数据并汇总密文，独立解密进程在投票关闭后返回各选项总票数。额外实现投票关闭与Ed25519签名清单审计，检测已接收选票的删除和修改。</w:t>
+      </w:r>
+    </w:p>
+    <w:p>
+      <w:pPr>
+        <w:pStyle w:val="ReportBody"/>
+      </w:pPr>
+      <w:r>
+        <w:rPr>
+          <w:rFonts w:ascii="Times New Roman" w:hAnsi="Times New Roman" w:eastAsia="宋体"/>
+          <w:b w:val="0"/>
+          <w:color w:val="000000"/>
+          <w:sz w:val="24"/>
+        </w:rPr>
+        <w:t>把加密与计票模块组合成可操作的Windows小应用，建立从ID校验、选票登记到关闭投票的状态流程，并以签名清单检测已接收选票被修改或删除。重点是可用性、异常处理、审计边界和集成验证。</w:t>
+      </w:r>
+    </w:p>
+    <w:p>
+      <w:pPr>
+        <w:pStyle w:val="ReportH2"/>
+      </w:pPr>
+      <w:r>
+        <w:rPr>
+          <w:rFonts w:ascii="Times New Roman" w:hAnsi="Times New Roman" w:eastAsia="宋体"/>
+          <w:b/>
+          <w:color w:val="000000"/>
+          <w:sz w:val="24"/>
+        </w:rPr>
+        <w:t>1.2 课题要求与本分工责任</w:t>
+      </w:r>
+    </w:p>
+    <w:p>
+      <w:pPr>
+        <w:pStyle w:val="ReportBody"/>
+      </w:pPr>
+      <w:r>
+        <w:rPr>
+          <w:rFonts w:ascii="Times New Roman" w:hAnsi="Times New Roman" w:eastAsia="宋体"/>
+          <w:b w:val="0"/>
+          <w:color w:val="000000"/>
+          <w:sz w:val="24"/>
+        </w:rPr>
+        <w:t>四个页面分别承担创建管理、加密投票、汇总结果、审计实验。长耗时工作进入后台线程。投票必须具有合法ID、正确轮次、时间戳和密文维度；一个ID只允许登记一次。关闭后不能再投，审计失败时拒绝计票。额外功能以临时副本演示修改和删除，不破坏原始数据。</w:t>
+      </w:r>
+    </w:p>
+    <w:p>
+      <w:pPr>
+        <w:pStyle w:val="ReportBody"/>
+      </w:pPr>
+      <w:r>
+        <w:rPr>
+          <w:rFonts w:ascii="Times New Roman" w:hAnsi="Times New Roman" w:eastAsia="宋体"/>
+          <w:b w:val="0"/>
+          <w:color w:val="000000"/>
+          <w:sz w:val="24"/>
+        </w:rPr>
+        <w:t>本报告对应的代码范围：app_ui.py；audit_service.py；election_service.py；common.py；ui_smoke.py；打包配置与集成测试。</w:t>
+      </w:r>
+    </w:p>
+    <w:p>
+      <w:pPr>
+        <w:pStyle w:val="ReportH1"/>
+      </w:pPr>
+      <w:r>
+        <w:rPr>
+          <w:rFonts w:ascii="Times New Roman" w:hAnsi="Times New Roman" w:eastAsia="宋体"/>
+          <w:b/>
+          <w:color w:val="000000"/>
+          <w:sz w:val="28"/>
+        </w:rPr>
+        <w:t>二、需求分析和总体设计</w:t>
+      </w:r>
+    </w:p>
+    <w:p>
+      <w:pPr>
+        <w:pStyle w:val="ReportH2"/>
+      </w:pPr>
+      <w:r>
+        <w:t>2.1 本课题的主要功能</w:t>
+      </w:r>
+    </w:p>
+    <w:p>
+      <w:pPr>
+        <w:pStyle w:val="ReportBody"/>
+      </w:pPr>
+      <w:r>
+        <w:t>界面提供创建、投票、结果和审计四个页面；登记服务负责名单、唯一ID、关闭状态及签名清单。审计模块校验JSON结构、签名、配置摘要和选票集合；导出功能只交付当前已审计的公开文件。后台线程执行耗时操作，主线程更新控件。</w:t>
+      </w:r>
+    </w:p>
+    <w:p>
+      <w:pPr>
+        <w:pStyle w:val="ReportH2"/>
+      </w:pPr>
+      <w:r>
+        <w:t>2.2 本课题的设计过程</w:t>
+      </w:r>
+    </w:p>
+    <w:p>
+      <w:pPr>
+        <w:pStyle w:val="ReportBody"/>
+      </w:pPr>
+      <w:r>
+        <w:t>先固定公开JSON接口，再把每张选票摘要加入签名清单，使修改与删除都有可比较的基准。文件损坏时统一返回可解释的VoteError，并拒绝继续计票。公开包采用明确文件清单，避免递归搜集目录中的无关JSON；GUI通过单写入锁和任务禁用防止常规并发操作。</w:t>
+      </w:r>
+    </w:p>
+    <w:p>
+      <w:pPr>
+        <w:pStyle w:val="ReportH2"/>
+      </w:pPr>
+      <w:r>
+        <w:t>2.3 模块接口与分工</w:t>
+      </w:r>
+    </w:p>
+    <w:p>
+      <w:pPr>
+        <w:pStyle w:val="ReportCaption"/>
         <w:keepNext/>
-        <w:pageBreakBefore/>
-        <w:spacing w:line="300" w:lineRule="auto" w:after="160"/>
-      </w:pPr>
-      <w:r>
-        <w:rPr>
-          <w:rFonts w:ascii="宋体" w:hAnsi="宋体" w:eastAsia="宋体"/>
-          <w:b/>
-          <w:color w:val="000000"/>
-          <w:sz w:val="28"/>
-        </w:rPr>
-        <w:t>基于同态加密的隐私保护投票系统</w:t>
-      </w:r>
-    </w:p>
-    <w:p>
-      <w:pPr>
-        <w:spacing w:line="300" w:lineRule="auto" w:after="160"/>
-      </w:pPr>
-      <w:r>
-        <w:rPr>
-          <w:rFonts w:ascii="宋体" w:hAnsi="宋体" w:eastAsia="宋体"/>
-          <w:b/>
-          <w:color w:val="000000"/>
-          <w:sz w:val="24"/>
-        </w:rPr>
-        <w:t>成员C分工报告  可视化交互与选票审计模块</w:t>
-      </w:r>
-    </w:p>
-    <w:p>
-      <w:pPr>
-        <w:keepNext/>
-        <w:pageBreakBefore w:val="0"/>
-        <w:spacing w:line="300" w:lineRule="auto" w:after="160"/>
-      </w:pPr>
-      <w:r>
-        <w:rPr>
-          <w:rFonts w:ascii="宋体" w:hAnsi="宋体" w:eastAsia="宋体"/>
-          <w:b/>
-          <w:color w:val="000000"/>
-          <w:sz w:val="28"/>
-        </w:rPr>
-        <w:t>一 课题内容和要求</w:t>
-      </w:r>
-    </w:p>
-    <w:p>
-      <w:pPr>
-        <w:keepNext/>
-        <w:spacing w:line="300" w:lineRule="auto" w:after="100"/>
-      </w:pPr>
-      <w:r>
-        <w:rPr>
-          <w:rFonts w:ascii="宋体" w:hAnsi="宋体" w:eastAsia="宋体"/>
-          <w:b/>
-          <w:color w:val="000000"/>
-          <w:sz w:val="24"/>
-        </w:rPr>
-        <w:t>1.1 课题内容</w:t>
-      </w:r>
-    </w:p>
-    <w:p>
-      <w:pPr>
-        <w:spacing w:line="300" w:lineRule="auto" w:after="100"/>
-        <w:ind w:firstLine="480"/>
-      </w:pPr>
-      <w:r>
-        <w:rPr>
-          <w:rFonts w:ascii="宋体" w:hAnsi="宋体" w:eastAsia="宋体"/>
-          <w:b w:val="0"/>
-          <w:color w:val="000000"/>
-          <w:sz w:val="24"/>
-        </w:rPr>
-        <w:t>系统使用Paillier加法同态加密实现本地可视化投票。投票端生成加密选票，计票端只访问公开数据并汇总密文，独立解密进程在投票关闭后返回各选项总票数。额外实现投票关闭与Ed25519签名清单审计，检测已接收选票的删除和修改。</w:t>
-      </w:r>
-    </w:p>
-    <w:p>
-      <w:pPr>
-        <w:spacing w:line="300" w:lineRule="auto" w:after="100"/>
-        <w:ind w:firstLine="480"/>
-      </w:pPr>
-      <w:r>
-        <w:rPr>
-          <w:rFonts w:ascii="宋体" w:hAnsi="宋体" w:eastAsia="宋体"/>
-          <w:b w:val="0"/>
-          <w:color w:val="000000"/>
-          <w:sz w:val="24"/>
-        </w:rPr>
-        <w:t>把加密与计票模块组合成可操作的Windows小应用，建立从ID校验、选票登记到关闭投票的状态流程，并以签名清单检测已接收选票被修改或删除。重点是可用性、异常处理、审计边界和集成验证。</w:t>
-      </w:r>
-    </w:p>
-    <w:p>
-      <w:pPr>
-        <w:keepNext/>
-        <w:spacing w:line="300" w:lineRule="auto" w:after="100"/>
-      </w:pPr>
-      <w:r>
-        <w:rPr>
-          <w:rFonts w:ascii="宋体" w:hAnsi="宋体" w:eastAsia="宋体"/>
-          <w:b/>
-          <w:color w:val="000000"/>
-          <w:sz w:val="24"/>
-        </w:rPr>
-        <w:t>1.2 课题要求与本分工责任</w:t>
-      </w:r>
-    </w:p>
-    <w:p>
-      <w:pPr>
-        <w:spacing w:line="300" w:lineRule="auto" w:after="100"/>
-        <w:ind w:firstLine="480"/>
-      </w:pPr>
-      <w:r>
-        <w:rPr>
-          <w:rFonts w:ascii="宋体" w:hAnsi="宋体" w:eastAsia="宋体"/>
-          <w:b w:val="0"/>
-          <w:color w:val="000000"/>
-          <w:sz w:val="24"/>
-        </w:rPr>
-        <w:t>四个页面分别承担创建管理、加密投票、汇总结果、审计实验。长耗时工作进入后台线程。投票必须具有合法ID、正确轮次、时间戳和密文维度；一个ID只允许登记一次。关闭后不能再投，审计失败时拒绝计票。额外功能以临时副本演示修改和删除，不破坏原始数据。</w:t>
-      </w:r>
-    </w:p>
-    <w:p>
-      <w:pPr>
-        <w:spacing w:line="300" w:lineRule="auto" w:after="100"/>
-        <w:ind w:firstLine="480"/>
-      </w:pPr>
-      <w:r>
-        <w:rPr>
-          <w:rFonts w:ascii="宋体" w:hAnsi="宋体" w:eastAsia="宋体"/>
-          <w:b w:val="0"/>
-          <w:color w:val="000000"/>
-          <w:sz w:val="24"/>
-        </w:rPr>
-        <w:t>本报告对应的代码范围：app_ui.py；audit_service.py；election_service.py；common.py；ui_smoke.py；打包配置与集成测试。</w:t>
-      </w:r>
-    </w:p>
-    <w:p>
-      <w:pPr>
-        <w:keepNext/>
-        <w:pageBreakBefore w:val="0"/>
-        <w:spacing w:line="300" w:lineRule="auto" w:after="160"/>
-      </w:pPr>
-      <w:r>
-        <w:rPr>
-          <w:rFonts w:ascii="宋体" w:hAnsi="宋体" w:eastAsia="宋体"/>
-          <w:b/>
-          <w:color w:val="000000"/>
-          <w:sz w:val="28"/>
-        </w:rPr>
-        <w:t>二 需求分析和总体设计</w:t>
+      </w:pPr>
+      <w:r>
+        <w:t>表1 小组模块划分</w:t>
       </w:r>
     </w:p>
     <w:tbl>
@@ -2311,12 +2355,17 @@
       <w:tr>
         <w:trPr>
           <w:tblHeader/>
+          <w:tblHeader/>
         </w:trPr>
         <w:tc>
           <w:tcPr>
             <w:tcW w:type="dxa" w:w="794"/>
             <w:vAlign w:val="center"/>
             <w:tcBorders>
+              <w:top w:val="single" w:sz="4" w:color="D9D9D9"/>
+              <w:left w:val="single" w:sz="4" w:color="D9D9D9"/>
+              <w:bottom w:val="single" w:sz="4" w:color="D9D9D9"/>
+              <w:right w:val="single" w:sz="4" w:color="D9D9D9"/>
               <w:top w:val="single" w:sz="4" w:color="D9D9D9"/>
               <w:left w:val="single" w:sz="4" w:color="D9D9D9"/>
               <w:bottom w:val="single" w:sz="4" w:color="D9D9D9"/>
@@ -2332,11 +2381,12 @@
           </w:tcPr>
           <w:p>
             <w:pPr>
-              <w:spacing w:after="40" w:line="264" w:lineRule="auto"/>
-            </w:pPr>
-            <w:r>
-              <w:rPr>
-                <w:rFonts w:ascii="宋体" w:hAnsi="宋体" w:eastAsia="宋体"/>
+              <w:keepNext/>
+              <w:spacing w:after="40" w:line="288" w:lineRule="auto" w:before="40"/>
+            </w:pPr>
+            <w:r>
+              <w:rPr>
+                <w:rFonts w:ascii="Times New Roman" w:hAnsi="Times New Roman" w:eastAsia="宋体"/>
                 <w:b/>
                 <w:color w:val="000000"/>
                 <w:sz w:val="21"/>
@@ -2350,6 +2400,10 @@
             <w:tcW w:type="dxa" w:w="2665"/>
             <w:vAlign w:val="center"/>
             <w:tcBorders>
+              <w:top w:val="single" w:sz="4" w:color="D9D9D9"/>
+              <w:left w:val="single" w:sz="4" w:color="D9D9D9"/>
+              <w:bottom w:val="single" w:sz="4" w:color="D9D9D9"/>
+              <w:right w:val="single" w:sz="4" w:color="D9D9D9"/>
               <w:top w:val="single" w:sz="4" w:color="D9D9D9"/>
               <w:left w:val="single" w:sz="4" w:color="D9D9D9"/>
               <w:bottom w:val="single" w:sz="4" w:color="D9D9D9"/>
@@ -2365,11 +2419,12 @@
           </w:tcPr>
           <w:p>
             <w:pPr>
-              <w:spacing w:after="40" w:line="264" w:lineRule="auto"/>
-            </w:pPr>
-            <w:r>
-              <w:rPr>
-                <w:rFonts w:ascii="宋体" w:hAnsi="宋体" w:eastAsia="宋体"/>
+              <w:keepNext/>
+              <w:spacing w:after="40" w:line="288" w:lineRule="auto" w:before="40"/>
+            </w:pPr>
+            <w:r>
+              <w:rPr>
+                <w:rFonts w:ascii="Times New Roman" w:hAnsi="Times New Roman" w:eastAsia="宋体"/>
                 <w:b/>
                 <w:color w:val="000000"/>
                 <w:sz w:val="21"/>
@@ -2383,6 +2438,10 @@
             <w:tcW w:type="dxa" w:w="5726"/>
             <w:vAlign w:val="center"/>
             <w:tcBorders>
+              <w:top w:val="single" w:sz="4" w:color="D9D9D9"/>
+              <w:left w:val="single" w:sz="4" w:color="D9D9D9"/>
+              <w:bottom w:val="single" w:sz="4" w:color="D9D9D9"/>
+              <w:right w:val="single" w:sz="4" w:color="D9D9D9"/>
               <w:top w:val="single" w:sz="4" w:color="D9D9D9"/>
               <w:left w:val="single" w:sz="4" w:color="D9D9D9"/>
               <w:bottom w:val="single" w:sz="4" w:color="D9D9D9"/>
@@ -2398,11 +2457,12 @@
           </w:tcPr>
           <w:p>
             <w:pPr>
-              <w:spacing w:after="40" w:line="264" w:lineRule="auto"/>
-            </w:pPr>
-            <w:r>
-              <w:rPr>
-                <w:rFonts w:ascii="宋体" w:hAnsi="宋体" w:eastAsia="宋体"/>
+              <w:keepNext/>
+              <w:spacing w:after="40" w:line="288" w:lineRule="auto" w:before="40"/>
+            </w:pPr>
+            <w:r>
+              <w:rPr>
+                <w:rFonts w:ascii="Times New Roman" w:hAnsi="Times New Roman" w:eastAsia="宋体"/>
                 <w:b/>
                 <w:color w:val="000000"/>
                 <w:sz w:val="21"/>
@@ -2413,11 +2473,16 @@
         </w:tc>
       </w:tr>
       <w:tr>
+        <w:trPr/>
         <w:tc>
           <w:tcPr>
             <w:tcW w:type="dxa" w:w="794"/>
             <w:vAlign w:val="center"/>
             <w:tcBorders>
+              <w:top w:val="single" w:sz="4" w:color="D9D9D9"/>
+              <w:left w:val="single" w:sz="4" w:color="D9D9D9"/>
+              <w:bottom w:val="single" w:sz="4" w:color="D9D9D9"/>
+              <w:right w:val="single" w:sz="4" w:color="D9D9D9"/>
               <w:top w:val="single" w:sz="4" w:color="D9D9D9"/>
               <w:left w:val="single" w:sz="4" w:color="D9D9D9"/>
               <w:bottom w:val="single" w:sz="4" w:color="D9D9D9"/>
@@ -2432,11 +2497,12 @@
           </w:tcPr>
           <w:p>
             <w:pPr>
-              <w:spacing w:after="40" w:line="264" w:lineRule="auto"/>
-            </w:pPr>
-            <w:r>
-              <w:rPr>
-                <w:rFonts w:ascii="宋体" w:hAnsi="宋体" w:eastAsia="宋体"/>
+              <w:keepNext/>
+              <w:spacing w:after="40" w:line="288" w:lineRule="auto" w:before="40"/>
+            </w:pPr>
+            <w:r>
+              <w:rPr>
+                <w:rFonts w:ascii="Times New Roman" w:hAnsi="Times New Roman" w:eastAsia="宋体"/>
                 <w:b w:val="0"/>
                 <w:color w:val="000000"/>
                 <w:sz w:val="21"/>
@@ -2450,6 +2516,10 @@
             <w:tcW w:type="dxa" w:w="2665"/>
             <w:vAlign w:val="center"/>
             <w:tcBorders>
+              <w:top w:val="single" w:sz="4" w:color="D9D9D9"/>
+              <w:left w:val="single" w:sz="4" w:color="D9D9D9"/>
+              <w:bottom w:val="single" w:sz="4" w:color="D9D9D9"/>
+              <w:right w:val="single" w:sz="4" w:color="D9D9D9"/>
               <w:top w:val="single" w:sz="4" w:color="D9D9D9"/>
               <w:left w:val="single" w:sz="4" w:color="D9D9D9"/>
               <w:bottom w:val="single" w:sz="4" w:color="D9D9D9"/>
@@ -2464,11 +2534,12 @@
           </w:tcPr>
           <w:p>
             <w:pPr>
-              <w:spacing w:after="40" w:line="264" w:lineRule="auto"/>
-            </w:pPr>
-            <w:r>
-              <w:rPr>
-                <w:rFonts w:ascii="宋体" w:hAnsi="宋体" w:eastAsia="宋体"/>
+              <w:keepNext/>
+              <w:spacing w:after="40" w:line="288" w:lineRule="auto" w:before="40"/>
+            </w:pPr>
+            <w:r>
+              <w:rPr>
+                <w:rFonts w:ascii="Times New Roman" w:hAnsi="Times New Roman" w:eastAsia="宋体"/>
                 <w:b w:val="0"/>
                 <w:color w:val="000000"/>
                 <w:sz w:val="21"/>
@@ -2482,6 +2553,10 @@
             <w:tcW w:type="dxa" w:w="5726"/>
             <w:vAlign w:val="center"/>
             <w:tcBorders>
+              <w:top w:val="single" w:sz="4" w:color="D9D9D9"/>
+              <w:left w:val="single" w:sz="4" w:color="D9D9D9"/>
+              <w:bottom w:val="single" w:sz="4" w:color="D9D9D9"/>
+              <w:right w:val="single" w:sz="4" w:color="D9D9D9"/>
               <w:top w:val="single" w:sz="4" w:color="D9D9D9"/>
               <w:left w:val="single" w:sz="4" w:color="D9D9D9"/>
               <w:bottom w:val="single" w:sz="4" w:color="D9D9D9"/>
@@ -2496,11 +2571,12 @@
           </w:tcPr>
           <w:p>
             <w:pPr>
-              <w:spacing w:after="40" w:line="264" w:lineRule="auto"/>
-            </w:pPr>
-            <w:r>
-              <w:rPr>
-                <w:rFonts w:ascii="宋体" w:hAnsi="宋体" w:eastAsia="宋体"/>
+              <w:keepNext/>
+              <w:spacing w:after="40" w:line="288" w:lineRule="auto" w:before="40"/>
+            </w:pPr>
+            <w:r>
+              <w:rPr>
+                <w:rFonts w:ascii="Times New Roman" w:hAnsi="Times New Roman" w:eastAsia="宋体"/>
                 <w:b w:val="0"/>
                 <w:color w:val="000000"/>
                 <w:sz w:val="21"/>
@@ -2511,11 +2587,16 @@
         </w:tc>
       </w:tr>
       <w:tr>
+        <w:trPr/>
         <w:tc>
           <w:tcPr>
             <w:tcW w:type="dxa" w:w="794"/>
             <w:vAlign w:val="center"/>
             <w:tcBorders>
+              <w:top w:val="single" w:sz="4" w:color="D9D9D9"/>
+              <w:left w:val="single" w:sz="4" w:color="D9D9D9"/>
+              <w:bottom w:val="single" w:sz="4" w:color="D9D9D9"/>
+              <w:right w:val="single" w:sz="4" w:color="D9D9D9"/>
               <w:top w:val="single" w:sz="4" w:color="D9D9D9"/>
               <w:left w:val="single" w:sz="4" w:color="D9D9D9"/>
               <w:bottom w:val="single" w:sz="4" w:color="D9D9D9"/>
@@ -2530,11 +2611,12 @@
           </w:tcPr>
           <w:p>
             <w:pPr>
-              <w:spacing w:after="40" w:line="264" w:lineRule="auto"/>
-            </w:pPr>
-            <w:r>
-              <w:rPr>
-                <w:rFonts w:ascii="宋体" w:hAnsi="宋体" w:eastAsia="宋体"/>
+              <w:keepNext/>
+              <w:spacing w:after="40" w:line="288" w:lineRule="auto" w:before="40"/>
+            </w:pPr>
+            <w:r>
+              <w:rPr>
+                <w:rFonts w:ascii="Times New Roman" w:hAnsi="Times New Roman" w:eastAsia="宋体"/>
                 <w:b w:val="0"/>
                 <w:color w:val="000000"/>
                 <w:sz w:val="21"/>
@@ -2548,6 +2630,10 @@
             <w:tcW w:type="dxa" w:w="2665"/>
             <w:vAlign w:val="center"/>
             <w:tcBorders>
+              <w:top w:val="single" w:sz="4" w:color="D9D9D9"/>
+              <w:left w:val="single" w:sz="4" w:color="D9D9D9"/>
+              <w:bottom w:val="single" w:sz="4" w:color="D9D9D9"/>
+              <w:right w:val="single" w:sz="4" w:color="D9D9D9"/>
               <w:top w:val="single" w:sz="4" w:color="D9D9D9"/>
               <w:left w:val="single" w:sz="4" w:color="D9D9D9"/>
               <w:bottom w:val="single" w:sz="4" w:color="D9D9D9"/>
@@ -2562,11 +2648,12 @@
           </w:tcPr>
           <w:p>
             <w:pPr>
-              <w:spacing w:after="40" w:line="264" w:lineRule="auto"/>
-            </w:pPr>
-            <w:r>
-              <w:rPr>
-                <w:rFonts w:ascii="宋体" w:hAnsi="宋体" w:eastAsia="宋体"/>
+              <w:keepNext/>
+              <w:spacing w:after="40" w:line="288" w:lineRule="auto" w:before="40"/>
+            </w:pPr>
+            <w:r>
+              <w:rPr>
+                <w:rFonts w:ascii="Times New Roman" w:hAnsi="Times New Roman" w:eastAsia="宋体"/>
                 <w:b w:val="0"/>
                 <w:color w:val="000000"/>
                 <w:sz w:val="21"/>
@@ -2580,6 +2667,10 @@
             <w:tcW w:type="dxa" w:w="5726"/>
             <w:vAlign w:val="center"/>
             <w:tcBorders>
+              <w:top w:val="single" w:sz="4" w:color="D9D9D9"/>
+              <w:left w:val="single" w:sz="4" w:color="D9D9D9"/>
+              <w:bottom w:val="single" w:sz="4" w:color="D9D9D9"/>
+              <w:right w:val="single" w:sz="4" w:color="D9D9D9"/>
               <w:top w:val="single" w:sz="4" w:color="D9D9D9"/>
               <w:left w:val="single" w:sz="4" w:color="D9D9D9"/>
               <w:bottom w:val="single" w:sz="4" w:color="D9D9D9"/>
@@ -2594,11 +2685,12 @@
           </w:tcPr>
           <w:p>
             <w:pPr>
-              <w:spacing w:after="40" w:line="264" w:lineRule="auto"/>
-            </w:pPr>
-            <w:r>
-              <w:rPr>
-                <w:rFonts w:ascii="宋体" w:hAnsi="宋体" w:eastAsia="宋体"/>
+              <w:keepNext/>
+              <w:spacing w:after="40" w:line="288" w:lineRule="auto" w:before="40"/>
+            </w:pPr>
+            <w:r>
+              <w:rPr>
+                <w:rFonts w:ascii="Times New Roman" w:hAnsi="Times New Roman" w:eastAsia="宋体"/>
                 <w:b w:val="0"/>
                 <w:color w:val="000000"/>
                 <w:sz w:val="21"/>
@@ -2609,11 +2701,16 @@
         </w:tc>
       </w:tr>
       <w:tr>
+        <w:trPr/>
         <w:tc>
           <w:tcPr>
             <w:tcW w:type="dxa" w:w="794"/>
             <w:vAlign w:val="center"/>
             <w:tcBorders>
+              <w:top w:val="single" w:sz="4" w:color="D9D9D9"/>
+              <w:left w:val="single" w:sz="4" w:color="D9D9D9"/>
+              <w:bottom w:val="single" w:sz="4" w:color="D9D9D9"/>
+              <w:right w:val="single" w:sz="4" w:color="D9D9D9"/>
               <w:top w:val="single" w:sz="4" w:color="D9D9D9"/>
               <w:left w:val="single" w:sz="4" w:color="D9D9D9"/>
               <w:bottom w:val="single" w:sz="4" w:color="D9D9D9"/>
@@ -2628,11 +2725,12 @@
           </w:tcPr>
           <w:p>
             <w:pPr>
-              <w:spacing w:after="40" w:line="264" w:lineRule="auto"/>
-            </w:pPr>
-            <w:r>
-              <w:rPr>
-                <w:rFonts w:ascii="宋体" w:hAnsi="宋体" w:eastAsia="宋体"/>
+              <w:keepNext w:val="0"/>
+              <w:spacing w:after="40" w:line="288" w:lineRule="auto" w:before="40"/>
+            </w:pPr>
+            <w:r>
+              <w:rPr>
+                <w:rFonts w:ascii="Times New Roman" w:hAnsi="Times New Roman" w:eastAsia="宋体"/>
                 <w:b w:val="0"/>
                 <w:color w:val="000000"/>
                 <w:sz w:val="21"/>
@@ -2646,6 +2744,10 @@
             <w:tcW w:type="dxa" w:w="2665"/>
             <w:vAlign w:val="center"/>
             <w:tcBorders>
+              <w:top w:val="single" w:sz="4" w:color="D9D9D9"/>
+              <w:left w:val="single" w:sz="4" w:color="D9D9D9"/>
+              <w:bottom w:val="single" w:sz="4" w:color="D9D9D9"/>
+              <w:right w:val="single" w:sz="4" w:color="D9D9D9"/>
               <w:top w:val="single" w:sz="4" w:color="D9D9D9"/>
               <w:left w:val="single" w:sz="4" w:color="D9D9D9"/>
               <w:bottom w:val="single" w:sz="4" w:color="D9D9D9"/>
@@ -2660,11 +2762,12 @@
           </w:tcPr>
           <w:p>
             <w:pPr>
-              <w:spacing w:after="40" w:line="264" w:lineRule="auto"/>
-            </w:pPr>
-            <w:r>
-              <w:rPr>
-                <w:rFonts w:ascii="宋体" w:hAnsi="宋体" w:eastAsia="宋体"/>
+              <w:keepNext w:val="0"/>
+              <w:spacing w:after="40" w:line="288" w:lineRule="auto" w:before="40"/>
+            </w:pPr>
+            <w:r>
+              <w:rPr>
+                <w:rFonts w:ascii="Times New Roman" w:hAnsi="Times New Roman" w:eastAsia="宋体"/>
                 <w:b w:val="0"/>
                 <w:color w:val="000000"/>
                 <w:sz w:val="21"/>
@@ -2678,6 +2781,10 @@
             <w:tcW w:type="dxa" w:w="5726"/>
             <w:vAlign w:val="center"/>
             <w:tcBorders>
+              <w:top w:val="single" w:sz="4" w:color="D9D9D9"/>
+              <w:left w:val="single" w:sz="4" w:color="D9D9D9"/>
+              <w:bottom w:val="single" w:sz="4" w:color="D9D9D9"/>
+              <w:right w:val="single" w:sz="4" w:color="D9D9D9"/>
               <w:top w:val="single" w:sz="4" w:color="D9D9D9"/>
               <w:left w:val="single" w:sz="4" w:color="D9D9D9"/>
               <w:bottom w:val="single" w:sz="4" w:color="D9D9D9"/>
@@ -2692,11 +2799,12 @@
           </w:tcPr>
           <w:p>
             <w:pPr>
-              <w:spacing w:after="40" w:line="264" w:lineRule="auto"/>
-            </w:pPr>
-            <w:r>
-              <w:rPr>
-                <w:rFonts w:ascii="宋体" w:hAnsi="宋体" w:eastAsia="宋体"/>
+              <w:keepNext w:val="0"/>
+              <w:spacing w:after="40" w:line="288" w:lineRule="auto" w:before="40"/>
+            </w:pPr>
+            <w:r>
+              <w:rPr>
+                <w:rFonts w:ascii="Times New Roman" w:hAnsi="Times New Roman" w:eastAsia="宋体"/>
                 <w:b w:val="0"/>
                 <w:color w:val="000000"/>
                 <w:sz w:val="21"/>
@@ -2709,201 +2817,242 @@
     </w:tbl>
     <w:p>
       <w:pPr>
-        <w:spacing w:line="300" w:lineRule="auto" w:after="100"/>
-        <w:ind w:firstLine="480"/>
-      </w:pPr>
-      <w:r>
-        <w:rPr>
-          <w:rFonts w:ascii="宋体" w:hAnsi="宋体" w:eastAsia="宋体"/>
+        <w:pStyle w:val="ReportBody"/>
+      </w:pPr>
+      <w:r>
+        <w:t>公开选票由A交给C登记，C把签名清单与密文交给B汇总，B向保管端提交完整汇总请求。各角色报告分别讨论编码与密钥、汇总与解密、界面与审计；实际姓名、学号和完成记录由成员核对填写。</w:t>
+      </w:r>
+    </w:p>
+    <w:p>
+      <w:pPr>
+        <w:pStyle w:val="ReportH1"/>
+      </w:pPr>
+      <w:r>
+        <w:rPr>
+          <w:rFonts w:ascii="Times New Roman" w:hAnsi="Times New Roman" w:eastAsia="宋体"/>
+          <w:b/>
+          <w:color w:val="000000"/>
+          <w:sz w:val="28"/>
+        </w:rPr>
+        <w:t>三、相关功能模块详细设计</w:t>
+      </w:r>
+    </w:p>
+    <w:p>
+      <w:pPr>
+        <w:pStyle w:val="ReportH2"/>
+      </w:pPr>
+      <w:r>
+        <w:rPr>
+          <w:rFonts w:ascii="Times New Roman" w:hAnsi="Times New Roman" w:eastAsia="宋体"/>
+          <w:b/>
+          <w:color w:val="000000"/>
+          <w:sz w:val="24"/>
+        </w:rPr>
+        <w:t>3.1 签名清单与信任前提</w:t>
+      </w:r>
+    </w:p>
+    <w:p>
+      <w:pPr>
+        <w:pStyle w:val="ReportBody"/>
+      </w:pPr>
+      <w:r>
+        <w:t>算法全流程：A生成Paillier公钥n=pq、g=n+1及私钥p、q，以c=</w:t>
+      </w:r>
+      <w:r>
+        <w:t>g</w:t>
+      </w:r>
+      <w:r>
+        <w:rPr>
+          <w:vertAlign w:val="superscript"/>
+        </w:rPr>
+        <w:t>m</w:t>
+      </w:r>
+      <w:r>
+        <w:t xml:space="preserve"> </w:t>
+      </w:r>
+      <w:r>
+        <w:t>r</w:t>
+      </w:r>
+      <w:r>
+        <w:rPr>
+          <w:vertAlign w:val="superscript"/>
+        </w:rPr>
+        <w:t>n</w:t>
+      </w:r>
+      <w:r>
+        <w:t xml:space="preserve"> mod n²加密独热向量；B按选项列相乘，利用E(a)·E(b) mod n² = E((a+b) mod n)，再由保管端加载私钥解密各列总票[2]。C的Ed25519签名用于发现文件变化，不能代替加密或证明独热合法性[3]。</w:t>
+      </w:r>
+    </w:p>
+    <w:p>
+      <w:pPr>
+        <w:pStyle w:val="ReportBody"/>
+      </w:pPr>
+      <w:r>
+        <w:rPr>
+          <w:rFonts w:ascii="Times New Roman" w:hAnsi="Times New Roman" w:eastAsia="宋体"/>
           <w:b w:val="0"/>
           <w:color w:val="000000"/>
-          <w:sz w:val="22"/>
-        </w:rPr>
-        <w:t>共同接口以JSON公开配置、加密选票和签名清单为中心。A不在选票文件保存明文选择；B不在计票目录放置私钥；C在每次关键操作前检查签名和状态。报告按责任模块划分，实际学生完成情况需在复现和现场修改后由本人确认。</w:t>
-      </w:r>
-    </w:p>
-    <w:p>
-      <w:pPr>
+          <w:sz w:val="24"/>
+        </w:rPr>
+        <w:t>清单payload包含轮次、配置SHA-256、状态及各选票的ID、文件名和摘要，以Ed25519签名。选票名由ID摘要推导，不能由外部输入任意路径。审计核对签名、配置、文件集合、逐票摘要、轮次、ID和密文空间。信任前提是最初公钥配置已确认、签名密钥未泄露；完整配置和全部状态替换超出该本地模型。</w:t>
+      </w:r>
+    </w:p>
+    <w:p>
+      <w:pPr>
+        <w:pStyle w:val="ReportH2"/>
+      </w:pPr>
+      <w:r>
+        <w:rPr>
+          <w:rFonts w:ascii="Times New Roman" w:hAnsi="Times New Roman" w:eastAsia="宋体"/>
+          <w:b/>
+          <w:color w:val="000000"/>
+          <w:sz w:val="24"/>
+        </w:rPr>
+        <w:t>3.2 状态管理与存储</w:t>
+      </w:r>
+    </w:p>
+    <w:p>
+      <w:pPr>
+        <w:pStyle w:val="ReportBody"/>
+      </w:pPr>
+      <w:r>
+        <w:rPr>
+          <w:rFonts w:ascii="Times New Roman" w:hAnsi="Times New Roman" w:eastAsia="宋体"/>
+          <w:b w:val="0"/>
+          <w:color w:val="000000"/>
+          <w:sz w:val="24"/>
+        </w:rPr>
+        <w:t>状态只有open和closed；关闭操作需要登记签名密钥，不能从界面重新开放。文件以临时写入后替换的方式保存，单个JSON写入具备原子替换性质；选票与清单并非跨文件事务。若中途异常遗留未登记文件，审计按失败处理，不静默修复。桌面应用通过QLockFile阻止同一目录被两个应用实例同时使用。</w:t>
+      </w:r>
+    </w:p>
+    <w:p>
+      <w:pPr>
+        <w:pStyle w:val="ReportH2"/>
+      </w:pPr>
+      <w:r>
+        <w:rPr>
+          <w:rFonts w:ascii="Times New Roman" w:hAnsi="Times New Roman" w:eastAsia="宋体"/>
+          <w:b/>
+          <w:color w:val="000000"/>
+          <w:sz w:val="24"/>
+        </w:rPr>
+        <w:t>3.3 后台任务与可视化</w:t>
+      </w:r>
+    </w:p>
+    <w:p>
+      <w:pPr>
+        <w:pStyle w:val="ReportBody"/>
+      </w:pPr>
+      <w:r>
+        <w:rPr>
+          <w:rFonts w:ascii="Times New Roman" w:hAnsi="Times New Roman" w:eastAsia="宋体"/>
+          <w:b w:val="0"/>
+          <w:color w:val="000000"/>
+          <w:sz w:val="24"/>
+        </w:rPr>
+        <w:t>Qt主线程负责控件，Job线程执行加密、审计和实验；结果通过信号回到主线程。首次界面测试发现done信号发出时线程尚未完全结束，紧接着的实验按钮可能被忽略。修复方法是在成功处理槽等待线程退出后再开放操作。复测已完成投票、结果图和两种审计演示。</w:t>
+      </w:r>
+    </w:p>
+    <w:p>
+      <w:pPr>
+        <w:pStyle w:val="ReportH2"/>
+      </w:pPr>
+      <w:r>
+        <w:t>3.4 模块程序流程图设计</w:t>
+      </w:r>
+    </w:p>
+    <w:p>
+      <w:pPr>
+        <w:pStyle w:val="ReportCaption"/>
         <w:keepNext/>
-        <w:pageBreakBefore/>
-        <w:spacing w:line="300" w:lineRule="auto" w:after="160"/>
-      </w:pPr>
-      <w:r>
-        <w:rPr>
-          <w:rFonts w:ascii="宋体" w:hAnsi="宋体" w:eastAsia="宋体"/>
+      </w:pPr>
+      <w:r/>
+      <w:r>
+        <w:drawing>
+          <wp:inline xmlns:a="http://schemas.openxmlformats.org/drawingml/2006/main" xmlns:pic="http://schemas.openxmlformats.org/drawingml/2006/picture">
+            <wp:extent cx="5760000" cy="3456000"/>
+            <wp:docPr id="2" name="Picture 2"/>
+            <wp:cNvGraphicFramePr>
+              <a:graphicFrameLocks noChangeAspect="1"/>
+            </wp:cNvGraphicFramePr>
+            <a:graphic>
+              <a:graphicData uri="http://schemas.openxmlformats.org/drawingml/2006/picture">
+                <pic:pic>
+                  <pic:nvPicPr>
+                    <pic:cNvPr id="0" name="flow-C.png"/>
+                    <pic:cNvPicPr/>
+                  </pic:nvPicPr>
+                  <pic:blipFill>
+                    <a:blip r:embed="rId12"/>
+                    <a:stretch>
+                      <a:fillRect/>
+                    </a:stretch>
+                  </pic:blipFill>
+                  <pic:spPr>
+                    <a:xfrm>
+                      <a:off x="0" y="0"/>
+                      <a:ext cx="5760000" cy="3456000"/>
+                    </a:xfrm>
+                    <a:prstGeom prst="rect"/>
+                  </pic:spPr>
+                </pic:pic>
+              </a:graphicData>
+            </a:graphic>
+          </wp:inline>
+        </w:drawing>
+      </w:r>
+    </w:p>
+    <w:p>
+      <w:pPr>
+        <w:pStyle w:val="ReportCaption"/>
+      </w:pPr>
+      <w:r>
+        <w:t>图1 本模块处理流程与失败出口</w:t>
+      </w:r>
+    </w:p>
+    <w:p>
+      <w:pPr>
+        <w:pStyle w:val="ReportH2"/>
+      </w:pPr>
+      <w:r>
+        <w:rPr>
+          <w:rFonts w:ascii="Times New Roman" w:hAnsi="Times New Roman" w:eastAsia="宋体"/>
           <w:b/>
           <w:color w:val="000000"/>
-          <w:sz w:val="28"/>
-        </w:rPr>
-        <w:t>三 相关功能模块详细设计</w:t>
-      </w:r>
-    </w:p>
-    <w:p>
-      <w:pPr>
+          <w:sz w:val="24"/>
+        </w:rPr>
+        <w:t>3.5 威胁模型与安全边界</w:t>
+      </w:r>
+    </w:p>
+    <w:p>
+      <w:pPr>
+        <w:pStyle w:val="ReportBody"/>
+      </w:pPr>
+      <w:r>
+        <w:rPr>
+          <w:rFonts w:ascii="Times New Roman" w:hAnsi="Times New Roman" w:eastAsia="宋体"/>
+          <w:b w:val="0"/>
+          <w:color w:val="000000"/>
+          <w:sz w:val="24"/>
+        </w:rPr>
+        <w:t>假设攻击者能够读取或修改公开选票目录，但不能获得保管口令和签名私钥，最初的公钥配置已可信确认。保护目标是隐藏单票选择并发现相对于签名清单的文件变化。应用运行在一台电脑上，角色隔离是教学流程；创建与解锁阶段可短暂接触完整密钥材料，不构成互不信任机构之间的物理隔离。</w:t>
+      </w:r>
+    </w:p>
+    <w:p>
+      <w:pPr>
+        <w:pStyle w:val="ReportH2"/>
+      </w:pPr>
+      <w:r>
+        <w:t>3.6 模块界面与数据说明</w:t>
+      </w:r>
+    </w:p>
+    <w:p>
+      <w:pPr>
+        <w:pStyle w:val="ReportBody"/>
         <w:keepNext/>
-        <w:spacing w:line="300" w:lineRule="auto" w:after="100"/>
-      </w:pPr>
-      <w:r>
-        <w:rPr>
-          <w:rFonts w:ascii="宋体" w:hAnsi="宋体" w:eastAsia="宋体"/>
-          <w:b/>
-          <w:color w:val="000000"/>
-          <w:sz w:val="24"/>
-        </w:rPr>
-        <w:t>3.1 签名清单与信任前提</w:t>
-      </w:r>
-    </w:p>
-    <w:p>
-      <w:pPr>
-        <w:spacing w:line="300" w:lineRule="auto" w:after="100"/>
-        <w:ind w:firstLine="480"/>
-      </w:pPr>
-      <w:r>
-        <w:rPr>
-          <w:rFonts w:ascii="宋体" w:hAnsi="宋体" w:eastAsia="宋体"/>
-          <w:b w:val="0"/>
-          <w:color w:val="000000"/>
-          <w:sz w:val="24"/>
-        </w:rPr>
-        <w:t>清单payload包含轮次、配置SHA-256、状态及各选票的ID、文件名和摘要，以Ed25519签名。选票名由ID摘要推导，不能由外部输入任意路径。审计核对签名、配置、文件集合、逐票摘要、轮次、ID和密文空间。信任前提是最初公钥配置已确认、签名密钥未泄露；完整配置和全部状态替换超出该本地模型。</w:t>
-      </w:r>
-    </w:p>
-    <w:p>
-      <w:pPr>
-        <w:keepNext/>
-        <w:spacing w:line="300" w:lineRule="auto" w:after="100"/>
-      </w:pPr>
-      <w:r>
-        <w:rPr>
-          <w:rFonts w:ascii="宋体" w:hAnsi="宋体" w:eastAsia="宋体"/>
-          <w:b/>
-          <w:color w:val="000000"/>
-          <w:sz w:val="24"/>
-        </w:rPr>
-        <w:t>3.2 状态管理与存储</w:t>
-      </w:r>
-    </w:p>
-    <w:p>
-      <w:pPr>
-        <w:spacing w:line="300" w:lineRule="auto" w:after="100"/>
-        <w:ind w:firstLine="480"/>
-      </w:pPr>
-      <w:r>
-        <w:rPr>
-          <w:rFonts w:ascii="宋体" w:hAnsi="宋体" w:eastAsia="宋体"/>
-          <w:b w:val="0"/>
-          <w:color w:val="000000"/>
-          <w:sz w:val="24"/>
-        </w:rPr>
-        <w:t>状态只有open和closed；关闭操作需要登记签名密钥，不能从界面重新开放。文件以临时写入后替换的方式保存，单个JSON写入具备原子替换性质；选票与清单并非跨文件事务。若中途异常遗留未登记文件，审计按失败处理，不静默修复。桌面应用通过QLockFile阻止同一目录被两个应用实例同时使用。</w:t>
-      </w:r>
-    </w:p>
-    <w:p>
-      <w:pPr>
-        <w:keepNext/>
-        <w:spacing w:line="300" w:lineRule="auto" w:after="100"/>
-      </w:pPr>
-      <w:r>
-        <w:rPr>
-          <w:rFonts w:ascii="宋体" w:hAnsi="宋体" w:eastAsia="宋体"/>
-          <w:b/>
-          <w:color w:val="000000"/>
-          <w:sz w:val="24"/>
-        </w:rPr>
-        <w:t>3.3 后台任务与可视化</w:t>
-      </w:r>
-    </w:p>
-    <w:p>
-      <w:pPr>
-        <w:spacing w:line="300" w:lineRule="auto" w:after="100"/>
-        <w:ind w:firstLine="480"/>
-      </w:pPr>
-      <w:r>
-        <w:rPr>
-          <w:rFonts w:ascii="宋体" w:hAnsi="宋体" w:eastAsia="宋体"/>
-          <w:b w:val="0"/>
-          <w:color w:val="000000"/>
-          <w:sz w:val="24"/>
-        </w:rPr>
-        <w:t>Qt主线程负责控件，Job线程执行加密、审计和实验；结果通过信号回到主线程。首次界面测试发现done信号发出时线程尚未完全结束，紧接着的实验按钮可能被忽略。修复方法是在成功处理槽等待线程退出后再开放操作。复测已完成投票、结果图和两种审计演示。</w:t>
-      </w:r>
-    </w:p>
-    <w:p>
-      <w:pPr>
-        <w:keepNext/>
-        <w:spacing w:line="300" w:lineRule="auto" w:after="100"/>
-      </w:pPr>
-      <w:r>
-        <w:rPr>
-          <w:rFonts w:ascii="宋体" w:hAnsi="宋体" w:eastAsia="宋体"/>
-          <w:b/>
-          <w:color w:val="000000"/>
-          <w:sz w:val="24"/>
-        </w:rPr>
-        <w:t>3.4 模块处理流程</w:t>
-      </w:r>
-    </w:p>
-    <w:p>
-      <w:pPr>
-        <w:spacing w:line="300" w:lineRule="auto" w:after="100"/>
-      </w:pPr>
-      <w:r>
-        <w:rPr>
-          <w:rFonts w:ascii="宋体" w:hAnsi="宋体" w:eastAsia="宋体"/>
-          <w:b w:val="0"/>
-          <w:color w:val="000000"/>
-          <w:sz w:val="22"/>
-        </w:rPr>
-        <w:t>选择目录与参数 → 创建签名配置 → 接收加密选票 → 签名更新清单 → 关闭本轮 → 审计通过 → 显示汇总结果</w:t>
-      </w:r>
-    </w:p>
-    <w:p>
-      <w:pPr>
-        <w:keepNext/>
-        <w:spacing w:line="300" w:lineRule="auto" w:after="100"/>
-      </w:pPr>
-      <w:r>
-        <w:rPr>
-          <w:rFonts w:ascii="宋体" w:hAnsi="宋体" w:eastAsia="宋体"/>
-          <w:b/>
-          <w:color w:val="000000"/>
-          <w:sz w:val="24"/>
-        </w:rPr>
-        <w:t>3.5 威胁模型与安全边界</w:t>
-      </w:r>
-    </w:p>
-    <w:p>
-      <w:pPr>
-        <w:spacing w:line="300" w:lineRule="auto" w:after="100"/>
-        <w:ind w:firstLine="480"/>
-      </w:pPr>
-      <w:r>
-        <w:rPr>
-          <w:rFonts w:ascii="宋体" w:hAnsi="宋体" w:eastAsia="宋体"/>
-          <w:b w:val="0"/>
-          <w:color w:val="000000"/>
-          <w:sz w:val="24"/>
-        </w:rPr>
-        <w:t>假设攻击者能够读取或修改公开选票目录，但不能获得保管口令和签名私钥，最初的公钥配置已可信确认。保护目标是隐藏单票选择并发现相对于签名清单的文件变化。应用运行在一台电脑上，角色隔离是教学流程；创建与解锁阶段可短暂接触完整密钥材料，不构成互不信任机构之间的物理隔离。</w:t>
-      </w:r>
-    </w:p>
-    <w:p>
-      <w:pPr>
-        <w:keepNext/>
-        <w:pageBreakBefore/>
-        <w:spacing w:line="300" w:lineRule="auto" w:after="160"/>
-      </w:pPr>
-      <w:r>
-        <w:rPr>
-          <w:rFonts w:ascii="宋体" w:hAnsi="宋体" w:eastAsia="宋体"/>
-          <w:b/>
-          <w:color w:val="000000"/>
-          <w:sz w:val="28"/>
-        </w:rPr>
-        <w:t>模块界面与数据说明</w:t>
-      </w:r>
-    </w:p>
-    <w:p>
+        <w:ind w:firstLine="0"/>
+        <w:jc w:val="center"/>
+      </w:pPr>
       <w:r>
         <w:drawing>
           <wp:inline xmlns:a="http://schemas.openxmlformats.org/drawingml/2006/main" xmlns:pic="http://schemas.openxmlformats.org/drawingml/2006/picture">
@@ -2941,365 +3090,339 @@
     </w:p>
     <w:p>
       <w:pPr>
-        <w:spacing w:line="300" w:lineRule="auto" w:after="160"/>
-        <w:jc w:val="center"/>
-      </w:pPr>
-      <w:r>
-        <w:rPr>
-          <w:rFonts w:ascii="宋体" w:hAnsi="宋体" w:eastAsia="宋体"/>
+        <w:pStyle w:val="ReportCaption"/>
+      </w:pPr>
+      <w:r>
+        <w:t>图2 临时副本上的篡改和删除检测</w:t>
+      </w:r>
+    </w:p>
+    <w:p>
+      <w:pPr>
+        <w:pStyle w:val="ReportH2"/>
+      </w:pPr>
+      <w:r>
+        <w:t>3.7 公开数据与私有数据</w:t>
+      </w:r>
+    </w:p>
+    <w:p>
+      <w:pPr>
+        <w:pStyle w:val="ReportBody"/>
+      </w:pPr>
+      <w:r>
+        <w:rPr>
+          <w:rFonts w:ascii="Times New Roman" w:hAnsi="Times New Roman" w:eastAsia="宋体"/>
           <w:b w:val="0"/>
           <w:color w:val="000000"/>
-          <w:sz w:val="21"/>
-        </w:rPr>
-        <w:t>图1 临时副本上的篡改和删除审计演示</w:t>
-      </w:r>
-    </w:p>
-    <w:p>
-      <w:pPr>
+          <w:sz w:val="24"/>
+        </w:rPr>
+        <w:t>public/config.json保存标题、选项、名单、Paillier公钥n和审计公钥；public/ballots保存每张加密选票；public/manifest.json保存签名清单。private/trustee.vault保存加密后的私钥材料。公开包不包含private目录。口令经标准输入管道交给解密子进程，不放入命令行或日志。</w:t>
+      </w:r>
+    </w:p>
+    <w:p>
+      <w:pPr>
+        <w:pStyle w:val="ReportBody"/>
+      </w:pPr>
+      <w:r>
+        <w:rPr>
+          <w:rFonts w:ascii="Times New Roman" w:hAnsi="Times New Roman" w:eastAsia="宋体"/>
+          <w:b w:val="0"/>
+          <w:color w:val="000000"/>
+          <w:sz w:val="24"/>
+        </w:rPr>
+        <w:t>选票的时间戳、ID与随机标识属于公开元数据，隐私目标是投票内容保密，不是投票者匿名。演示和自动实验均使用虚构ID及合成选票。</w:t>
+      </w:r>
+    </w:p>
+    <w:p>
+      <w:pPr>
+        <w:pStyle w:val="ReportH1"/>
+      </w:pPr>
+      <w:r>
+        <w:rPr>
+          <w:rFonts w:ascii="Times New Roman" w:hAnsi="Times New Roman" w:eastAsia="宋体"/>
+          <w:b/>
+          <w:color w:val="000000"/>
+          <w:sz w:val="28"/>
+        </w:rPr>
+        <w:t>四、部分核心代码</w:t>
+      </w:r>
+    </w:p>
+    <w:p>
+      <w:pPr>
+        <w:pStyle w:val="ReportH2"/>
+      </w:pPr>
+      <w:r>
+        <w:rPr>
+          <w:rFonts w:ascii="Times New Roman" w:hAnsi="Times New Roman" w:eastAsia="宋体"/>
+          <w:b/>
+          <w:color w:val="000000"/>
+          <w:sz w:val="24"/>
+        </w:rPr>
+        <w:t>4.1 核心实现片段</w:t>
+      </w:r>
+    </w:p>
+    <w:p>
+      <w:pPr>
+        <w:pStyle w:val="ReportBody"/>
         <w:keepNext/>
-        <w:spacing w:line="300" w:lineRule="auto" w:after="100"/>
-      </w:pPr>
-      <w:r>
-        <w:rPr>
-          <w:rFonts w:ascii="宋体" w:hAnsi="宋体" w:eastAsia="宋体"/>
+      </w:pPr>
+      <w:r>
+        <w:rPr>
+          <w:rFonts w:ascii="Times New Roman" w:hAnsi="Times New Roman" w:eastAsia="宋体"/>
+          <w:b w:val="0"/>
+          <w:color w:val="000000"/>
+          <w:sz w:val="24"/>
+        </w:rPr>
+        <w:t>以下片段摘自 audit_service.py，完整上下文与异常处理见随附源代码。</w:t>
+      </w:r>
+    </w:p>
+    <w:p>
+      <w:pPr>
+        <w:pStyle w:val="ReportCode"/>
+        <w:keepNext/>
+      </w:pPr>
+      <w:r>
+        <w:rPr>
+          <w:rFonts w:ascii="Consolas" w:hAnsi="Consolas" w:eastAsia="新宋体"/>
+          <w:b w:val="0"/>
+          <w:color w:val="000000"/>
+          <w:sz w:val="20"/>
+        </w:rPr>
+        <w:t xml:space="preserve">        path = root / 'public' / 'ballots' / filename</w:t>
+      </w:r>
+    </w:p>
+    <w:p>
+      <w:pPr>
+        <w:pStyle w:val="ReportCode"/>
+        <w:keepNext/>
+      </w:pPr>
+      <w:r>
+        <w:rPr>
+          <w:rFonts w:ascii="Consolas" w:hAnsi="Consolas" w:eastAsia="新宋体"/>
+          <w:b w:val="0"/>
+          <w:color w:val="000000"/>
+          <w:sz w:val="20"/>
+        </w:rPr>
+        <w:t xml:space="preserve">        if not path.is_file():</w:t>
+      </w:r>
+    </w:p>
+    <w:p>
+      <w:pPr>
+        <w:pStyle w:val="ReportCode"/>
+        <w:keepNext/>
+      </w:pPr>
+      <w:r>
+        <w:rPr>
+          <w:rFonts w:ascii="Consolas" w:hAnsi="Consolas" w:eastAsia="新宋体"/>
+          <w:b w:val="0"/>
+          <w:color w:val="000000"/>
+          <w:sz w:val="20"/>
+        </w:rPr>
+        <w:t xml:space="preserve">            raise VoteError('发现选票被删除：' + voter)</w:t>
+      </w:r>
+    </w:p>
+    <w:p>
+      <w:pPr>
+        <w:pStyle w:val="ReportCode"/>
+        <w:keepNext/>
+      </w:pPr>
+      <w:r>
+        <w:rPr>
+          <w:rFonts w:ascii="Consolas" w:hAnsi="Consolas" w:eastAsia="新宋体"/>
+          <w:b w:val="0"/>
+          <w:color w:val="000000"/>
+          <w:sz w:val="20"/>
+        </w:rPr>
+        <w:t xml:space="preserve">        ballot = read_json(path, 100000)</w:t>
+      </w:r>
+    </w:p>
+    <w:p>
+      <w:pPr>
+        <w:pStyle w:val="ReportCode"/>
+        <w:keepNext/>
+      </w:pPr>
+      <w:r>
+        <w:rPr>
+          <w:rFonts w:ascii="Consolas" w:hAnsi="Consolas" w:eastAsia="新宋体"/>
+          <w:b w:val="0"/>
+          <w:color w:val="000000"/>
+          <w:sz w:val="20"/>
+        </w:rPr>
+        <w:t xml:space="preserve">        if digest(ballot) != entry['sha256']:</w:t>
+      </w:r>
+    </w:p>
+    <w:p>
+      <w:pPr>
+        <w:pStyle w:val="ReportCode"/>
+        <w:keepNext/>
+      </w:pPr>
+      <w:r>
+        <w:rPr>
+          <w:rFonts w:ascii="Consolas" w:hAnsi="Consolas" w:eastAsia="新宋体"/>
+          <w:b w:val="0"/>
+          <w:color w:val="000000"/>
+          <w:sz w:val="20"/>
+        </w:rPr>
+        <w:t xml:space="preserve">            raise VoteError('发现选票被篡改：' + voter)</w:t>
+      </w:r>
+    </w:p>
+    <w:p>
+      <w:pPr>
+        <w:pStyle w:val="ReportCode"/>
+        <w:keepNext w:val="0"/>
+      </w:pPr>
+      <w:r>
+        <w:rPr>
+          <w:rFonts w:ascii="Consolas" w:hAnsi="Consolas" w:eastAsia="新宋体"/>
+          <w:b w:val="0"/>
+          <w:color w:val="000000"/>
+          <w:sz w:val="20"/>
+        </w:rPr>
+        <w:t xml:space="preserve">        validate_ballot(config, ballot)</w:t>
+      </w:r>
+    </w:p>
+    <w:p>
+      <w:pPr>
+        <w:pStyle w:val="ReportH2"/>
+      </w:pPr>
+      <w:r>
+        <w:rPr>
+          <w:rFonts w:ascii="Times New Roman" w:hAnsi="Times New Roman" w:eastAsia="宋体"/>
           <w:b/>
           <w:color w:val="000000"/>
           <w:sz w:val="24"/>
         </w:rPr>
-        <w:t>公开数据与私有数据</w:t>
-      </w:r>
-    </w:p>
-    <w:p>
-      <w:pPr>
-        <w:spacing w:line="300" w:lineRule="auto" w:after="100"/>
-        <w:ind w:firstLine="480"/>
-      </w:pPr>
-      <w:r>
-        <w:rPr>
-          <w:rFonts w:ascii="宋体" w:hAnsi="宋体" w:eastAsia="宋体"/>
+        <w:t>4.2 本模块可重复实验步骤</w:t>
+      </w:r>
+    </w:p>
+    <w:p>
+      <w:pPr>
+        <w:pStyle w:val="ReportBody"/>
+      </w:pPr>
+      <w:r>
+        <w:t>1．按README安装依赖并运行src/main.py；创建页填写标题、逗号分隔选项、人数及保管口令，选择目录创建新轮次。</w:t>
+      </w:r>
+    </w:p>
+    <w:p>
+      <w:pPr>
+        <w:pStyle w:val="ReportBody"/>
+      </w:pPr>
+      <w:r>
+        <w:rPr>
+          <w:rFonts w:ascii="Times New Roman" w:hAnsi="Times New Roman" w:eastAsia="宋体"/>
           <w:b w:val="0"/>
           <w:color w:val="000000"/>
           <w:sz w:val="24"/>
         </w:rPr>
-        <w:t>public/config.json保存标题、选项、名单、Paillier公钥n和审计公钥；public/ballots保存每张加密选票；public/manifest.json保存签名清单。private/trustee.vault保存加密后的私钥材料。公开包不包含private目录。口令经标准输入管道交给解密子进程，不放入命令行或日志。</w:t>
-      </w:r>
-    </w:p>
-    <w:p>
-      <w:pPr>
-        <w:spacing w:line="300" w:lineRule="auto" w:after="100"/>
-        <w:ind w:firstLine="480"/>
-      </w:pPr>
-      <w:r>
-        <w:rPr>
-          <w:rFonts w:ascii="宋体" w:hAnsi="宋体" w:eastAsia="宋体"/>
+        <w:t>2．提交V0001选票后再次提交同一ID，确认拒绝；输入UNKNOWN确认名单校验失败。</w:t>
+      </w:r>
+    </w:p>
+    <w:p>
+      <w:pPr>
+        <w:pStyle w:val="ReportBody"/>
+      </w:pPr>
+      <w:r>
+        <w:rPr>
+          <w:rFonts w:ascii="Times New Roman" w:hAnsi="Times New Roman" w:eastAsia="宋体"/>
           <w:b w:val="0"/>
           <w:color w:val="000000"/>
           <w:sz w:val="24"/>
         </w:rPr>
-        <w:t>选票的时间戳、ID与随机标识属于公开元数据，隐私目标是投票内容保密，不是投票者匿名。演示和自动实验均使用虚构ID及合成选票。</w:t>
-      </w:r>
-    </w:p>
-    <w:p>
-      <w:pPr>
+        <w:t>3．双击选票列表，展开详细信息查看密文JSON，确认公开文件不显示明文选择；关闭后验证新票不能提交。</w:t>
+      </w:r>
+    </w:p>
+    <w:p>
+      <w:pPr>
+        <w:pStyle w:val="ReportBody"/>
+      </w:pPr>
+      <w:r>
+        <w:rPr>
+          <w:rFonts w:ascii="Times New Roman" w:hAnsi="Times New Roman" w:eastAsia="宋体"/>
+          <w:b w:val="0"/>
+          <w:color w:val="000000"/>
+          <w:sz w:val="24"/>
+        </w:rPr>
+        <w:t>4．在审计页检查当前投票，应显示签名、摘要、ID及文件集合一致。</w:t>
+      </w:r>
+    </w:p>
+    <w:p>
+      <w:pPr>
+        <w:pStyle w:val="ReportBody"/>
+      </w:pPr>
+      <w:r>
+        <w:rPr>
+          <w:rFonts w:ascii="Times New Roman" w:hAnsi="Times New Roman" w:eastAsia="宋体"/>
+          <w:b w:val="0"/>
+          <w:color w:val="000000"/>
+          <w:sz w:val="24"/>
+        </w:rPr>
+        <w:t>5．分别点击演示篡改检测和演示删除检测，确认临时副本被识别为异常，再检查原始投票仍然通过审计。</w:t>
+      </w:r>
+    </w:p>
+    <w:p>
+      <w:pPr>
+        <w:pStyle w:val="ReportBody"/>
+      </w:pPr>
+      <w:r>
+        <w:rPr>
+          <w:rFonts w:ascii="Times New Roman" w:hAnsi="Times New Roman" w:eastAsia="宋体"/>
+          <w:b w:val="0"/>
+          <w:color w:val="000000"/>
+          <w:sz w:val="24"/>
+        </w:rPr>
+        <w:t>6．点击自动实验与性能测试并选择输出目录；检查CSV和JSON。随后在关闭应用、重新打开后验证持久化数据可以读取。</w:t>
+      </w:r>
+    </w:p>
+    <w:p>
+      <w:pPr>
+        <w:pStyle w:val="ReportH1"/>
+      </w:pPr>
+      <w:r>
+        <w:rPr>
+          <w:rFonts w:ascii="Times New Roman" w:hAnsi="Times New Roman" w:eastAsia="宋体"/>
+          <w:b/>
+          <w:color w:val="000000"/>
+          <w:sz w:val="28"/>
+        </w:rPr>
+        <w:t>五、课题完成过程中遇到的问题及解决方法</w:t>
+      </w:r>
+    </w:p>
+    <w:p>
+      <w:pPr>
+        <w:pStyle w:val="ReportH2"/>
+      </w:pPr>
+      <w:r>
+        <w:rPr>
+          <w:rFonts w:ascii="Times New Roman" w:hAnsi="Times New Roman" w:eastAsia="宋体"/>
+          <w:b/>
+          <w:color w:val="000000"/>
+          <w:sz w:val="24"/>
+        </w:rPr>
+        <w:t>5.1 实验环境与记录来源</w:t>
+      </w:r>
+    </w:p>
+    <w:p>
+      <w:pPr>
+        <w:pStyle w:val="ReportBody"/>
+      </w:pPr>
+      <w:r>
+        <w:t>本轮实测日期为2026年10月27日（北京时间）。环境为Windows-11-10.0.26200-SP0，Python 3.12.14；phe 1.5.0、gmpy2 2.3.2、cryptography 50.0.2、PySide6-Essentials 6.12.0。核心实验使用2048位Paillier模数；9项工程回归使用1024位密钥加速边界检查，不作为安全强度示范。</w:t>
+      </w:r>
+    </w:p>
+    <w:p>
+      <w:pPr>
+        <w:pStyle w:val="ReportBody"/>
+      </w:pPr>
+      <w:r>
+        <w:t>自动核心实验29项全部符合预期，另有9项工程回归和原生Qt界面测试通过。原始记录位于evidence/2026-10-27/full/，包含JSON与CSV；源码SHA-256逐文件记入JSON。表2列出本模块相关结果。“局限”用例通过表示成功复现边界，不表示已防御。</w:t>
+      </w:r>
+    </w:p>
+    <w:p>
+      <w:pPr>
+        <w:pStyle w:val="ReportCaption"/>
         <w:keepNext/>
-        <w:pageBreakBefore/>
-        <w:spacing w:line="300" w:lineRule="auto" w:after="160"/>
-      </w:pPr>
-      <w:r>
-        <w:rPr>
-          <w:rFonts w:ascii="宋体" w:hAnsi="宋体" w:eastAsia="宋体"/>
-          <w:b/>
-          <w:color w:val="000000"/>
-          <w:sz w:val="28"/>
-        </w:rPr>
-        <w:t>四 部分核心代码与实验步骤</w:t>
-      </w:r>
-    </w:p>
-    <w:p>
-      <w:pPr>
-        <w:keepNext/>
-        <w:spacing w:line="300" w:lineRule="auto" w:after="100"/>
-      </w:pPr>
-      <w:r>
-        <w:rPr>
-          <w:rFonts w:ascii="宋体" w:hAnsi="宋体" w:eastAsia="宋体"/>
-          <w:b/>
-          <w:color w:val="000000"/>
-          <w:sz w:val="24"/>
-        </w:rPr>
-        <w:t>4.1 核心实现片段</w:t>
-      </w:r>
-    </w:p>
-    <w:p>
-      <w:pPr>
-        <w:spacing w:line="300" w:lineRule="auto" w:after="100"/>
-      </w:pPr>
-      <w:r>
-        <w:rPr>
-          <w:rFonts w:ascii="宋体" w:hAnsi="宋体" w:eastAsia="宋体"/>
-          <w:b w:val="0"/>
-          <w:color w:val="000000"/>
-          <w:sz w:val="21"/>
-        </w:rPr>
-        <w:t>以下片段摘自 audit_service.py，完整上下文与异常处理见随附源代码。</w:t>
-      </w:r>
-    </w:p>
-    <w:p>
-      <w:pPr>
-        <w:spacing w:after="0" w:line="240" w:lineRule="auto"/>
-      </w:pPr>
-      <w:r>
-        <w:rPr>
-          <w:rFonts w:ascii="Consolas" w:hAnsi="Consolas" w:eastAsia="Consolas"/>
-          <w:b w:val="0"/>
-          <w:color w:val="000000"/>
-          <w:sz w:val="17"/>
-        </w:rPr>
-        <w:t xml:space="preserve">        path = root / 'public' / 'ballots' / filename</w:t>
-      </w:r>
-    </w:p>
-    <w:p>
-      <w:pPr>
-        <w:spacing w:after="0" w:line="240" w:lineRule="auto"/>
-      </w:pPr>
-      <w:r>
-        <w:rPr>
-          <w:rFonts w:ascii="Consolas" w:hAnsi="Consolas" w:eastAsia="Consolas"/>
-          <w:b w:val="0"/>
-          <w:color w:val="000000"/>
-          <w:sz w:val="17"/>
-        </w:rPr>
-        <w:t xml:space="preserve">        if not path.is_file():</w:t>
-      </w:r>
-    </w:p>
-    <w:p>
-      <w:pPr>
-        <w:spacing w:after="0" w:line="240" w:lineRule="auto"/>
-      </w:pPr>
-      <w:r>
-        <w:rPr>
-          <w:rFonts w:ascii="Consolas" w:hAnsi="Consolas" w:eastAsia="Consolas"/>
-          <w:b w:val="0"/>
-          <w:color w:val="000000"/>
-          <w:sz w:val="17"/>
-        </w:rPr>
-        <w:t xml:space="preserve">            raise VoteError('发现选票被删除：' + voter)</w:t>
-      </w:r>
-    </w:p>
-    <w:p>
-      <w:pPr>
-        <w:spacing w:after="0" w:line="240" w:lineRule="auto"/>
-      </w:pPr>
-      <w:r>
-        <w:rPr>
-          <w:rFonts w:ascii="Consolas" w:hAnsi="Consolas" w:eastAsia="Consolas"/>
-          <w:b w:val="0"/>
-          <w:color w:val="000000"/>
-          <w:sz w:val="17"/>
-        </w:rPr>
-        <w:t xml:space="preserve">        ballot = read_json(path, 100000)</w:t>
-      </w:r>
-    </w:p>
-    <w:p>
-      <w:pPr>
-        <w:spacing w:after="0" w:line="240" w:lineRule="auto"/>
-      </w:pPr>
-      <w:r>
-        <w:rPr>
-          <w:rFonts w:ascii="Consolas" w:hAnsi="Consolas" w:eastAsia="Consolas"/>
-          <w:b w:val="0"/>
-          <w:color w:val="000000"/>
-          <w:sz w:val="17"/>
-        </w:rPr>
-        <w:t xml:space="preserve">        if digest(ballot) != entry['sha256']:</w:t>
-      </w:r>
-    </w:p>
-    <w:p>
-      <w:pPr>
-        <w:spacing w:after="0" w:line="240" w:lineRule="auto"/>
-      </w:pPr>
-      <w:r>
-        <w:rPr>
-          <w:rFonts w:ascii="Consolas" w:hAnsi="Consolas" w:eastAsia="Consolas"/>
-          <w:b w:val="0"/>
-          <w:color w:val="000000"/>
-          <w:sz w:val="17"/>
-        </w:rPr>
-        <w:t xml:space="preserve">            raise VoteError('发现选票被篡改：' + voter)</w:t>
-      </w:r>
-    </w:p>
-    <w:p>
-      <w:pPr>
-        <w:spacing w:after="0" w:line="240" w:lineRule="auto"/>
-      </w:pPr>
-      <w:r>
-        <w:rPr>
-          <w:rFonts w:ascii="Consolas" w:hAnsi="Consolas" w:eastAsia="Consolas"/>
-          <w:b w:val="0"/>
-          <w:color w:val="000000"/>
-          <w:sz w:val="17"/>
-        </w:rPr>
-        <w:t xml:space="preserve">        validate_ballot(config, ballot)</w:t>
-      </w:r>
-    </w:p>
-    <w:p>
-      <w:pPr>
-        <w:keepNext/>
-        <w:spacing w:line="300" w:lineRule="auto" w:after="100"/>
-      </w:pPr>
-      <w:r>
-        <w:rPr>
-          <w:rFonts w:ascii="宋体" w:hAnsi="宋体" w:eastAsia="宋体"/>
-          <w:b/>
-          <w:color w:val="000000"/>
-          <w:sz w:val="24"/>
-        </w:rPr>
-        <w:t>4.2 本模块可重复实验步骤</w:t>
-      </w:r>
-    </w:p>
-    <w:p>
-      <w:pPr>
-        <w:spacing w:line="300" w:lineRule="auto" w:after="100"/>
-      </w:pPr>
-      <w:r>
-        <w:rPr>
-          <w:rFonts w:ascii="宋体" w:hAnsi="宋体" w:eastAsia="宋体"/>
-          <w:b w:val="0"/>
-          <w:color w:val="000000"/>
-          <w:sz w:val="22"/>
-        </w:rPr>
-        <w:t>1．启动MiPiaoLab.exe，在创建页填写标题、逗号分隔选项、人数及保管口令，选择目录创建新轮次。</w:t>
-      </w:r>
-    </w:p>
-    <w:p>
-      <w:pPr>
-        <w:spacing w:line="300" w:lineRule="auto" w:after="100"/>
-      </w:pPr>
-      <w:r>
-        <w:rPr>
-          <w:rFonts w:ascii="宋体" w:hAnsi="宋体" w:eastAsia="宋体"/>
-          <w:b w:val="0"/>
-          <w:color w:val="000000"/>
-          <w:sz w:val="22"/>
-        </w:rPr>
-        <w:t>2．提交V0001选票后再次提交同一ID，确认拒绝；输入UNKNOWN确认名单校验失败。</w:t>
-      </w:r>
-    </w:p>
-    <w:p>
-      <w:pPr>
-        <w:spacing w:line="300" w:lineRule="auto" w:after="100"/>
-      </w:pPr>
-      <w:r>
-        <w:rPr>
-          <w:rFonts w:ascii="宋体" w:hAnsi="宋体" w:eastAsia="宋体"/>
-          <w:b w:val="0"/>
-          <w:color w:val="000000"/>
-          <w:sz w:val="22"/>
-        </w:rPr>
-        <w:t>3．双击选票列表，展开详细信息查看密文JSON，确认公开文件不显示明文选择；关闭后验证新票不能提交。</w:t>
-      </w:r>
-    </w:p>
-    <w:p>
-      <w:pPr>
-        <w:spacing w:line="300" w:lineRule="auto" w:after="100"/>
-      </w:pPr>
-      <w:r>
-        <w:rPr>
-          <w:rFonts w:ascii="宋体" w:hAnsi="宋体" w:eastAsia="宋体"/>
-          <w:b w:val="0"/>
-          <w:color w:val="000000"/>
-          <w:sz w:val="22"/>
-        </w:rPr>
-        <w:t>4．在审计页检查当前投票，应显示签名、摘要、ID及文件集合一致。</w:t>
-      </w:r>
-    </w:p>
-    <w:p>
-      <w:pPr>
-        <w:spacing w:line="300" w:lineRule="auto" w:after="100"/>
-      </w:pPr>
-      <w:r>
-        <w:rPr>
-          <w:rFonts w:ascii="宋体" w:hAnsi="宋体" w:eastAsia="宋体"/>
-          <w:b w:val="0"/>
-          <w:color w:val="000000"/>
-          <w:sz w:val="22"/>
-        </w:rPr>
-        <w:t>5．分别点击演示篡改检测和演示删除检测，确认临时副本被识别为异常，再检查原始投票仍然通过审计。</w:t>
-      </w:r>
-    </w:p>
-    <w:p>
-      <w:pPr>
-        <w:spacing w:line="300" w:lineRule="auto" w:after="100"/>
-      </w:pPr>
-      <w:r>
-        <w:rPr>
-          <w:rFonts w:ascii="宋体" w:hAnsi="宋体" w:eastAsia="宋体"/>
-          <w:b w:val="0"/>
-          <w:color w:val="000000"/>
-          <w:sz w:val="22"/>
-        </w:rPr>
-        <w:t>6．点击自动实验与性能测试并选择输出目录；检查CSV和JSON。随后在关闭应用、重新打开后验证持久化数据可以读取。</w:t>
-      </w:r>
-    </w:p>
-    <w:p>
-      <w:pPr>
-        <w:keepNext/>
-        <w:pageBreakBefore/>
-        <w:spacing w:line="300" w:lineRule="auto" w:after="160"/>
-      </w:pPr>
-      <w:r>
-        <w:rPr>
-          <w:rFonts w:ascii="宋体" w:hAnsi="宋体" w:eastAsia="宋体"/>
-          <w:b/>
-          <w:color w:val="000000"/>
-          <w:sz w:val="28"/>
-        </w:rPr>
-        <w:t>五 课题完成过程中遇到的问题及解决方法</w:t>
-      </w:r>
-    </w:p>
-    <w:p>
-      <w:pPr>
-        <w:keepNext/>
-        <w:spacing w:line="300" w:lineRule="auto" w:after="100"/>
-      </w:pPr>
-      <w:r>
-        <w:rPr>
-          <w:rFonts w:ascii="宋体" w:hAnsi="宋体" w:eastAsia="宋体"/>
-          <w:b/>
-          <w:color w:val="000000"/>
-          <w:sz w:val="24"/>
-        </w:rPr>
-        <w:t>5.1 实验环境与记录来源</w:t>
-      </w:r>
-    </w:p>
-    <w:p>
-      <w:pPr>
-        <w:spacing w:line="300" w:lineRule="auto" w:after="100"/>
-        <w:ind w:firstLine="480"/>
-      </w:pPr>
-      <w:r>
-        <w:rPr>
-          <w:rFonts w:ascii="宋体" w:hAnsi="宋体" w:eastAsia="宋体"/>
-          <w:b w:val="0"/>
-          <w:color w:val="000000"/>
-          <w:sz w:val="22"/>
-        </w:rPr>
-        <w:t>实测日期为2026年10月26日。环境为Windows-11-10.0.22631-SP0，Python 3.12.14，phe 1.5.0，gmpy2 2.3.2，cryptography 50.0.2，PySide6 6.12.0。Paillier模数2048位；数据来自experiment_results.json，不使用预测值替代实测。</w:t>
-      </w:r>
-    </w:p>
-    <w:p>
-      <w:pPr>
-        <w:spacing w:line="300" w:lineRule="auto" w:after="100"/>
-        <w:ind w:firstLine="480"/>
-      </w:pPr>
-      <w:r>
-        <w:rPr>
-          <w:rFonts w:ascii="宋体" w:hAnsi="宋体" w:eastAsia="宋体"/>
-          <w:b w:val="0"/>
-          <w:color w:val="000000"/>
-          <w:sz w:val="22"/>
-        </w:rPr>
-        <w:t>自动核心实验共25项，25项通过。下表选取与本分工相关的用例；完整记录在test_cases.csv。‘通过’表示符合预期，完整回滚用例的通过表示局限被成功复现，并不表示系统能够抵御回滚。</w:t>
+      </w:pPr>
+      <w:r>
+        <w:t>表2 本模块测试结果</w:t>
       </w:r>
     </w:p>
     <w:tbl>
@@ -3316,12 +3439,17 @@
       <w:tr>
         <w:trPr>
           <w:tblHeader/>
+          <w:tblHeader/>
         </w:trPr>
         <w:tc>
           <w:tcPr>
             <w:tcW w:type="dxa" w:w="2551"/>
             <w:vAlign w:val="center"/>
             <w:tcBorders>
+              <w:top w:val="single" w:sz="4" w:color="D9D9D9"/>
+              <w:left w:val="single" w:sz="4" w:color="D9D9D9"/>
+              <w:bottom w:val="single" w:sz="4" w:color="D9D9D9"/>
+              <w:right w:val="single" w:sz="4" w:color="D9D9D9"/>
               <w:top w:val="single" w:sz="4" w:color="D9D9D9"/>
               <w:left w:val="single" w:sz="4" w:color="D9D9D9"/>
               <w:bottom w:val="single" w:sz="4" w:color="D9D9D9"/>
@@ -3337,11 +3465,11 @@
           </w:tcPr>
           <w:p>
             <w:pPr>
-              <w:spacing w:after="40" w:line="264" w:lineRule="auto"/>
-            </w:pPr>
-            <w:r>
-              <w:rPr>
-                <w:rFonts w:ascii="宋体" w:hAnsi="宋体" w:eastAsia="宋体"/>
+              <w:spacing w:after="40" w:line="288" w:lineRule="auto" w:before="40"/>
+            </w:pPr>
+            <w:r>
+              <w:rPr>
+                <w:rFonts w:ascii="Times New Roman" w:hAnsi="Times New Roman" w:eastAsia="宋体"/>
                 <w:b/>
                 <w:color w:val="000000"/>
                 <w:sz w:val="21"/>
@@ -3355,6 +3483,10 @@
             <w:tcW w:type="dxa" w:w="6633"/>
             <w:vAlign w:val="center"/>
             <w:tcBorders>
+              <w:top w:val="single" w:sz="4" w:color="D9D9D9"/>
+              <w:left w:val="single" w:sz="4" w:color="D9D9D9"/>
+              <w:bottom w:val="single" w:sz="4" w:color="D9D9D9"/>
+              <w:right w:val="single" w:sz="4" w:color="D9D9D9"/>
               <w:top w:val="single" w:sz="4" w:color="D9D9D9"/>
               <w:left w:val="single" w:sz="4" w:color="D9D9D9"/>
               <w:bottom w:val="single" w:sz="4" w:color="D9D9D9"/>
@@ -3370,11 +3502,11 @@
           </w:tcPr>
           <w:p>
             <w:pPr>
-              <w:spacing w:after="40" w:line="264" w:lineRule="auto"/>
-            </w:pPr>
-            <w:r>
-              <w:rPr>
-                <w:rFonts w:ascii="宋体" w:hAnsi="宋体" w:eastAsia="宋体"/>
+              <w:spacing w:after="40" w:line="288" w:lineRule="auto" w:before="40"/>
+            </w:pPr>
+            <w:r>
+              <w:rPr>
+                <w:rFonts w:ascii="Times New Roman" w:hAnsi="Times New Roman" w:eastAsia="宋体"/>
                 <w:b/>
                 <w:color w:val="000000"/>
                 <w:sz w:val="21"/>
@@ -3385,11 +3517,16 @@
         </w:tc>
       </w:tr>
       <w:tr>
+        <w:trPr/>
         <w:tc>
           <w:tcPr>
             <w:tcW w:type="dxa" w:w="2551"/>
             <w:vAlign w:val="center"/>
             <w:tcBorders>
+              <w:top w:val="single" w:sz="4" w:color="D9D9D9"/>
+              <w:left w:val="single" w:sz="4" w:color="D9D9D9"/>
+              <w:bottom w:val="single" w:sz="4" w:color="D9D9D9"/>
+              <w:right w:val="single" w:sz="4" w:color="D9D9D9"/>
               <w:top w:val="single" w:sz="4" w:color="D9D9D9"/>
               <w:left w:val="single" w:sz="4" w:color="D9D9D9"/>
               <w:bottom w:val="single" w:sz="4" w:color="D9D9D9"/>
@@ -3404,11 +3541,11 @@
           </w:tcPr>
           <w:p>
             <w:pPr>
-              <w:spacing w:after="40" w:line="264" w:lineRule="auto"/>
-            </w:pPr>
-            <w:r>
-              <w:rPr>
-                <w:rFonts w:ascii="宋体" w:hAnsi="宋体" w:eastAsia="宋体"/>
+              <w:spacing w:after="40" w:line="288" w:lineRule="auto" w:before="40"/>
+            </w:pPr>
+            <w:r>
+              <w:rPr>
+                <w:rFonts w:ascii="Times New Roman" w:hAnsi="Times New Roman" w:eastAsia="宋体"/>
                 <w:b w:val="0"/>
                 <w:color w:val="000000"/>
                 <w:sz w:val="21"/>
@@ -3422,6 +3559,10 @@
             <w:tcW w:type="dxa" w:w="6633"/>
             <w:vAlign w:val="center"/>
             <w:tcBorders>
+              <w:top w:val="single" w:sz="4" w:color="D9D9D9"/>
+              <w:left w:val="single" w:sz="4" w:color="D9D9D9"/>
+              <w:bottom w:val="single" w:sz="4" w:color="D9D9D9"/>
+              <w:right w:val="single" w:sz="4" w:color="D9D9D9"/>
               <w:top w:val="single" w:sz="4" w:color="D9D9D9"/>
               <w:left w:val="single" w:sz="4" w:color="D9D9D9"/>
               <w:bottom w:val="single" w:sz="4" w:color="D9D9D9"/>
@@ -3436,11 +3577,11 @@
           </w:tcPr>
           <w:p>
             <w:pPr>
-              <w:spacing w:after="40" w:line="264" w:lineRule="auto"/>
-            </w:pPr>
-            <w:r>
-              <w:rPr>
-                <w:rFonts w:ascii="宋体" w:hAnsi="宋体" w:eastAsia="宋体"/>
+              <w:spacing w:after="40" w:line="288" w:lineRule="auto" w:before="40"/>
+            </w:pPr>
+            <w:r>
+              <w:rPr>
+                <w:rFonts w:ascii="Times New Roman" w:hAnsi="Times New Roman" w:eastAsia="宋体"/>
                 <w:b w:val="0"/>
                 <w:color w:val="000000"/>
                 <w:sz w:val="21"/>
@@ -3451,11 +3592,16 @@
         </w:tc>
       </w:tr>
       <w:tr>
+        <w:trPr/>
         <w:tc>
           <w:tcPr>
             <w:tcW w:type="dxa" w:w="2551"/>
             <w:vAlign w:val="center"/>
             <w:tcBorders>
+              <w:top w:val="single" w:sz="4" w:color="D9D9D9"/>
+              <w:left w:val="single" w:sz="4" w:color="D9D9D9"/>
+              <w:bottom w:val="single" w:sz="4" w:color="D9D9D9"/>
+              <w:right w:val="single" w:sz="4" w:color="D9D9D9"/>
               <w:top w:val="single" w:sz="4" w:color="D9D9D9"/>
               <w:left w:val="single" w:sz="4" w:color="D9D9D9"/>
               <w:bottom w:val="single" w:sz="4" w:color="D9D9D9"/>
@@ -3470,11 +3616,11 @@
           </w:tcPr>
           <w:p>
             <w:pPr>
-              <w:spacing w:after="40" w:line="264" w:lineRule="auto"/>
-            </w:pPr>
-            <w:r>
-              <w:rPr>
-                <w:rFonts w:ascii="宋体" w:hAnsi="宋体" w:eastAsia="宋体"/>
+              <w:spacing w:after="40" w:line="288" w:lineRule="auto" w:before="40"/>
+            </w:pPr>
+            <w:r>
+              <w:rPr>
+                <w:rFonts w:ascii="Times New Roman" w:hAnsi="Times New Roman" w:eastAsia="宋体"/>
                 <w:b w:val="0"/>
                 <w:color w:val="000000"/>
                 <w:sz w:val="21"/>
@@ -3488,6 +3634,10 @@
             <w:tcW w:type="dxa" w:w="6633"/>
             <w:vAlign w:val="center"/>
             <w:tcBorders>
+              <w:top w:val="single" w:sz="4" w:color="D9D9D9"/>
+              <w:left w:val="single" w:sz="4" w:color="D9D9D9"/>
+              <w:bottom w:val="single" w:sz="4" w:color="D9D9D9"/>
+              <w:right w:val="single" w:sz="4" w:color="D9D9D9"/>
               <w:top w:val="single" w:sz="4" w:color="D9D9D9"/>
               <w:left w:val="single" w:sz="4" w:color="D9D9D9"/>
               <w:bottom w:val="single" w:sz="4" w:color="D9D9D9"/>
@@ -3502,11 +3652,11 @@
           </w:tcPr>
           <w:p>
             <w:pPr>
-              <w:spacing w:after="40" w:line="264" w:lineRule="auto"/>
-            </w:pPr>
-            <w:r>
-              <w:rPr>
-                <w:rFonts w:ascii="宋体" w:hAnsi="宋体" w:eastAsia="宋体"/>
+              <w:spacing w:after="40" w:line="288" w:lineRule="auto" w:before="40"/>
+            </w:pPr>
+            <w:r>
+              <w:rPr>
+                <w:rFonts w:ascii="Times New Roman" w:hAnsi="Times New Roman" w:eastAsia="宋体"/>
                 <w:b w:val="0"/>
                 <w:color w:val="000000"/>
                 <w:sz w:val="21"/>
@@ -3517,11 +3667,16 @@
         </w:tc>
       </w:tr>
       <w:tr>
+        <w:trPr/>
         <w:tc>
           <w:tcPr>
             <w:tcW w:type="dxa" w:w="2551"/>
             <w:vAlign w:val="center"/>
             <w:tcBorders>
+              <w:top w:val="single" w:sz="4" w:color="D9D9D9"/>
+              <w:left w:val="single" w:sz="4" w:color="D9D9D9"/>
+              <w:bottom w:val="single" w:sz="4" w:color="D9D9D9"/>
+              <w:right w:val="single" w:sz="4" w:color="D9D9D9"/>
               <w:top w:val="single" w:sz="4" w:color="D9D9D9"/>
               <w:left w:val="single" w:sz="4" w:color="D9D9D9"/>
               <w:bottom w:val="single" w:sz="4" w:color="D9D9D9"/>
@@ -3536,11 +3691,11 @@
           </w:tcPr>
           <w:p>
             <w:pPr>
-              <w:spacing w:after="40" w:line="264" w:lineRule="auto"/>
-            </w:pPr>
-            <w:r>
-              <w:rPr>
-                <w:rFonts w:ascii="宋体" w:hAnsi="宋体" w:eastAsia="宋体"/>
+              <w:spacing w:after="40" w:line="288" w:lineRule="auto" w:before="40"/>
+            </w:pPr>
+            <w:r>
+              <w:rPr>
+                <w:rFonts w:ascii="Times New Roman" w:hAnsi="Times New Roman" w:eastAsia="宋体"/>
                 <w:b w:val="0"/>
                 <w:color w:val="000000"/>
                 <w:sz w:val="21"/>
@@ -3554,6 +3709,10 @@
             <w:tcW w:type="dxa" w:w="6633"/>
             <w:vAlign w:val="center"/>
             <w:tcBorders>
+              <w:top w:val="single" w:sz="4" w:color="D9D9D9"/>
+              <w:left w:val="single" w:sz="4" w:color="D9D9D9"/>
+              <w:bottom w:val="single" w:sz="4" w:color="D9D9D9"/>
+              <w:right w:val="single" w:sz="4" w:color="D9D9D9"/>
               <w:top w:val="single" w:sz="4" w:color="D9D9D9"/>
               <w:left w:val="single" w:sz="4" w:color="D9D9D9"/>
               <w:bottom w:val="single" w:sz="4" w:color="D9D9D9"/>
@@ -3568,11 +3727,11 @@
           </w:tcPr>
           <w:p>
             <w:pPr>
-              <w:spacing w:after="40" w:line="264" w:lineRule="auto"/>
-            </w:pPr>
-            <w:r>
-              <w:rPr>
-                <w:rFonts w:ascii="宋体" w:hAnsi="宋体" w:eastAsia="宋体"/>
+              <w:spacing w:after="40" w:line="288" w:lineRule="auto" w:before="40"/>
+            </w:pPr>
+            <w:r>
+              <w:rPr>
+                <w:rFonts w:ascii="Times New Roman" w:hAnsi="Times New Roman" w:eastAsia="宋体"/>
                 <w:b w:val="0"/>
                 <w:color w:val="000000"/>
                 <w:sz w:val="21"/>
@@ -3583,11 +3742,16 @@
         </w:tc>
       </w:tr>
       <w:tr>
+        <w:trPr/>
         <w:tc>
           <w:tcPr>
             <w:tcW w:type="dxa" w:w="2551"/>
             <w:vAlign w:val="center"/>
             <w:tcBorders>
+              <w:top w:val="single" w:sz="4" w:color="D9D9D9"/>
+              <w:left w:val="single" w:sz="4" w:color="D9D9D9"/>
+              <w:bottom w:val="single" w:sz="4" w:color="D9D9D9"/>
+              <w:right w:val="single" w:sz="4" w:color="D9D9D9"/>
               <w:top w:val="single" w:sz="4" w:color="D9D9D9"/>
               <w:left w:val="single" w:sz="4" w:color="D9D9D9"/>
               <w:bottom w:val="single" w:sz="4" w:color="D9D9D9"/>
@@ -3602,11 +3766,11 @@
           </w:tcPr>
           <w:p>
             <w:pPr>
-              <w:spacing w:after="40" w:line="264" w:lineRule="auto"/>
-            </w:pPr>
-            <w:r>
-              <w:rPr>
-                <w:rFonts w:ascii="宋体" w:hAnsi="宋体" w:eastAsia="宋体"/>
+              <w:spacing w:after="40" w:line="288" w:lineRule="auto" w:before="40"/>
+            </w:pPr>
+            <w:r>
+              <w:rPr>
+                <w:rFonts w:ascii="Times New Roman" w:hAnsi="Times New Roman" w:eastAsia="宋体"/>
                 <w:b w:val="0"/>
                 <w:color w:val="000000"/>
                 <w:sz w:val="21"/>
@@ -3620,6 +3784,10 @@
             <w:tcW w:type="dxa" w:w="6633"/>
             <w:vAlign w:val="center"/>
             <w:tcBorders>
+              <w:top w:val="single" w:sz="4" w:color="D9D9D9"/>
+              <w:left w:val="single" w:sz="4" w:color="D9D9D9"/>
+              <w:bottom w:val="single" w:sz="4" w:color="D9D9D9"/>
+              <w:right w:val="single" w:sz="4" w:color="D9D9D9"/>
               <w:top w:val="single" w:sz="4" w:color="D9D9D9"/>
               <w:left w:val="single" w:sz="4" w:color="D9D9D9"/>
               <w:bottom w:val="single" w:sz="4" w:color="D9D9D9"/>
@@ -3634,11 +3802,11 @@
           </w:tcPr>
           <w:p>
             <w:pPr>
-              <w:spacing w:after="40" w:line="264" w:lineRule="auto"/>
-            </w:pPr>
-            <w:r>
-              <w:rPr>
-                <w:rFonts w:ascii="宋体" w:hAnsi="宋体" w:eastAsia="宋体"/>
+              <w:spacing w:after="40" w:line="288" w:lineRule="auto" w:before="40"/>
+            </w:pPr>
+            <w:r>
+              <w:rPr>
+                <w:rFonts w:ascii="Times New Roman" w:hAnsi="Times New Roman" w:eastAsia="宋体"/>
                 <w:b w:val="0"/>
                 <w:color w:val="000000"/>
                 <w:sz w:val="21"/>
@@ -3649,11 +3817,16 @@
         </w:tc>
       </w:tr>
       <w:tr>
+        <w:trPr/>
         <w:tc>
           <w:tcPr>
             <w:tcW w:type="dxa" w:w="2551"/>
             <w:vAlign w:val="center"/>
             <w:tcBorders>
+              <w:top w:val="single" w:sz="4" w:color="D9D9D9"/>
+              <w:left w:val="single" w:sz="4" w:color="D9D9D9"/>
+              <w:bottom w:val="single" w:sz="4" w:color="D9D9D9"/>
+              <w:right w:val="single" w:sz="4" w:color="D9D9D9"/>
               <w:top w:val="single" w:sz="4" w:color="D9D9D9"/>
               <w:left w:val="single" w:sz="4" w:color="D9D9D9"/>
               <w:bottom w:val="single" w:sz="4" w:color="D9D9D9"/>
@@ -3668,11 +3841,11 @@
           </w:tcPr>
           <w:p>
             <w:pPr>
-              <w:spacing w:after="40" w:line="264" w:lineRule="auto"/>
-            </w:pPr>
-            <w:r>
-              <w:rPr>
-                <w:rFonts w:ascii="宋体" w:hAnsi="宋体" w:eastAsia="宋体"/>
+              <w:spacing w:after="40" w:line="288" w:lineRule="auto" w:before="40"/>
+            </w:pPr>
+            <w:r>
+              <w:rPr>
+                <w:rFonts w:ascii="Times New Roman" w:hAnsi="Times New Roman" w:eastAsia="宋体"/>
                 <w:b w:val="0"/>
                 <w:color w:val="000000"/>
                 <w:sz w:val="21"/>
@@ -3686,6 +3859,10 @@
             <w:tcW w:type="dxa" w:w="6633"/>
             <w:vAlign w:val="center"/>
             <w:tcBorders>
+              <w:top w:val="single" w:sz="4" w:color="D9D9D9"/>
+              <w:left w:val="single" w:sz="4" w:color="D9D9D9"/>
+              <w:bottom w:val="single" w:sz="4" w:color="D9D9D9"/>
+              <w:right w:val="single" w:sz="4" w:color="D9D9D9"/>
               <w:top w:val="single" w:sz="4" w:color="D9D9D9"/>
               <w:left w:val="single" w:sz="4" w:color="D9D9D9"/>
               <w:bottom w:val="single" w:sz="4" w:color="D9D9D9"/>
@@ -3700,11 +3877,11 @@
           </w:tcPr>
           <w:p>
             <w:pPr>
-              <w:spacing w:after="40" w:line="264" w:lineRule="auto"/>
-            </w:pPr>
-            <w:r>
-              <w:rPr>
-                <w:rFonts w:ascii="宋体" w:hAnsi="宋体" w:eastAsia="宋体"/>
+              <w:spacing w:after="40" w:line="288" w:lineRule="auto" w:before="40"/>
+            </w:pPr>
+            <w:r>
+              <w:rPr>
+                <w:rFonts w:ascii="Times New Roman" w:hAnsi="Times New Roman" w:eastAsia="宋体"/>
                 <w:b w:val="0"/>
                 <w:color w:val="000000"/>
                 <w:sz w:val="21"/>
@@ -3715,11 +3892,16 @@
         </w:tc>
       </w:tr>
       <w:tr>
+        <w:trPr/>
         <w:tc>
           <w:tcPr>
             <w:tcW w:type="dxa" w:w="2551"/>
             <w:vAlign w:val="center"/>
             <w:tcBorders>
+              <w:top w:val="single" w:sz="4" w:color="D9D9D9"/>
+              <w:left w:val="single" w:sz="4" w:color="D9D9D9"/>
+              <w:bottom w:val="single" w:sz="4" w:color="D9D9D9"/>
+              <w:right w:val="single" w:sz="4" w:color="D9D9D9"/>
               <w:top w:val="single" w:sz="4" w:color="D9D9D9"/>
               <w:left w:val="single" w:sz="4" w:color="D9D9D9"/>
               <w:bottom w:val="single" w:sz="4" w:color="D9D9D9"/>
@@ -3734,11 +3916,11 @@
           </w:tcPr>
           <w:p>
             <w:pPr>
-              <w:spacing w:after="40" w:line="264" w:lineRule="auto"/>
-            </w:pPr>
-            <w:r>
-              <w:rPr>
-                <w:rFonts w:ascii="宋体" w:hAnsi="宋体" w:eastAsia="宋体"/>
+              <w:spacing w:after="40" w:line="288" w:lineRule="auto" w:before="40"/>
+            </w:pPr>
+            <w:r>
+              <w:rPr>
+                <w:rFonts w:ascii="Times New Roman" w:hAnsi="Times New Roman" w:eastAsia="宋体"/>
                 <w:b w:val="0"/>
                 <w:color w:val="000000"/>
                 <w:sz w:val="21"/>
@@ -3752,6 +3934,10 @@
             <w:tcW w:type="dxa" w:w="6633"/>
             <w:vAlign w:val="center"/>
             <w:tcBorders>
+              <w:top w:val="single" w:sz="4" w:color="D9D9D9"/>
+              <w:left w:val="single" w:sz="4" w:color="D9D9D9"/>
+              <w:bottom w:val="single" w:sz="4" w:color="D9D9D9"/>
+              <w:right w:val="single" w:sz="4" w:color="D9D9D9"/>
               <w:top w:val="single" w:sz="4" w:color="D9D9D9"/>
               <w:left w:val="single" w:sz="4" w:color="D9D9D9"/>
               <w:bottom w:val="single" w:sz="4" w:color="D9D9D9"/>
@@ -3766,11 +3952,11 @@
           </w:tcPr>
           <w:p>
             <w:pPr>
-              <w:spacing w:after="40" w:line="264" w:lineRule="auto"/>
-            </w:pPr>
-            <w:r>
-              <w:rPr>
-                <w:rFonts w:ascii="宋体" w:hAnsi="宋体" w:eastAsia="宋体"/>
+              <w:spacing w:after="40" w:line="288" w:lineRule="auto" w:before="40"/>
+            </w:pPr>
+            <w:r>
+              <w:rPr>
+                <w:rFonts w:ascii="Times New Roman" w:hAnsi="Times New Roman" w:eastAsia="宋体"/>
                 <w:b w:val="0"/>
                 <w:color w:val="000000"/>
                 <w:sz w:val="21"/>
@@ -3781,11 +3967,16 @@
         </w:tc>
       </w:tr>
       <w:tr>
+        <w:trPr/>
         <w:tc>
           <w:tcPr>
             <w:tcW w:type="dxa" w:w="2551"/>
             <w:vAlign w:val="center"/>
             <w:tcBorders>
+              <w:top w:val="single" w:sz="4" w:color="D9D9D9"/>
+              <w:left w:val="single" w:sz="4" w:color="D9D9D9"/>
+              <w:bottom w:val="single" w:sz="4" w:color="D9D9D9"/>
+              <w:right w:val="single" w:sz="4" w:color="D9D9D9"/>
               <w:top w:val="single" w:sz="4" w:color="D9D9D9"/>
               <w:left w:val="single" w:sz="4" w:color="D9D9D9"/>
               <w:bottom w:val="single" w:sz="4" w:color="D9D9D9"/>
@@ -3800,11 +3991,11 @@
           </w:tcPr>
           <w:p>
             <w:pPr>
-              <w:spacing w:after="40" w:line="264" w:lineRule="auto"/>
-            </w:pPr>
-            <w:r>
-              <w:rPr>
-                <w:rFonts w:ascii="宋体" w:hAnsi="宋体" w:eastAsia="宋体"/>
+              <w:spacing w:after="40" w:line="288" w:lineRule="auto" w:before="40"/>
+            </w:pPr>
+            <w:r>
+              <w:rPr>
+                <w:rFonts w:ascii="Times New Roman" w:hAnsi="Times New Roman" w:eastAsia="宋体"/>
                 <w:b w:val="0"/>
                 <w:color w:val="000000"/>
                 <w:sz w:val="21"/>
@@ -3818,6 +4009,10 @@
             <w:tcW w:type="dxa" w:w="6633"/>
             <w:vAlign w:val="center"/>
             <w:tcBorders>
+              <w:top w:val="single" w:sz="4" w:color="D9D9D9"/>
+              <w:left w:val="single" w:sz="4" w:color="D9D9D9"/>
+              <w:bottom w:val="single" w:sz="4" w:color="D9D9D9"/>
+              <w:right w:val="single" w:sz="4" w:color="D9D9D9"/>
               <w:top w:val="single" w:sz="4" w:color="D9D9D9"/>
               <w:left w:val="single" w:sz="4" w:color="D9D9D9"/>
               <w:bottom w:val="single" w:sz="4" w:color="D9D9D9"/>
@@ -3832,11 +4027,11 @@
           </w:tcPr>
           <w:p>
             <w:pPr>
-              <w:spacing w:after="40" w:line="264" w:lineRule="auto"/>
-            </w:pPr>
-            <w:r>
-              <w:rPr>
-                <w:rFonts w:ascii="宋体" w:hAnsi="宋体" w:eastAsia="宋体"/>
+              <w:spacing w:after="40" w:line="288" w:lineRule="auto" w:before="40"/>
+            </w:pPr>
+            <w:r>
+              <w:rPr>
+                <w:rFonts w:ascii="Times New Roman" w:hAnsi="Times New Roman" w:eastAsia="宋体"/>
                 <w:b w:val="0"/>
                 <w:color w:val="000000"/>
                 <w:sz w:val="21"/>
@@ -3847,11 +4042,16 @@
         </w:tc>
       </w:tr>
       <w:tr>
+        <w:trPr/>
         <w:tc>
           <w:tcPr>
             <w:tcW w:type="dxa" w:w="2551"/>
             <w:vAlign w:val="center"/>
             <w:tcBorders>
+              <w:top w:val="single" w:sz="4" w:color="D9D9D9"/>
+              <w:left w:val="single" w:sz="4" w:color="D9D9D9"/>
+              <w:bottom w:val="single" w:sz="4" w:color="D9D9D9"/>
+              <w:right w:val="single" w:sz="4" w:color="D9D9D9"/>
               <w:top w:val="single" w:sz="4" w:color="D9D9D9"/>
               <w:left w:val="single" w:sz="4" w:color="D9D9D9"/>
               <w:bottom w:val="single" w:sz="4" w:color="D9D9D9"/>
@@ -3866,11 +4066,11 @@
           </w:tcPr>
           <w:p>
             <w:pPr>
-              <w:spacing w:after="40" w:line="264" w:lineRule="auto"/>
-            </w:pPr>
-            <w:r>
-              <w:rPr>
-                <w:rFonts w:ascii="宋体" w:hAnsi="宋体" w:eastAsia="宋体"/>
+              <w:spacing w:after="40" w:line="288" w:lineRule="auto" w:before="40"/>
+            </w:pPr>
+            <w:r>
+              <w:rPr>
+                <w:rFonts w:ascii="Times New Roman" w:hAnsi="Times New Roman" w:eastAsia="宋体"/>
                 <w:b w:val="0"/>
                 <w:color w:val="000000"/>
                 <w:sz w:val="21"/>
@@ -3884,6 +4084,10 @@
             <w:tcW w:type="dxa" w:w="6633"/>
             <w:vAlign w:val="center"/>
             <w:tcBorders>
+              <w:top w:val="single" w:sz="4" w:color="D9D9D9"/>
+              <w:left w:val="single" w:sz="4" w:color="D9D9D9"/>
+              <w:bottom w:val="single" w:sz="4" w:color="D9D9D9"/>
+              <w:right w:val="single" w:sz="4" w:color="D9D9D9"/>
               <w:top w:val="single" w:sz="4" w:color="D9D9D9"/>
               <w:left w:val="single" w:sz="4" w:color="D9D9D9"/>
               <w:bottom w:val="single" w:sz="4" w:color="D9D9D9"/>
@@ -3898,11 +4102,11 @@
           </w:tcPr>
           <w:p>
             <w:pPr>
-              <w:spacing w:after="40" w:line="264" w:lineRule="auto"/>
-            </w:pPr>
-            <w:r>
-              <w:rPr>
-                <w:rFonts w:ascii="宋体" w:hAnsi="宋体" w:eastAsia="宋体"/>
+              <w:spacing w:after="40" w:line="288" w:lineRule="auto" w:before="40"/>
+            </w:pPr>
+            <w:r>
+              <w:rPr>
+                <w:rFonts w:ascii="Times New Roman" w:hAnsi="Times New Roman" w:eastAsia="宋体"/>
                 <w:b w:val="0"/>
                 <w:color w:val="000000"/>
                 <w:sz w:val="21"/>
@@ -3913,11 +4117,16 @@
         </w:tc>
       </w:tr>
       <w:tr>
+        <w:trPr/>
         <w:tc>
           <w:tcPr>
             <w:tcW w:type="dxa" w:w="2551"/>
             <w:vAlign w:val="center"/>
             <w:tcBorders>
+              <w:top w:val="single" w:sz="4" w:color="D9D9D9"/>
+              <w:left w:val="single" w:sz="4" w:color="D9D9D9"/>
+              <w:bottom w:val="single" w:sz="4" w:color="D9D9D9"/>
+              <w:right w:val="single" w:sz="4" w:color="D9D9D9"/>
               <w:top w:val="single" w:sz="4" w:color="D9D9D9"/>
               <w:left w:val="single" w:sz="4" w:color="D9D9D9"/>
               <w:bottom w:val="single" w:sz="4" w:color="D9D9D9"/>
@@ -3932,11 +4141,11 @@
           </w:tcPr>
           <w:p>
             <w:pPr>
-              <w:spacing w:after="40" w:line="264" w:lineRule="auto"/>
-            </w:pPr>
-            <w:r>
-              <w:rPr>
-                <w:rFonts w:ascii="宋体" w:hAnsi="宋体" w:eastAsia="宋体"/>
+              <w:spacing w:after="40" w:line="288" w:lineRule="auto" w:before="40"/>
+            </w:pPr>
+            <w:r>
+              <w:rPr>
+                <w:rFonts w:ascii="Times New Roman" w:hAnsi="Times New Roman" w:eastAsia="宋体"/>
                 <w:b w:val="0"/>
                 <w:color w:val="000000"/>
                 <w:sz w:val="21"/>
@@ -3950,6 +4159,10 @@
             <w:tcW w:type="dxa" w:w="6633"/>
             <w:vAlign w:val="center"/>
             <w:tcBorders>
+              <w:top w:val="single" w:sz="4" w:color="D9D9D9"/>
+              <w:left w:val="single" w:sz="4" w:color="D9D9D9"/>
+              <w:bottom w:val="single" w:sz="4" w:color="D9D9D9"/>
+              <w:right w:val="single" w:sz="4" w:color="D9D9D9"/>
               <w:top w:val="single" w:sz="4" w:color="D9D9D9"/>
               <w:left w:val="single" w:sz="4" w:color="D9D9D9"/>
               <w:bottom w:val="single" w:sz="4" w:color="D9D9D9"/>
@@ -3964,11 +4177,11 @@
           </w:tcPr>
           <w:p>
             <w:pPr>
-              <w:spacing w:after="40" w:line="264" w:lineRule="auto"/>
-            </w:pPr>
-            <w:r>
-              <w:rPr>
-                <w:rFonts w:ascii="宋体" w:hAnsi="宋体" w:eastAsia="宋体"/>
+              <w:spacing w:after="40" w:line="288" w:lineRule="auto" w:before="40"/>
+            </w:pPr>
+            <w:r>
+              <w:rPr>
+                <w:rFonts w:ascii="Times New Roman" w:hAnsi="Times New Roman" w:eastAsia="宋体"/>
                 <w:b w:val="0"/>
                 <w:color w:val="000000"/>
                 <w:sz w:val="21"/>
@@ -3982,96 +4195,186 @@
           </w:p>
         </w:tc>
       </w:tr>
+      <w:tr>
+        <w:trPr/>
+        <w:tc>
+          <w:tcPr>
+            <w:tcW w:type="dxa" w:w="2551"/>
+            <w:tcBorders>
+              <w:top w:val="single" w:sz="4" w:color="D9D9D9"/>
+              <w:left w:val="single" w:sz="4" w:color="D9D9D9"/>
+              <w:bottom w:val="single" w:sz="4" w:color="D9D9D9"/>
+              <w:right w:val="single" w:sz="4" w:color="D9D9D9"/>
+            </w:tcBorders>
+          </w:tcPr>
+          <w:p>
+            <w:pPr>
+              <w:spacing w:line="288" w:lineRule="auto" w:after="40" w:before="40"/>
+            </w:pPr>
+            <w:r>
+              <w:rPr>
+                <w:rFonts w:ascii="Times New Roman" w:hAnsi="Times New Roman" w:eastAsia="宋体"/>
+                <w:b w:val="0"/>
+                <w:color w:val="000000"/>
+                <w:sz w:val="21"/>
+              </w:rPr>
+              <w:t>公开包白名单回归</w:t>
+            </w:r>
+          </w:p>
+        </w:tc>
+        <w:tc>
+          <w:tcPr>
+            <w:tcW w:type="dxa" w:w="6633"/>
+            <w:tcBorders>
+              <w:top w:val="single" w:sz="4" w:color="D9D9D9"/>
+              <w:left w:val="single" w:sz="4" w:color="D9D9D9"/>
+              <w:bottom w:val="single" w:sz="4" w:color="D9D9D9"/>
+              <w:right w:val="single" w:sz="4" w:color="D9D9D9"/>
+            </w:tcBorders>
+          </w:tcPr>
+          <w:p>
+            <w:pPr>
+              <w:spacing w:line="288" w:lineRule="auto" w:after="40" w:before="40"/>
+            </w:pPr>
+            <w:r>
+              <w:rPr>
+                <w:rFonts w:ascii="Times New Roman" w:hAnsi="Times New Roman" w:eastAsia="宋体"/>
+                <w:b w:val="0"/>
+                <w:color w:val="000000"/>
+                <w:sz w:val="21"/>
+              </w:rPr>
+              <w:t>无关JSON不进入ZIP，无私钥目录仍可复算相同汇总</w:t>
+            </w:r>
+          </w:p>
+        </w:tc>
+      </w:tr>
+      <w:tr>
+        <w:trPr/>
+        <w:tc>
+          <w:tcPr>
+            <w:tcW w:type="dxa" w:w="2551"/>
+            <w:tcBorders>
+              <w:top w:val="single" w:sz="4" w:color="D9D9D9"/>
+              <w:left w:val="single" w:sz="4" w:color="D9D9D9"/>
+              <w:bottom w:val="single" w:sz="4" w:color="D9D9D9"/>
+              <w:right w:val="single" w:sz="4" w:color="D9D9D9"/>
+            </w:tcBorders>
+          </w:tcPr>
+          <w:p>
+            <w:pPr>
+              <w:spacing w:line="288" w:lineRule="auto" w:after="40" w:before="40"/>
+            </w:pPr>
+            <w:r>
+              <w:rPr>
+                <w:rFonts w:ascii="Times New Roman" w:hAnsi="Times New Roman" w:eastAsia="宋体"/>
+                <w:b w:val="0"/>
+                <w:color w:val="000000"/>
+                <w:sz w:val="21"/>
+              </w:rPr>
+              <w:t>损坏输入回归</w:t>
+            </w:r>
+          </w:p>
+        </w:tc>
+        <w:tc>
+          <w:tcPr>
+            <w:tcW w:type="dxa" w:w="6633"/>
+            <w:tcBorders>
+              <w:top w:val="single" w:sz="4" w:color="D9D9D9"/>
+              <w:left w:val="single" w:sz="4" w:color="D9D9D9"/>
+              <w:bottom w:val="single" w:sz="4" w:color="D9D9D9"/>
+              <w:right w:val="single" w:sz="4" w:color="D9D9D9"/>
+            </w:tcBorders>
+          </w:tcPr>
+          <w:p>
+            <w:pPr>
+              <w:spacing w:line="288" w:lineRule="auto" w:after="40" w:before="40"/>
+            </w:pPr>
+            <w:r>
+              <w:rPr>
+                <w:rFonts w:ascii="Times New Roman" w:hAnsi="Times New Roman" w:eastAsia="宋体"/>
+                <w:b w:val="0"/>
+                <w:color w:val="000000"/>
+                <w:sz w:val="21"/>
+              </w:rPr>
+              <w:t>损坏JSON、空对象及布尔版本返回VoteError</w:t>
+            </w:r>
+          </w:p>
+        </w:tc>
+      </w:tr>
     </w:tbl>
     <w:p>
       <w:pPr>
+        <w:pStyle w:val="ReportH2"/>
+      </w:pPr>
+      <w:r>
+        <w:rPr>
+          <w:rFonts w:ascii="Times New Roman" w:hAnsi="Times New Roman" w:eastAsia="宋体"/>
+          <w:b/>
+          <w:color w:val="000000"/>
+          <w:sz w:val="24"/>
+        </w:rPr>
+        <w:t>5.2 失败案例与误报分析</w:t>
+      </w:r>
+    </w:p>
+    <w:p>
+      <w:pPr>
+        <w:pStyle w:val="ReportBody"/>
+      </w:pPr>
+      <w:r>
+        <w:t>界面复测：本轮在Windows原生Qt平台执行实际按钮点击，6票结果为[3,2,1]，随后篡改与删除演示均被检测。旧版线程等待处理在此次流程中继续有效；对应记录为ui/ui_smoke.json和截图。</w:t>
+      </w:r>
+    </w:p>
+    <w:p>
+      <w:pPr>
+        <w:pStyle w:val="ReportBody"/>
+      </w:pPr>
+      <w:r>
+        <w:rPr>
+          <w:rFonts w:ascii="Times New Roman" w:hAnsi="Times New Roman" w:eastAsia="宋体"/>
+          <w:b w:val="0"/>
+          <w:color w:val="000000"/>
+          <w:sz w:val="24"/>
+        </w:rPr>
+        <w:t>失败与误报：用户手动删除文件、同步工具造成文件暂时缺失，或跨文件写入中断，都可能触发同样的完整性告警。因此程序只说明数据不一致，不断言发生了恶意攻击；应恢复可信备份后再审计。</w:t>
+      </w:r>
+    </w:p>
+    <w:p>
+      <w:pPr>
+        <w:pStyle w:val="ReportBody"/>
+      </w:pPr>
+      <w:r>
+        <w:rPr>
+          <w:rFonts w:ascii="Times New Roman" w:hAnsi="Times New Roman" w:eastAsia="宋体"/>
+          <w:b w:val="0"/>
+          <w:color w:val="000000"/>
+          <w:sz w:val="24"/>
+        </w:rPr>
+        <w:t>边界：系统按单机单写入者设计。ID不是登录认证，公钥配置没有外部证书认证，整套历史状态回滚不受本地签名清单保护。默认公开导出包含ID和时间戳，演示使用虚构ID，实际使用需考虑元数据隐私。</w:t>
+      </w:r>
+    </w:p>
+    <w:p>
+      <w:pPr>
+        <w:pStyle w:val="ReportH2"/>
+      </w:pPr>
+      <w:r>
+        <w:t>5.3 性能数据与结果分析</w:t>
+      </w:r>
+    </w:p>
+    <w:p>
+      <w:pPr>
+        <w:pStyle w:val="ReportBody"/>
+      </w:pPr>
+      <w:r>
+        <w:t>对10、100、1000名投票者各做3次三选项实验。合成明文使用种子20261026加重复序号，密码学随机数不固定；每次均核对解密计数与预期。表3取本轮JSON中的算术平均值，单位毫秒。</w:t>
+      </w:r>
+    </w:p>
+    <w:p>
+      <w:pPr>
+        <w:pStyle w:val="ReportCaption"/>
         <w:keepNext/>
-        <w:spacing w:line="300" w:lineRule="auto" w:after="100"/>
-      </w:pPr>
-      <w:r>
-        <w:rPr>
-          <w:rFonts w:ascii="宋体" w:hAnsi="宋体" w:eastAsia="宋体"/>
-          <w:b/>
-          <w:color w:val="000000"/>
-          <w:sz w:val="24"/>
-        </w:rPr>
-        <w:t>5.2 失败案例与误报分析</w:t>
-      </w:r>
-    </w:p>
-    <w:p>
-      <w:pPr>
-        <w:spacing w:line="300" w:lineRule="auto" w:after="120"/>
-        <w:ind w:firstLine="480"/>
-      </w:pPr>
-      <w:r>
-        <w:rPr>
-          <w:rFonts w:ascii="宋体" w:hAnsi="宋体" w:eastAsia="宋体"/>
-          <w:b w:val="0"/>
-          <w:color w:val="000000"/>
-          <w:sz w:val="22"/>
-        </w:rPr>
-        <w:t>实际修复：源码界面测试出现连续任务切换竞态，修复后再次执行真实Qt控件点击、独立进程计票和两种审计演示，验证成功。界面证据保存为PNG和ui_smoke.json。</w:t>
-      </w:r>
-    </w:p>
-    <w:p>
-      <w:pPr>
-        <w:spacing w:line="300" w:lineRule="auto" w:after="120"/>
-        <w:ind w:firstLine="480"/>
-      </w:pPr>
-      <w:r>
-        <w:rPr>
-          <w:rFonts w:ascii="宋体" w:hAnsi="宋体" w:eastAsia="宋体"/>
-          <w:b w:val="0"/>
-          <w:color w:val="000000"/>
-          <w:sz w:val="22"/>
-        </w:rPr>
-        <w:t>失败与误报：用户手动删除文件、同步工具造成文件暂时缺失，或跨文件写入中断，都可能触发同样的完整性告警。因此程序只说明数据不一致，不断言发生了恶意攻击；应恢复可信备份后再审计。</w:t>
-      </w:r>
-    </w:p>
-    <w:p>
-      <w:pPr>
-        <w:spacing w:line="300" w:lineRule="auto" w:after="120"/>
-        <w:ind w:firstLine="480"/>
-      </w:pPr>
-      <w:r>
-        <w:rPr>
-          <w:rFonts w:ascii="宋体" w:hAnsi="宋体" w:eastAsia="宋体"/>
-          <w:b w:val="0"/>
-          <w:color w:val="000000"/>
-          <w:sz w:val="22"/>
-        </w:rPr>
-        <w:t>边界：系统按单机单写入者设计。ID不是登录认证，公钥配置没有外部证书认证，整套历史状态回滚不受本地签名清单保护。默认公开导出包含ID和时间戳，演示使用虚构ID，实际使用需考虑元数据隐私。</w:t>
-      </w:r>
-    </w:p>
-    <w:p>
-      <w:pPr>
-        <w:keepNext/>
-        <w:pageBreakBefore/>
-        <w:spacing w:line="300" w:lineRule="auto" w:after="160"/>
-      </w:pPr>
-      <w:r>
-        <w:rPr>
-          <w:rFonts w:ascii="宋体" w:hAnsi="宋体" w:eastAsia="宋体"/>
-          <w:b/>
-          <w:color w:val="000000"/>
-          <w:sz w:val="28"/>
-        </w:rPr>
-        <w:t>性能数据与结果分析</w:t>
-      </w:r>
-    </w:p>
-    <w:p>
-      <w:pPr>
-        <w:spacing w:line="300" w:lineRule="auto" w:after="100"/>
-        <w:ind w:firstLine="480"/>
-      </w:pPr>
-      <w:r>
-        <w:rPr>
-          <w:rFonts w:ascii="宋体" w:hAnsi="宋体" w:eastAsia="宋体"/>
-          <w:b w:val="0"/>
-          <w:color w:val="000000"/>
-          <w:sz w:val="22"/>
-        </w:rPr>
-        <w:t>对10、100、1000名投票者分别进行3次三选项实验。明文选项用固定种子20261026加重复序号生成，使预期总票可复算；密码学随机数保持系统随机。计时使用perf_counter，以下为三次算术平均，单位毫秒。</w:t>
+      </w:pPr>
+      <w:r>
+        <w:t>表3 加密 汇总与解密实测均值</w:t>
       </w:r>
     </w:p>
     <w:tbl>
@@ -4090,12 +4393,17 @@
       <w:tr>
         <w:trPr>
           <w:tblHeader/>
+          <w:tblHeader/>
         </w:trPr>
         <w:tc>
           <w:tcPr>
             <w:tcW w:type="dxa" w:w="1191"/>
             <w:vAlign w:val="center"/>
             <w:tcBorders>
+              <w:top w:val="single" w:sz="4" w:color="D9D9D9"/>
+              <w:left w:val="single" w:sz="4" w:color="D9D9D9"/>
+              <w:bottom w:val="single" w:sz="4" w:color="D9D9D9"/>
+              <w:right w:val="single" w:sz="4" w:color="D9D9D9"/>
               <w:top w:val="single" w:sz="4" w:color="D9D9D9"/>
               <w:left w:val="single" w:sz="4" w:color="D9D9D9"/>
               <w:bottom w:val="single" w:sz="4" w:color="D9D9D9"/>
@@ -4111,11 +4419,12 @@
           </w:tcPr>
           <w:p>
             <w:pPr>
-              <w:spacing w:after="40" w:line="264" w:lineRule="auto"/>
-            </w:pPr>
-            <w:r>
-              <w:rPr>
-                <w:rFonts w:ascii="宋体" w:hAnsi="宋体" w:eastAsia="宋体"/>
+              <w:keepNext/>
+              <w:spacing w:after="40" w:line="288" w:lineRule="auto" w:before="40"/>
+            </w:pPr>
+            <w:r>
+              <w:rPr>
+                <w:rFonts w:ascii="Times New Roman" w:hAnsi="Times New Roman" w:eastAsia="宋体"/>
                 <w:b/>
                 <w:color w:val="000000"/>
                 <w:sz w:val="21"/>
@@ -4129,6 +4438,10 @@
             <w:tcW w:type="dxa" w:w="2665"/>
             <w:vAlign w:val="center"/>
             <w:tcBorders>
+              <w:top w:val="single" w:sz="4" w:color="D9D9D9"/>
+              <w:left w:val="single" w:sz="4" w:color="D9D9D9"/>
+              <w:bottom w:val="single" w:sz="4" w:color="D9D9D9"/>
+              <w:right w:val="single" w:sz="4" w:color="D9D9D9"/>
               <w:top w:val="single" w:sz="4" w:color="D9D9D9"/>
               <w:left w:val="single" w:sz="4" w:color="D9D9D9"/>
               <w:bottom w:val="single" w:sz="4" w:color="D9D9D9"/>
@@ -4144,11 +4457,12 @@
           </w:tcPr>
           <w:p>
             <w:pPr>
-              <w:spacing w:after="40" w:line="264" w:lineRule="auto"/>
-            </w:pPr>
-            <w:r>
-              <w:rPr>
-                <w:rFonts w:ascii="宋体" w:hAnsi="宋体" w:eastAsia="宋体"/>
+              <w:keepNext/>
+              <w:spacing w:after="40" w:line="288" w:lineRule="auto" w:before="40"/>
+            </w:pPr>
+            <w:r>
+              <w:rPr>
+                <w:rFonts w:ascii="Times New Roman" w:hAnsi="Times New Roman" w:eastAsia="宋体"/>
                 <w:b/>
                 <w:color w:val="000000"/>
                 <w:sz w:val="21"/>
@@ -4162,6 +4476,10 @@
             <w:tcW w:type="dxa" w:w="2665"/>
             <w:vAlign w:val="center"/>
             <w:tcBorders>
+              <w:top w:val="single" w:sz="4" w:color="D9D9D9"/>
+              <w:left w:val="single" w:sz="4" w:color="D9D9D9"/>
+              <w:bottom w:val="single" w:sz="4" w:color="D9D9D9"/>
+              <w:right w:val="single" w:sz="4" w:color="D9D9D9"/>
               <w:top w:val="single" w:sz="4" w:color="D9D9D9"/>
               <w:left w:val="single" w:sz="4" w:color="D9D9D9"/>
               <w:bottom w:val="single" w:sz="4" w:color="D9D9D9"/>
@@ -4177,11 +4495,12 @@
           </w:tcPr>
           <w:p>
             <w:pPr>
-              <w:spacing w:after="40" w:line="264" w:lineRule="auto"/>
-            </w:pPr>
-            <w:r>
-              <w:rPr>
-                <w:rFonts w:ascii="宋体" w:hAnsi="宋体" w:eastAsia="宋体"/>
+              <w:keepNext/>
+              <w:spacing w:after="40" w:line="288" w:lineRule="auto" w:before="40"/>
+            </w:pPr>
+            <w:r>
+              <w:rPr>
+                <w:rFonts w:ascii="Times New Roman" w:hAnsi="Times New Roman" w:eastAsia="宋体"/>
                 <w:b/>
                 <w:color w:val="000000"/>
                 <w:sz w:val="21"/>
@@ -4195,6 +4514,10 @@
             <w:tcW w:type="dxa" w:w="2665"/>
             <w:vAlign w:val="center"/>
             <w:tcBorders>
+              <w:top w:val="single" w:sz="4" w:color="D9D9D9"/>
+              <w:left w:val="single" w:sz="4" w:color="D9D9D9"/>
+              <w:bottom w:val="single" w:sz="4" w:color="D9D9D9"/>
+              <w:right w:val="single" w:sz="4" w:color="D9D9D9"/>
               <w:top w:val="single" w:sz="4" w:color="D9D9D9"/>
               <w:left w:val="single" w:sz="4" w:color="D9D9D9"/>
               <w:bottom w:val="single" w:sz="4" w:color="D9D9D9"/>
@@ -4210,11 +4533,12 @@
           </w:tcPr>
           <w:p>
             <w:pPr>
-              <w:spacing w:after="40" w:line="264" w:lineRule="auto"/>
-            </w:pPr>
-            <w:r>
-              <w:rPr>
-                <w:rFonts w:ascii="宋体" w:hAnsi="宋体" w:eastAsia="宋体"/>
+              <w:keepNext/>
+              <w:spacing w:after="40" w:line="288" w:lineRule="auto" w:before="40"/>
+            </w:pPr>
+            <w:r>
+              <w:rPr>
+                <w:rFonts w:ascii="Times New Roman" w:hAnsi="Times New Roman" w:eastAsia="宋体"/>
                 <w:b/>
                 <w:color w:val="000000"/>
                 <w:sz w:val="21"/>
@@ -4225,11 +4549,16 @@
         </w:tc>
       </w:tr>
       <w:tr>
+        <w:trPr/>
         <w:tc>
           <w:tcPr>
             <w:tcW w:type="dxa" w:w="1191"/>
             <w:vAlign w:val="center"/>
             <w:tcBorders>
+              <w:top w:val="single" w:sz="4" w:color="D9D9D9"/>
+              <w:left w:val="single" w:sz="4" w:color="D9D9D9"/>
+              <w:bottom w:val="single" w:sz="4" w:color="D9D9D9"/>
+              <w:right w:val="single" w:sz="4" w:color="D9D9D9"/>
               <w:top w:val="single" w:sz="4" w:color="D9D9D9"/>
               <w:left w:val="single" w:sz="4" w:color="D9D9D9"/>
               <w:bottom w:val="single" w:sz="4" w:color="D9D9D9"/>
@@ -4244,11 +4573,12 @@
           </w:tcPr>
           <w:p>
             <w:pPr>
-              <w:spacing w:after="40" w:line="264" w:lineRule="auto"/>
-            </w:pPr>
-            <w:r>
-              <w:rPr>
-                <w:rFonts w:ascii="宋体" w:hAnsi="宋体" w:eastAsia="宋体"/>
+              <w:keepNext/>
+              <w:spacing w:line="288" w:lineRule="auto" w:after="40" w:before="40"/>
+            </w:pPr>
+            <w:r>
+              <w:rPr>
+                <w:rFonts w:ascii="Times New Roman" w:hAnsi="Times New Roman" w:eastAsia="宋体"/>
                 <w:b w:val="0"/>
                 <w:color w:val="000000"/>
                 <w:sz w:val="21"/>
@@ -4262,6 +4592,10 @@
             <w:tcW w:type="dxa" w:w="2665"/>
             <w:vAlign w:val="center"/>
             <w:tcBorders>
+              <w:top w:val="single" w:sz="4" w:color="D9D9D9"/>
+              <w:left w:val="single" w:sz="4" w:color="D9D9D9"/>
+              <w:bottom w:val="single" w:sz="4" w:color="D9D9D9"/>
+              <w:right w:val="single" w:sz="4" w:color="D9D9D9"/>
               <w:top w:val="single" w:sz="4" w:color="D9D9D9"/>
               <w:left w:val="single" w:sz="4" w:color="D9D9D9"/>
               <w:bottom w:val="single" w:sz="4" w:color="D9D9D9"/>
@@ -4276,16 +4610,17 @@
           </w:tcPr>
           <w:p>
             <w:pPr>
-              <w:spacing w:after="40" w:line="264" w:lineRule="auto"/>
-            </w:pPr>
-            <w:r>
-              <w:rPr>
-                <w:rFonts w:ascii="宋体" w:hAnsi="宋体" w:eastAsia="宋体"/>
+              <w:keepNext/>
+              <w:spacing w:line="288" w:lineRule="auto" w:after="40" w:before="40"/>
+            </w:pPr>
+            <w:r>
+              <w:rPr>
+                <w:rFonts w:ascii="Times New Roman" w:hAnsi="Times New Roman" w:eastAsia="宋体"/>
                 <w:b w:val="0"/>
                 <w:color w:val="000000"/>
                 <w:sz w:val="21"/>
               </w:rPr>
-              <w:t>230.19</w:t>
+              <w:t>538.06</w:t>
             </w:r>
           </w:p>
         </w:tc>
@@ -4294,6 +4629,10 @@
             <w:tcW w:type="dxa" w:w="2665"/>
             <w:vAlign w:val="center"/>
             <w:tcBorders>
+              <w:top w:val="single" w:sz="4" w:color="D9D9D9"/>
+              <w:left w:val="single" w:sz="4" w:color="D9D9D9"/>
+              <w:bottom w:val="single" w:sz="4" w:color="D9D9D9"/>
+              <w:right w:val="single" w:sz="4" w:color="D9D9D9"/>
               <w:top w:val="single" w:sz="4" w:color="D9D9D9"/>
               <w:left w:val="single" w:sz="4" w:color="D9D9D9"/>
               <w:bottom w:val="single" w:sz="4" w:color="D9D9D9"/>
@@ -4308,16 +4647,17 @@
           </w:tcPr>
           <w:p>
             <w:pPr>
-              <w:spacing w:after="40" w:line="264" w:lineRule="auto"/>
-            </w:pPr>
-            <w:r>
-              <w:rPr>
-                <w:rFonts w:ascii="宋体" w:hAnsi="宋体" w:eastAsia="宋体"/>
+              <w:keepNext/>
+              <w:spacing w:line="288" w:lineRule="auto" w:after="40" w:before="40"/>
+            </w:pPr>
+            <w:r>
+              <w:rPr>
+                <w:rFonts w:ascii="Times New Roman" w:hAnsi="Times New Roman" w:eastAsia="宋体"/>
                 <w:b w:val="0"/>
                 <w:color w:val="000000"/>
                 <w:sz w:val="21"/>
               </w:rPr>
-              <w:t>0.84</w:t>
+              <w:t>1.21</w:t>
             </w:r>
           </w:p>
         </w:tc>
@@ -4326,6 +4666,10 @@
             <w:tcW w:type="dxa" w:w="2665"/>
             <w:vAlign w:val="center"/>
             <w:tcBorders>
+              <w:top w:val="single" w:sz="4" w:color="D9D9D9"/>
+              <w:left w:val="single" w:sz="4" w:color="D9D9D9"/>
+              <w:bottom w:val="single" w:sz="4" w:color="D9D9D9"/>
+              <w:right w:val="single" w:sz="4" w:color="D9D9D9"/>
               <w:top w:val="single" w:sz="4" w:color="D9D9D9"/>
               <w:left w:val="single" w:sz="4" w:color="D9D9D9"/>
               <w:bottom w:val="single" w:sz="4" w:color="D9D9D9"/>
@@ -4340,26 +4684,32 @@
           </w:tcPr>
           <w:p>
             <w:pPr>
-              <w:spacing w:after="40" w:line="264" w:lineRule="auto"/>
-            </w:pPr>
-            <w:r>
-              <w:rPr>
-                <w:rFonts w:ascii="宋体" w:hAnsi="宋体" w:eastAsia="宋体"/>
+              <w:keepNext/>
+              <w:spacing w:line="288" w:lineRule="auto" w:after="40" w:before="40"/>
+            </w:pPr>
+            <w:r>
+              <w:rPr>
+                <w:rFonts w:ascii="Times New Roman" w:hAnsi="Times New Roman" w:eastAsia="宋体"/>
                 <w:b w:val="0"/>
                 <w:color w:val="000000"/>
                 <w:sz w:val="21"/>
               </w:rPr>
-              <w:t>6.21</w:t>
+              <w:t>16.72</w:t>
             </w:r>
           </w:p>
         </w:tc>
       </w:tr>
       <w:tr>
+        <w:trPr/>
         <w:tc>
           <w:tcPr>
             <w:tcW w:type="dxa" w:w="1191"/>
             <w:vAlign w:val="center"/>
             <w:tcBorders>
+              <w:top w:val="single" w:sz="4" w:color="D9D9D9"/>
+              <w:left w:val="single" w:sz="4" w:color="D9D9D9"/>
+              <w:bottom w:val="single" w:sz="4" w:color="D9D9D9"/>
+              <w:right w:val="single" w:sz="4" w:color="D9D9D9"/>
               <w:top w:val="single" w:sz="4" w:color="D9D9D9"/>
               <w:left w:val="single" w:sz="4" w:color="D9D9D9"/>
               <w:bottom w:val="single" w:sz="4" w:color="D9D9D9"/>
@@ -4374,11 +4724,12 @@
           </w:tcPr>
           <w:p>
             <w:pPr>
-              <w:spacing w:after="40" w:line="264" w:lineRule="auto"/>
-            </w:pPr>
-            <w:r>
-              <w:rPr>
-                <w:rFonts w:ascii="宋体" w:hAnsi="宋体" w:eastAsia="宋体"/>
+              <w:keepNext/>
+              <w:spacing w:line="288" w:lineRule="auto" w:after="40" w:before="40"/>
+            </w:pPr>
+            <w:r>
+              <w:rPr>
+                <w:rFonts w:ascii="Times New Roman" w:hAnsi="Times New Roman" w:eastAsia="宋体"/>
                 <w:b w:val="0"/>
                 <w:color w:val="000000"/>
                 <w:sz w:val="21"/>
@@ -4392,6 +4743,10 @@
             <w:tcW w:type="dxa" w:w="2665"/>
             <w:vAlign w:val="center"/>
             <w:tcBorders>
+              <w:top w:val="single" w:sz="4" w:color="D9D9D9"/>
+              <w:left w:val="single" w:sz="4" w:color="D9D9D9"/>
+              <w:bottom w:val="single" w:sz="4" w:color="D9D9D9"/>
+              <w:right w:val="single" w:sz="4" w:color="D9D9D9"/>
               <w:top w:val="single" w:sz="4" w:color="D9D9D9"/>
               <w:left w:val="single" w:sz="4" w:color="D9D9D9"/>
               <w:bottom w:val="single" w:sz="4" w:color="D9D9D9"/>
@@ -4406,16 +4761,17 @@
           </w:tcPr>
           <w:p>
             <w:pPr>
-              <w:spacing w:after="40" w:line="264" w:lineRule="auto"/>
-            </w:pPr>
-            <w:r>
-              <w:rPr>
-                <w:rFonts w:ascii="宋体" w:hAnsi="宋体" w:eastAsia="宋体"/>
+              <w:keepNext/>
+              <w:spacing w:line="288" w:lineRule="auto" w:after="40" w:before="40"/>
+            </w:pPr>
+            <w:r>
+              <w:rPr>
+                <w:rFonts w:ascii="Times New Roman" w:hAnsi="Times New Roman" w:eastAsia="宋体"/>
                 <w:b w:val="0"/>
                 <w:color w:val="000000"/>
                 <w:sz w:val="21"/>
               </w:rPr>
-              <w:t>2438.30</w:t>
+              <w:t>5345.25</w:t>
             </w:r>
           </w:p>
         </w:tc>
@@ -4424,6 +4780,10 @@
             <w:tcW w:type="dxa" w:w="2665"/>
             <w:vAlign w:val="center"/>
             <w:tcBorders>
+              <w:top w:val="single" w:sz="4" w:color="D9D9D9"/>
+              <w:left w:val="single" w:sz="4" w:color="D9D9D9"/>
+              <w:bottom w:val="single" w:sz="4" w:color="D9D9D9"/>
+              <w:right w:val="single" w:sz="4" w:color="D9D9D9"/>
               <w:top w:val="single" w:sz="4" w:color="D9D9D9"/>
               <w:left w:val="single" w:sz="4" w:color="D9D9D9"/>
               <w:bottom w:val="single" w:sz="4" w:color="D9D9D9"/>
@@ -4438,16 +4798,17 @@
           </w:tcPr>
           <w:p>
             <w:pPr>
-              <w:spacing w:after="40" w:line="264" w:lineRule="auto"/>
-            </w:pPr>
-            <w:r>
-              <w:rPr>
-                <w:rFonts w:ascii="宋体" w:hAnsi="宋体" w:eastAsia="宋体"/>
+              <w:keepNext/>
+              <w:spacing w:line="288" w:lineRule="auto" w:after="40" w:before="40"/>
+            </w:pPr>
+            <w:r>
+              <w:rPr>
+                <w:rFonts w:ascii="Times New Roman" w:hAnsi="Times New Roman" w:eastAsia="宋体"/>
                 <w:b w:val="0"/>
                 <w:color w:val="000000"/>
                 <w:sz w:val="21"/>
               </w:rPr>
-              <w:t>11.11</w:t>
+              <w:t>16.13</w:t>
             </w:r>
           </w:p>
         </w:tc>
@@ -4456,6 +4817,10 @@
             <w:tcW w:type="dxa" w:w="2665"/>
             <w:vAlign w:val="center"/>
             <w:tcBorders>
+              <w:top w:val="single" w:sz="4" w:color="D9D9D9"/>
+              <w:left w:val="single" w:sz="4" w:color="D9D9D9"/>
+              <w:bottom w:val="single" w:sz="4" w:color="D9D9D9"/>
+              <w:right w:val="single" w:sz="4" w:color="D9D9D9"/>
               <w:top w:val="single" w:sz="4" w:color="D9D9D9"/>
               <w:left w:val="single" w:sz="4" w:color="D9D9D9"/>
               <w:bottom w:val="single" w:sz="4" w:color="D9D9D9"/>
@@ -4470,26 +4835,32 @@
           </w:tcPr>
           <w:p>
             <w:pPr>
-              <w:spacing w:after="40" w:line="264" w:lineRule="auto"/>
-            </w:pPr>
-            <w:r>
-              <w:rPr>
-                <w:rFonts w:ascii="宋体" w:hAnsi="宋体" w:eastAsia="宋体"/>
+              <w:keepNext/>
+              <w:spacing w:line="288" w:lineRule="auto" w:after="40" w:before="40"/>
+            </w:pPr>
+            <w:r>
+              <w:rPr>
+                <w:rFonts w:ascii="Times New Roman" w:hAnsi="Times New Roman" w:eastAsia="宋体"/>
                 <w:b w:val="0"/>
                 <w:color w:val="000000"/>
                 <w:sz w:val="21"/>
               </w:rPr>
-              <w:t>7.86</w:t>
+              <w:t>19.20</w:t>
             </w:r>
           </w:p>
         </w:tc>
       </w:tr>
       <w:tr>
+        <w:trPr/>
         <w:tc>
           <w:tcPr>
             <w:tcW w:type="dxa" w:w="1191"/>
             <w:vAlign w:val="center"/>
             <w:tcBorders>
+              <w:top w:val="single" w:sz="4" w:color="D9D9D9"/>
+              <w:left w:val="single" w:sz="4" w:color="D9D9D9"/>
+              <w:bottom w:val="single" w:sz="4" w:color="D9D9D9"/>
+              <w:right w:val="single" w:sz="4" w:color="D9D9D9"/>
               <w:top w:val="single" w:sz="4" w:color="D9D9D9"/>
               <w:left w:val="single" w:sz="4" w:color="D9D9D9"/>
               <w:bottom w:val="single" w:sz="4" w:color="D9D9D9"/>
@@ -4504,11 +4875,12 @@
           </w:tcPr>
           <w:p>
             <w:pPr>
-              <w:spacing w:after="40" w:line="264" w:lineRule="auto"/>
-            </w:pPr>
-            <w:r>
-              <w:rPr>
-                <w:rFonts w:ascii="宋体" w:hAnsi="宋体" w:eastAsia="宋体"/>
+              <w:keepNext w:val="0"/>
+              <w:spacing w:line="288" w:lineRule="auto" w:after="40" w:before="40"/>
+            </w:pPr>
+            <w:r>
+              <w:rPr>
+                <w:rFonts w:ascii="Times New Roman" w:hAnsi="Times New Roman" w:eastAsia="宋体"/>
                 <w:b w:val="0"/>
                 <w:color w:val="000000"/>
                 <w:sz w:val="21"/>
@@ -4522,6 +4894,10 @@
             <w:tcW w:type="dxa" w:w="2665"/>
             <w:vAlign w:val="center"/>
             <w:tcBorders>
+              <w:top w:val="single" w:sz="4" w:color="D9D9D9"/>
+              <w:left w:val="single" w:sz="4" w:color="D9D9D9"/>
+              <w:bottom w:val="single" w:sz="4" w:color="D9D9D9"/>
+              <w:right w:val="single" w:sz="4" w:color="D9D9D9"/>
               <w:top w:val="single" w:sz="4" w:color="D9D9D9"/>
               <w:left w:val="single" w:sz="4" w:color="D9D9D9"/>
               <w:bottom w:val="single" w:sz="4" w:color="D9D9D9"/>
@@ -4536,16 +4912,17 @@
           </w:tcPr>
           <w:p>
             <w:pPr>
-              <w:spacing w:after="40" w:line="264" w:lineRule="auto"/>
-            </w:pPr>
-            <w:r>
-              <w:rPr>
-                <w:rFonts w:ascii="宋体" w:hAnsi="宋体" w:eastAsia="宋体"/>
+              <w:keepNext w:val="0"/>
+              <w:spacing w:line="288" w:lineRule="auto" w:after="40" w:before="40"/>
+            </w:pPr>
+            <w:r>
+              <w:rPr>
+                <w:rFonts w:ascii="Times New Roman" w:hAnsi="Times New Roman" w:eastAsia="宋体"/>
                 <w:b w:val="0"/>
                 <w:color w:val="000000"/>
                 <w:sz w:val="21"/>
               </w:rPr>
-              <w:t>28512.22</w:t>
+              <w:t>46302.62</w:t>
             </w:r>
           </w:p>
         </w:tc>
@@ -4554,6 +4931,10 @@
             <w:tcW w:type="dxa" w:w="2665"/>
             <w:vAlign w:val="center"/>
             <w:tcBorders>
+              <w:top w:val="single" w:sz="4" w:color="D9D9D9"/>
+              <w:left w:val="single" w:sz="4" w:color="D9D9D9"/>
+              <w:bottom w:val="single" w:sz="4" w:color="D9D9D9"/>
+              <w:right w:val="single" w:sz="4" w:color="D9D9D9"/>
               <w:top w:val="single" w:sz="4" w:color="D9D9D9"/>
               <w:left w:val="single" w:sz="4" w:color="D9D9D9"/>
               <w:bottom w:val="single" w:sz="4" w:color="D9D9D9"/>
@@ -4568,16 +4949,17 @@
           </w:tcPr>
           <w:p>
             <w:pPr>
-              <w:spacing w:after="40" w:line="264" w:lineRule="auto"/>
-            </w:pPr>
-            <w:r>
-              <w:rPr>
-                <w:rFonts w:ascii="宋体" w:hAnsi="宋体" w:eastAsia="宋体"/>
+              <w:keepNext w:val="0"/>
+              <w:spacing w:line="288" w:lineRule="auto" w:after="40" w:before="40"/>
+            </w:pPr>
+            <w:r>
+              <w:rPr>
+                <w:rFonts w:ascii="Times New Roman" w:hAnsi="Times New Roman" w:eastAsia="宋体"/>
                 <w:b w:val="0"/>
                 <w:color w:val="000000"/>
                 <w:sz w:val="21"/>
               </w:rPr>
-              <w:t>98.68</w:t>
+              <w:t>110.80</w:t>
             </w:r>
           </w:p>
         </w:tc>
@@ -4586,6 +4968,10 @@
             <w:tcW w:type="dxa" w:w="2665"/>
             <w:vAlign w:val="center"/>
             <w:tcBorders>
+              <w:top w:val="single" w:sz="4" w:color="D9D9D9"/>
+              <w:left w:val="single" w:sz="4" w:color="D9D9D9"/>
+              <w:bottom w:val="single" w:sz="4" w:color="D9D9D9"/>
+              <w:right w:val="single" w:sz="4" w:color="D9D9D9"/>
               <w:top w:val="single" w:sz="4" w:color="D9D9D9"/>
               <w:left w:val="single" w:sz="4" w:color="D9D9D9"/>
               <w:bottom w:val="single" w:sz="4" w:color="D9D9D9"/>
@@ -4600,16 +4986,17 @@
           </w:tcPr>
           <w:p>
             <w:pPr>
-              <w:spacing w:after="40" w:line="264" w:lineRule="auto"/>
-            </w:pPr>
-            <w:r>
-              <w:rPr>
-                <w:rFonts w:ascii="宋体" w:hAnsi="宋体" w:eastAsia="宋体"/>
+              <w:keepNext w:val="0"/>
+              <w:spacing w:line="288" w:lineRule="auto" w:after="40" w:before="40"/>
+            </w:pPr>
+            <w:r>
+              <w:rPr>
+                <w:rFonts w:ascii="Times New Roman" w:hAnsi="Times New Roman" w:eastAsia="宋体"/>
                 <w:b w:val="0"/>
                 <w:color w:val="000000"/>
                 <w:sz w:val="21"/>
               </w:rPr>
-              <w:t>6.47</w:t>
+              <w:t>11.96</w:t>
             </w:r>
           </w:p>
         </w:tc>
@@ -4617,327 +5004,284 @@
     </w:tbl>
     <w:p>
       <w:pPr>
-        <w:spacing w:line="300" w:lineRule="auto" w:after="100"/>
-        <w:ind w:firstLine="480"/>
-      </w:pPr>
-      <w:r>
-        <w:rPr>
-          <w:rFonts w:ascii="宋体" w:hAnsi="宋体" w:eastAsia="宋体"/>
+        <w:pStyle w:val="ReportBody"/>
+      </w:pPr>
+      <w:r>
+        <w:t>计时仅覆盖Paillier原语，不包括文件、签名、口令派生、进程及GUI；界面耗时则来自当前轮次的实际审计和解密端复算，二者口径不同。测试期间计算机有其他任务，三次原始记录保存在JSON中，均值不能当作部署保证。</w:t>
+      </w:r>
+    </w:p>
+    <w:p>
+      <w:pPr>
+        <w:pStyle w:val="ReportBody"/>
+      </w:pPr>
+      <w:r>
+        <w:rPr>
+          <w:rFonts w:ascii="Times New Roman" w:hAnsi="Times New Roman" w:eastAsia="宋体"/>
           <w:b w:val="0"/>
           <w:color w:val="000000"/>
-          <w:sz w:val="22"/>
-        </w:rPr>
-        <w:t>计时范围仅包含Paillier原语，不包括文件读写、清单签名、口令派生、进程启动和GUI刷新。结果反映本机当时负载，测试期间并非独占计算机；原始三次记录完整保留，不能将均值直接当作部署性能保证。</w:t>
-      </w:r>
-    </w:p>
-    <w:p>
-      <w:pPr>
-        <w:spacing w:line="300" w:lineRule="auto" w:after="100"/>
-        <w:ind w:firstLine="480"/>
-      </w:pPr>
-      <w:r>
-        <w:rPr>
-          <w:rFonts w:ascii="宋体" w:hAnsi="宋体" w:eastAsia="宋体"/>
+          <w:sz w:val="24"/>
+        </w:rPr>
+        <w:t>系统的额外价值在于解释“已接收的密文集合是否仍与签名清单一致”。摘要比对本身不能证明身份，清单签名也不能证明选票内容合法。完整回滚实验故意恢复旧清单并删除之后的选票，审计仍通过；这表明需要外部保存的最新检查点或独立见证才能识别回滚。</w:t>
+      </w:r>
+    </w:p>
+    <w:p>
+      <w:pPr>
+        <w:pStyle w:val="ReportH2"/>
+      </w:pPr>
+      <w:r>
+        <w:t>5.4 准确性与可重复性</w:t>
+      </w:r>
+    </w:p>
+    <w:p>
+      <w:pPr>
+        <w:pStyle w:val="ReportBody"/>
+      </w:pPr>
+      <w:r>
+        <w:t>基准6票序列[0,1,0,2,0,1]得到[3,2,1]；2、4、8选项各投一票均得到全1向量，零票返回全0。原生Qt测试记录在evidence/2026-10-27/ui/，验证6次控件投票、子进程计票和两种审计演示。图2采用本轮实际截图。</w:t>
+      </w:r>
+    </w:p>
+    <w:p>
+      <w:pPr>
+        <w:pStyle w:val="ReportH2"/>
+      </w:pPr>
+      <w:r>
+        <w:t>5.5 本轮发现的问题与处理</w:t>
+      </w:r>
+    </w:p>
+    <w:p>
+      <w:pPr>
+        <w:pStyle w:val="ReportBody"/>
+      </w:pPr>
+      <w:r>
+        <w:t>公开导出原先递归收集public下的全部JSON。复现时在该目录加入accidental-secret.json，文件也进入ZIP。修复后仅导出config.json、manifest.json和签名清单列出的选票；额外顶层JSON与备份子目录不再外发。另将损坏JSON、布尔版本号和空对象改为明确拒绝，并使选票子目录中的未登记文件触发审计失败。</w:t>
+      </w:r>
+    </w:p>
+    <w:p>
+      <w:pPr>
+        <w:pStyle w:val="ReportH1"/>
+      </w:pPr>
+      <w:r>
+        <w:rPr>
+          <w:rFonts w:ascii="Times New Roman" w:hAnsi="Times New Roman" w:eastAsia="宋体"/>
+          <w:b/>
+          <w:color w:val="000000"/>
+          <w:sz w:val="28"/>
+        </w:rPr>
+        <w:t>六、总结</w:t>
+      </w:r>
+    </w:p>
+    <w:p>
+      <w:pPr>
+        <w:pStyle w:val="ReportBody"/>
+      </w:pPr>
+      <w:r>
+        <w:rPr>
+          <w:rFonts w:ascii="Times New Roman" w:hAnsi="Times New Roman" w:eastAsia="宋体"/>
           <w:b w:val="0"/>
           <w:color w:val="000000"/>
           <w:sz w:val="24"/>
         </w:rPr>
-        <w:t>系统的额外价值在于解释“已接收的密文集合是否仍与签名清单一致”。摘要比对本身不能证明身份，清单签名也不能证明选票内容合法。完整回滚实验故意恢复旧清单并删除之后的选票，审计仍通过；这表明需要外部保存的最新检查点或独立见证才能识别回滚。</w:t>
-      </w:r>
-    </w:p>
-    <w:p>
-      <w:pPr>
-        <w:keepNext/>
-        <w:spacing w:line="300" w:lineRule="auto" w:after="100"/>
-      </w:pPr>
-      <w:r>
-        <w:rPr>
-          <w:rFonts w:ascii="宋体" w:hAnsi="宋体" w:eastAsia="宋体"/>
+        <w:t>本模块把密码学操作组织为可检查的桌面流程，额外提供关闭投票和签名清单审计，并让用户可视化观察失败案例。后续工作应优先补充独立审计检查点、真实身份认证和事务化存储，而不是仅增加界面按钮。</w:t>
+      </w:r>
+    </w:p>
+    <w:p>
+      <w:pPr>
+        <w:pStyle w:val="ReportH2"/>
+      </w:pPr>
+      <w:r>
+        <w:rPr>
+          <w:rFonts w:ascii="Times New Roman" w:hAnsi="Times New Roman" w:eastAsia="宋体"/>
           <w:b/>
           <w:color w:val="000000"/>
           <w:sz w:val="24"/>
         </w:rPr>
-        <w:t>准确性与可重复性</w:t>
-      </w:r>
-    </w:p>
-    <w:p>
-      <w:pPr>
-        <w:spacing w:line="300" w:lineRule="auto" w:after="100"/>
-        <w:ind w:firstLine="480"/>
-      </w:pPr>
-      <w:r>
-        <w:rPr>
-          <w:rFonts w:ascii="宋体" w:hAnsi="宋体" w:eastAsia="宋体"/>
+        <w:t>6.1 安全局限与后续改进</w:t>
+      </w:r>
+    </w:p>
+    <w:p>
+      <w:pPr>
+        <w:pStyle w:val="ReportBody"/>
+      </w:pPr>
+      <w:r>
+        <w:rPr>
+          <w:rFonts w:ascii="Times New Roman" w:hAnsi="Times New Roman" w:eastAsia="宋体"/>
           <w:b w:val="0"/>
           <w:color w:val="000000"/>
-          <w:sz w:val="22"/>
-        </w:rPr>
-        <w:t>基准6票的选择序列为[0,1,0,2,0,1]，实测结果[3,2,1]；四选项实验每项一票，实测[1,1,1,1]。每次性能实验均比较解密结果与合成明文的计数。GUI测试使用实际Qt控件点击，并验证独立子进程返回的结果与审计演示；程序截图不是绘制的效果图。</w:t>
-      </w:r>
-    </w:p>
-    <w:p>
-      <w:pPr>
-        <w:keepNext/>
-        <w:spacing w:line="300" w:lineRule="auto" w:after="100"/>
-      </w:pPr>
-      <w:r>
-        <w:rPr>
-          <w:rFonts w:ascii="宋体" w:hAnsi="宋体" w:eastAsia="宋体"/>
+          <w:sz w:val="24"/>
+        </w:rPr>
+        <w:t>系统未实现零知识证明、门限解密、证书认证及完整状态回滚保护。名单ID不是身份认证；私钥持有者能在程序之外解密单票；小群体结果可能暴露个体偏好。签名验证依赖最初可信配置，攻击者若同时替换所有配置、密钥与历史数据，本地应用无法自行建立原始信任。单文件原子写入不等于跨文件事务，当前只支持单机单写入者。</w:t>
+      </w:r>
+    </w:p>
+    <w:p>
+      <w:pPr>
+        <w:pStyle w:val="ReportH2"/>
+      </w:pPr>
+      <w:r>
+        <w:rPr>
+          <w:rFonts w:ascii="Times New Roman" w:hAnsi="Times New Roman" w:eastAsia="宋体"/>
           <w:b/>
           <w:color w:val="000000"/>
           <w:sz w:val="24"/>
         </w:rPr>
-        <w:t>额外功能的实际意义</w:t>
-      </w:r>
-    </w:p>
-    <w:p>
-      <w:pPr>
-        <w:spacing w:line="300" w:lineRule="auto" w:after="100"/>
-        <w:ind w:firstLine="480"/>
-      </w:pPr>
-      <w:r>
-        <w:rPr>
-          <w:rFonts w:ascii="宋体" w:hAnsi="宋体" w:eastAsia="宋体"/>
+        <w:t>6.2 分工验收与口试准备</w:t>
+      </w:r>
+    </w:p>
+    <w:p>
+      <w:pPr>
+        <w:pStyle w:val="ReportBody"/>
+      </w:pPr>
+      <w:r>
+        <w:rPr>
+          <w:rFonts w:ascii="Times New Roman" w:hAnsi="Times New Roman" w:eastAsia="宋体"/>
           <w:b w:val="0"/>
           <w:color w:val="000000"/>
-          <w:sz w:val="22"/>
-        </w:rPr>
-        <w:t>关闭状态阻止继续接收选票和开放期计票；签名清单把已接收文件集合与摘要绑定起来。修改密文、删除选票、添加额外文件、修改配置或清单都会导致拒绝。临时副本演示便于现场复现，原始数据不会因此改变。</w:t>
-      </w:r>
-    </w:p>
-    <w:p>
-      <w:pPr>
-        <w:keepNext/>
-        <w:pageBreakBefore/>
-        <w:spacing w:line="300" w:lineRule="auto" w:after="160"/>
-      </w:pPr>
-      <w:r>
-        <w:rPr>
-          <w:rFonts w:ascii="宋体" w:hAnsi="宋体" w:eastAsia="宋体"/>
+          <w:sz w:val="24"/>
+        </w:rPr>
+        <w:t>为什么只存SHA-256不够？攻击者可同时改文件与摘要，需签名和可信公钥。</w:t>
+      </w:r>
+    </w:p>
+    <w:p>
+      <w:pPr>
+        <w:pStyle w:val="ReportBody"/>
+      </w:pPr>
+      <w:r>
+        <w:rPr>
+          <w:rFonts w:ascii="Times New Roman" w:hAnsi="Times New Roman" w:eastAsia="宋体"/>
+          <w:b w:val="0"/>
+          <w:color w:val="000000"/>
+          <w:sz w:val="24"/>
+        </w:rPr>
+        <w:t>为什么删除文件也能发现？签名清单仍保留应存在的文件记录。</w:t>
+      </w:r>
+    </w:p>
+    <w:p>
+      <w:pPr>
+        <w:pStyle w:val="ReportBody"/>
+      </w:pPr>
+      <w:r>
+        <w:rPr>
+          <w:rFonts w:ascii="Times New Roman" w:hAnsi="Times New Roman" w:eastAsia="宋体"/>
+          <w:b w:val="0"/>
+          <w:color w:val="000000"/>
+          <w:sz w:val="24"/>
+        </w:rPr>
+        <w:t>为什么整套回滚不能发现？旧清单签名仍有效，本地缺少可信的最新状态锚点。</w:t>
+      </w:r>
+    </w:p>
+    <w:p>
+      <w:pPr>
+        <w:pStyle w:val="ReportBody"/>
+      </w:pPr>
+      <w:r>
+        <w:rPr>
+          <w:rFonts w:ascii="Times New Roman" w:hAnsi="Times New Roman" w:eastAsia="宋体"/>
+          <w:b w:val="0"/>
+          <w:color w:val="000000"/>
+          <w:sz w:val="24"/>
+        </w:rPr>
+        <w:t>个人验收建议：在自己电脑上重新运行本模块实验，保存截图和测试记录；现场修改一个参数或校验条件，说明修改影响；根据真实参与情况补全姓名、学号与个人总结。</w:t>
+      </w:r>
+    </w:p>
+    <w:p>
+      <w:pPr>
+        <w:pStyle w:val="ReportH2"/>
+      </w:pPr>
+      <w:r>
+        <w:rPr>
+          <w:rFonts w:ascii="Times New Roman" w:hAnsi="Times New Roman" w:eastAsia="宋体"/>
           <w:b/>
           <w:color w:val="000000"/>
-          <w:sz w:val="28"/>
-        </w:rPr>
-        <w:t>六 总结</w:t>
-      </w:r>
-    </w:p>
-    <w:p>
-      <w:pPr>
-        <w:spacing w:line="300" w:lineRule="auto" w:after="100"/>
-        <w:ind w:firstLine="480"/>
-      </w:pPr>
-      <w:r>
-        <w:rPr>
-          <w:rFonts w:ascii="宋体" w:hAnsi="宋体" w:eastAsia="宋体"/>
+          <w:sz w:val="24"/>
+        </w:rPr>
+        <w:t>6.3 AI使用声明</w:t>
+      </w:r>
+    </w:p>
+    <w:p>
+      <w:pPr>
+        <w:pStyle w:val="ReportBody"/>
+      </w:pPr>
+      <w:r>
+        <w:t>本次使用OpenAI Codex辅助审查代码、修订报告、执行实验和拆分Git提交。初稿与本轮修改均有仓库记录，AI参与范围详见根目录AI使用声明.txt。A/B/C为模块责任标识，学生需据真实贡献补全个人信息和复核记录，并独立解释代码。</w:t>
+      </w:r>
+    </w:p>
+    <w:p>
+      <w:pPr>
+        <w:pStyle w:val="ReportH2"/>
+      </w:pPr>
+      <w:r>
+        <w:rPr>
+          <w:rFonts w:ascii="Times New Roman" w:hAnsi="Times New Roman" w:eastAsia="宋体"/>
+          <w:b/>
+          <w:color w:val="000000"/>
+          <w:sz w:val="24"/>
+        </w:rPr>
+        <w:t>参考资料</w:t>
+      </w:r>
+    </w:p>
+    <w:p>
+      <w:pPr>
+        <w:pStyle w:val="ReportBody"/>
+        <w:spacing w:line="288" w:lineRule="auto"/>
+        <w:ind w:firstLine="0"/>
+        <w:jc w:val="left"/>
+      </w:pPr>
+      <w:r>
+        <w:rPr>
+          <w:rFonts w:ascii="Times New Roman" w:hAnsi="Times New Roman" w:eastAsia="宋体"/>
           <w:b w:val="0"/>
           <w:color w:val="000000"/>
-          <w:sz w:val="24"/>
-        </w:rPr>
-        <w:t>本模块把密码学操作组织为可检查的桌面流程，额外提供关闭投票和签名清单审计，并让用户可视化观察失败案例。后续工作应优先补充独立审计检查点、真实身份认证和事务化存储，而不是仅增加界面按钮。</w:t>
-      </w:r>
-    </w:p>
-    <w:p>
-      <w:pPr>
-        <w:keepNext/>
-        <w:spacing w:line="300" w:lineRule="auto" w:after="100"/>
-      </w:pPr>
-      <w:r>
-        <w:rPr>
-          <w:rFonts w:ascii="宋体" w:hAnsi="宋体" w:eastAsia="宋体"/>
-          <w:b/>
-          <w:color w:val="000000"/>
-          <w:sz w:val="24"/>
-        </w:rPr>
-        <w:t>6.1 安全局限与后续改进</w:t>
-      </w:r>
-    </w:p>
-    <w:p>
-      <w:pPr>
-        <w:spacing w:line="300" w:lineRule="auto" w:after="100"/>
-        <w:ind w:firstLine="480"/>
-      </w:pPr>
-      <w:r>
-        <w:rPr>
-          <w:rFonts w:ascii="宋体" w:hAnsi="宋体" w:eastAsia="宋体"/>
+          <w:sz w:val="21"/>
+        </w:rPr>
+        <w:t>[1] 专业课程设计任务书 B230414 2026—2027第一学期。</w:t>
+      </w:r>
+    </w:p>
+    <w:p>
+      <w:pPr>
+        <w:pStyle w:val="ReportBody"/>
+        <w:spacing w:line="288" w:lineRule="auto"/>
+        <w:ind w:firstLine="0"/>
+        <w:jc w:val="left"/>
+      </w:pPr>
+      <w:r>
+        <w:rPr>
+          <w:rFonts w:ascii="Times New Roman" w:hAnsi="Times New Roman" w:eastAsia="宋体"/>
           <w:b w:val="0"/>
           <w:color w:val="000000"/>
-          <w:sz w:val="24"/>
-        </w:rPr>
-        <w:t>系统未实现零知识证明、门限解密、证书认证及完整状态回滚保护。名单ID不是身份认证；私钥持有者能在程序之外解密单票；小群体结果可能暴露个体偏好。签名验证依赖最初可信配置，攻击者若同时替换所有配置、密钥与历史数据，本地应用无法自行建立原始信任。单文件原子写入不等于跨文件事务，当前只支持单机单写入者。</w:t>
-      </w:r>
-    </w:p>
-    <w:p>
-      <w:pPr>
-        <w:keepNext/>
-        <w:spacing w:line="300" w:lineRule="auto" w:after="100"/>
-      </w:pPr>
-      <w:r>
-        <w:rPr>
-          <w:rFonts w:ascii="宋体" w:hAnsi="宋体" w:eastAsia="宋体"/>
-          <w:b/>
-          <w:color w:val="000000"/>
-          <w:sz w:val="24"/>
-        </w:rPr>
-        <w:t>6.2 分工验收与口试准备</w:t>
-      </w:r>
-    </w:p>
-    <w:p>
-      <w:pPr>
-        <w:spacing w:line="300" w:lineRule="auto" w:after="100"/>
-        <w:ind w:firstLine="480"/>
-      </w:pPr>
-      <w:r>
-        <w:rPr>
-          <w:rFonts w:ascii="宋体" w:hAnsi="宋体" w:eastAsia="宋体"/>
+          <w:sz w:val="21"/>
+        </w:rPr>
+        <w:t>[2] python-paillier API Documentation. https://python-paillier.readthedocs.io/en/stable/phe.html</w:t>
+      </w:r>
+    </w:p>
+    <w:p>
+      <w:pPr>
+        <w:pStyle w:val="ReportBody"/>
+        <w:spacing w:line="288" w:lineRule="auto"/>
+        <w:ind w:firstLine="0"/>
+        <w:jc w:val="left"/>
+      </w:pPr>
+      <w:r>
+        <w:rPr>
+          <w:rFonts w:ascii="Times New Roman" w:hAnsi="Times New Roman" w:eastAsia="宋体"/>
           <w:b w:val="0"/>
           <w:color w:val="000000"/>
-          <w:sz w:val="22"/>
-        </w:rPr>
-        <w:t>为什么只存SHA-256不够？攻击者可同时改文件与摘要，需签名和可信公钥。</w:t>
-      </w:r>
-    </w:p>
-    <w:p>
-      <w:pPr>
-        <w:spacing w:line="300" w:lineRule="auto" w:after="100"/>
-        <w:ind w:firstLine="480"/>
-      </w:pPr>
-      <w:r>
-        <w:rPr>
-          <w:rFonts w:ascii="宋体" w:hAnsi="宋体" w:eastAsia="宋体"/>
+          <w:sz w:val="21"/>
+        </w:rPr>
+        <w:t>[3] Cryptography Ed25519 signing. https://cryptography.io/en/latest/hazmat/primitives/asymmetric/ed25519/</w:t>
+      </w:r>
+    </w:p>
+    <w:p>
+      <w:pPr>
+        <w:pStyle w:val="ReportBody"/>
+        <w:spacing w:line="288" w:lineRule="auto"/>
+        <w:ind w:firstLine="0"/>
+        <w:jc w:val="left"/>
+      </w:pPr>
+      <w:r>
+        <w:rPr>
+          <w:rFonts w:ascii="Times New Roman" w:hAnsi="Times New Roman" w:eastAsia="宋体"/>
           <w:b w:val="0"/>
           <w:color w:val="000000"/>
-          <w:sz w:val="22"/>
-        </w:rPr>
-        <w:t>为什么删除文件也能发现？签名清单仍保留应存在的文件记录。</w:t>
-      </w:r>
-    </w:p>
-    <w:p>
-      <w:pPr>
-        <w:spacing w:line="300" w:lineRule="auto" w:after="100"/>
-        <w:ind w:firstLine="480"/>
-      </w:pPr>
-      <w:r>
-        <w:rPr>
-          <w:rFonts w:ascii="宋体" w:hAnsi="宋体" w:eastAsia="宋体"/>
-          <w:b w:val="0"/>
-          <w:color w:val="000000"/>
-          <w:sz w:val="22"/>
-        </w:rPr>
-        <w:t>为什么整套回滚不能发现？旧清单签名仍有效，本地缺少可信的最新状态锚点。</w:t>
-      </w:r>
-    </w:p>
-    <w:p>
-      <w:pPr>
-        <w:spacing w:line="300" w:lineRule="auto" w:after="100"/>
-        <w:ind w:firstLine="480"/>
-      </w:pPr>
-      <w:r>
-        <w:rPr>
-          <w:rFonts w:ascii="宋体" w:hAnsi="宋体" w:eastAsia="宋体"/>
-          <w:b w:val="0"/>
-          <w:color w:val="000000"/>
-          <w:sz w:val="22"/>
-        </w:rPr>
-        <w:t>个人验收建议：在自己电脑上重新运行本模块实验，保存截图和测试记录；现场修改一个参数或校验条件，说明修改影响；根据真实参与情况补全姓名、学号与个人总结。</w:t>
-      </w:r>
-    </w:p>
-    <w:p>
-      <w:pPr>
-        <w:keepNext/>
-        <w:spacing w:line="300" w:lineRule="auto" w:after="100"/>
-      </w:pPr>
-      <w:r>
-        <w:rPr>
-          <w:rFonts w:ascii="宋体" w:hAnsi="宋体" w:eastAsia="宋体"/>
-          <w:b/>
-          <w:color w:val="000000"/>
-          <w:sz w:val="24"/>
-        </w:rPr>
-        <w:t>6.3 AI使用声明</w:t>
-      </w:r>
-    </w:p>
-    <w:p>
-      <w:pPr>
-        <w:spacing w:line="300" w:lineRule="auto" w:after="100"/>
-        <w:ind w:firstLine="480"/>
-      </w:pPr>
-      <w:r>
-        <w:rPr>
-          <w:rFonts w:ascii="宋体" w:hAnsi="宋体" w:eastAsia="宋体"/>
-          <w:b w:val="0"/>
-          <w:color w:val="000000"/>
-          <w:sz w:val="22"/>
-        </w:rPr>
-        <w:t>本项目的初始代码、自动实验执行及报告初稿由OpenAI Codex辅助生成。报告中的数据来自实际运行，成员A/B/C表示建议的责任分配，不表示三位学生已经独立完成相应工作。学生须逐项验证、修改并能现场解释，个人完成情况、人工复核与新增Git提交应由本人补充。AI生成记录不冒充学生历史提交。</w:t>
-      </w:r>
-    </w:p>
-    <w:p>
-      <w:pPr>
-        <w:keepNext/>
-        <w:spacing w:line="300" w:lineRule="auto" w:after="100"/>
-      </w:pPr>
-      <w:r>
-        <w:rPr>
-          <w:rFonts w:ascii="宋体" w:hAnsi="宋体" w:eastAsia="宋体"/>
-          <w:b/>
-          <w:color w:val="000000"/>
-          <w:sz w:val="24"/>
-        </w:rPr>
-        <w:t>参考资料</w:t>
-      </w:r>
-    </w:p>
-    <w:p>
-      <w:pPr>
-        <w:spacing w:line="300" w:lineRule="auto" w:after="80"/>
-      </w:pPr>
-      <w:r>
-        <w:rPr>
-          <w:rFonts w:ascii="宋体" w:hAnsi="宋体" w:eastAsia="宋体"/>
-          <w:b w:val="0"/>
-          <w:color w:val="000000"/>
-          <w:sz w:val="18"/>
-        </w:rPr>
-        <w:t>[1] 专业课程设计任务书 B230414 2026—2027第一学期。</w:t>
-      </w:r>
-    </w:p>
-    <w:p>
-      <w:pPr>
-        <w:spacing w:line="300" w:lineRule="auto" w:after="80"/>
-      </w:pPr>
-      <w:r>
-        <w:rPr>
-          <w:rFonts w:ascii="宋体" w:hAnsi="宋体" w:eastAsia="宋体"/>
-          <w:b w:val="0"/>
-          <w:color w:val="000000"/>
-          <w:sz w:val="18"/>
-        </w:rPr>
-        <w:t>[2] python-paillier API Documentation. https://python-paillier.readthedocs.io/en/stable/phe.html</w:t>
-      </w:r>
-    </w:p>
-    <w:p>
-      <w:pPr>
-        <w:spacing w:line="300" w:lineRule="auto" w:after="80"/>
-      </w:pPr>
-      <w:r>
-        <w:rPr>
-          <w:rFonts w:ascii="宋体" w:hAnsi="宋体" w:eastAsia="宋体"/>
-          <w:b w:val="0"/>
-          <w:color w:val="000000"/>
-          <w:sz w:val="18"/>
-        </w:rPr>
-        <w:t>[3] Cryptography Ed25519 signing. https://cryptography.io/en/latest/hazmat/primitives/asymmetric/ed25519/</w:t>
-      </w:r>
-    </w:p>
-    <w:p>
-      <w:pPr>
-        <w:spacing w:line="300" w:lineRule="auto" w:after="80"/>
-      </w:pPr>
-      <w:r>
-        <w:rPr>
-          <w:rFonts w:ascii="宋体" w:hAnsi="宋体" w:eastAsia="宋体"/>
-          <w:b w:val="0"/>
-          <w:color w:val="000000"/>
-          <w:sz w:val="18"/>
+          <w:sz w:val="21"/>
         </w:rPr>
         <w:t>[4] PyInstaller Using PyInstaller. https://pyinstaller.org/en/stable/usage.html</w:t>
       </w:r>
@@ -4962,10 +5306,22 @@
     </w:pPr>
     <w:r>
       <w:rPr>
-        <w:kern w:val="0"/>
-        <w:szCs w:val="21"/>
+        <w:rFonts w:ascii="Times New Roman" w:hAnsi="Times New Roman" w:eastAsia="宋体"/>
+        <w:b w:val="0"/>
+        <w:color w:val="000000"/>
+        <w:sz w:val="18"/>
       </w:rPr>
-      <w:t>-</w:t>
+      <w:t xml:space="preserve">第 </w:t>
+    </w:r>
+    <w:fldSimple w:instr="PAGE"/>
+    <w:r>
+      <w:rPr>
+        <w:rFonts w:ascii="Times New Roman" w:hAnsi="Times New Roman" w:eastAsia="宋体"/>
+        <w:b w:val="0"/>
+        <w:color w:val="000000"/>
+        <w:sz w:val="18"/>
+      </w:rPr>
+      <w:t xml:space="preserve"> 页</w:t>
     </w:r>
   </w:p>
 </w:ftr>
@@ -5467,6 +5823,99 @@
       <w:ind w:firstLine="420" w:firstLineChars="200"/>
     </w:pPr>
   </w:style>
+  <w:style w:type="paragraph" w:customStyle="1" w:styleId="ReportTitle">
+    <w:name w:val="Report Title"/>
+    <w:basedOn w:val="1"/>
+    <w:pPr>
+      <w:keepNext/>
+      <w:widowControl/>
+      <w:spacing w:after="60" w:before="120" w:line="360" w:lineRule="auto"/>
+      <w:ind w:firstLine="0"/>
+    </w:pPr>
+    <w:rPr>
+      <w:rFonts w:ascii="Times New Roman" w:hAnsi="Times New Roman" w:eastAsia="宋体"/>
+      <w:b/>
+      <w:sz w:val="32"/>
+    </w:rPr>
+  </w:style>
+  <w:style w:type="paragraph" w:customStyle="1" w:styleId="ReportH1">
+    <w:name w:val="Report H1"/>
+    <w:basedOn w:val="1"/>
+    <w:pPr>
+      <w:keepNext/>
+      <w:widowControl/>
+      <w:spacing w:after="60" w:before="120" w:line="360" w:lineRule="auto"/>
+      <w:ind w:firstLine="0"/>
+      <w:outlineLvl w:val="0"/>
+    </w:pPr>
+    <w:rPr>
+      <w:rFonts w:ascii="Times New Roman" w:hAnsi="Times New Roman" w:eastAsia="宋体"/>
+      <w:b/>
+      <w:sz w:val="28"/>
+    </w:rPr>
+  </w:style>
+  <w:style w:type="paragraph" w:customStyle="1" w:styleId="ReportH2">
+    <w:name w:val="Report H2"/>
+    <w:basedOn w:val="1"/>
+    <w:pPr>
+      <w:keepNext/>
+      <w:widowControl/>
+      <w:spacing w:after="60" w:before="120" w:line="360" w:lineRule="auto"/>
+      <w:ind w:firstLine="0"/>
+      <w:outlineLvl w:val="1"/>
+    </w:pPr>
+    <w:rPr>
+      <w:rFonts w:ascii="Times New Roman" w:hAnsi="Times New Roman" w:eastAsia="宋体"/>
+      <w:b/>
+      <w:sz w:val="24"/>
+    </w:rPr>
+  </w:style>
+  <w:style w:type="paragraph" w:customStyle="1" w:styleId="ReportBody">
+    <w:name w:val="Report Body"/>
+    <w:basedOn w:val="1"/>
+    <w:pPr>
+      <w:keepLines/>
+      <w:widowControl/>
+      <w:spacing w:after="0" w:before="0" w:line="360" w:lineRule="auto"/>
+      <w:ind w:firstLine="480"/>
+    </w:pPr>
+    <w:rPr>
+      <w:rFonts w:ascii="Times New Roman" w:hAnsi="Times New Roman" w:eastAsia="宋体"/>
+      <w:b w:val="0"/>
+      <w:sz w:val="24"/>
+    </w:rPr>
+  </w:style>
+  <w:style w:type="paragraph" w:customStyle="1" w:styleId="ReportCaption">
+    <w:name w:val="Report Caption"/>
+    <w:basedOn w:val="1"/>
+    <w:pPr>
+      <w:widowControl/>
+      <w:spacing w:after="120" w:before="0" w:line="360" w:lineRule="auto"/>
+      <w:ind w:firstLine="0"/>
+      <w:jc w:val="center"/>
+    </w:pPr>
+    <w:rPr>
+      <w:rFonts w:ascii="Times New Roman" w:hAnsi="Times New Roman" w:eastAsia="宋体"/>
+      <w:b w:val="0"/>
+      <w:sz w:val="21"/>
+    </w:rPr>
+  </w:style>
+  <w:style w:type="paragraph" w:customStyle="1" w:styleId="ReportCode">
+    <w:name w:val="Report Code"/>
+    <w:basedOn w:val="1"/>
+    <w:pPr>
+      <w:keepLines/>
+      <w:widowControl/>
+      <w:spacing w:after="0" w:before="0" w:line="240" w:lineRule="auto"/>
+      <w:ind w:firstLine="0" w:left="240"/>
+      <w:jc w:val="left"/>
+    </w:pPr>
+    <w:rPr>
+      <w:rFonts w:ascii="Consolas" w:hAnsi="Consolas" w:eastAsia="新宋体"/>
+      <w:b w:val="0"/>
+      <w:sz w:val="20"/>
+    </w:rPr>
+  </w:style>
 </w:styles>
 </file>
 

</xml_diff>

<commit_message>
docs: revise report C for TLS intake transactional audit and network UI
</commit_message>
<xml_diff>
--- a/reports/成员C_可视化交互与选票审计模块_报告.docx
+++ b/reports/成员C_可视化交互与选票审计模块_报告.docx
@@ -2155,28 +2155,15 @@
         <w:pageBreakBefore/>
       </w:pPr>
       <w:r>
-        <w:rPr>
-          <w:rFonts w:ascii="Times New Roman" w:hAnsi="Times New Roman" w:eastAsia="宋体"/>
-          <w:b/>
-          <w:color w:val="000000"/>
-          <w:sz w:val="32"/>
-        </w:rPr>
         <w:t>基于同态加密的隐私保护投票系统</w:t>
       </w:r>
     </w:p>
     <w:p>
       <w:pPr>
         <w:pStyle w:val="ReportH2"/>
-        <w:spacing w:after="120"/>
-      </w:pPr>
-      <w:r>
-        <w:rPr>
-          <w:rFonts w:ascii="Times New Roman" w:hAnsi="Times New Roman" w:eastAsia="宋体"/>
-          <w:b/>
-          <w:color w:val="000000"/>
-          <w:sz w:val="24"/>
-        </w:rPr>
-        <w:t>成员C分工报告  可视化交互与选票审计模块</w:t>
+      </w:pPr>
+      <w:r>
+        <w:t>成员C分工报告  联网收票、事务审计与可视化交互</w:t>
       </w:r>
     </w:p>
     <w:p>
@@ -2184,12 +2171,6 @@
         <w:pStyle w:val="ReportH1"/>
       </w:pPr>
       <w:r>
-        <w:rPr>
-          <w:rFonts w:ascii="Times New Roman" w:hAnsi="Times New Roman" w:eastAsia="宋体"/>
-          <w:b/>
-          <w:color w:val="000000"/>
-          <w:sz w:val="28"/>
-        </w:rPr>
         <w:t>一、课题内容和要求</w:t>
       </w:r>
     </w:p>
@@ -2198,12 +2179,6 @@
         <w:pStyle w:val="ReportH2"/>
       </w:pPr>
       <w:r>
-        <w:rPr>
-          <w:rFonts w:ascii="Times New Roman" w:hAnsi="Times New Roman" w:eastAsia="宋体"/>
-          <w:b/>
-          <w:color w:val="000000"/>
-          <w:sz w:val="24"/>
-        </w:rPr>
         <w:t>1.1 课题内容</w:t>
       </w:r>
     </w:p>
@@ -2212,13 +2187,7 @@
         <w:pStyle w:val="ReportBody"/>
       </w:pPr>
       <w:r>
-        <w:rPr>
-          <w:rFonts w:ascii="Times New Roman" w:hAnsi="Times New Roman" w:eastAsia="宋体"/>
-          <w:b w:val="0"/>
-          <w:color w:val="000000"/>
-          <w:sz w:val="24"/>
-        </w:rPr>
-        <w:t>系统使用Paillier加法同态加密实现本地可视化投票。投票端生成加密选票，计票端只访问公开数据并汇总密文，独立解密进程在投票关闭后返回各选项总票数。额外实现投票关闭与Ed25519签名清单审计，检测已接收选票的删除和修改。</w:t>
+        <w:t>设计一个电子投票系统，利用同态加密技术，使服务器在不查看个人投票内容的情况下统计总票。本实现采用Paillier加法同态：投票端本地加密，服务器只接收密文并进行列乘积，独立保管端只解密完整汇总，服务器公布经过签名的总票。</w:t>
       </w:r>
     </w:p>
     <w:p>
@@ -2226,13 +2195,7 @@
         <w:pStyle w:val="ReportBody"/>
       </w:pPr>
       <w:r>
-        <w:rPr>
-          <w:rFonts w:ascii="Times New Roman" w:hAnsi="Times New Roman" w:eastAsia="宋体"/>
-          <w:b w:val="0"/>
-          <w:color w:val="000000"/>
-          <w:sz w:val="24"/>
-        </w:rPr>
-        <w:t>把加密与计票模块组合成可操作的Windows小应用，建立从ID校验、选票登记到关闭投票的状态流程，并以签名清单检测已接收选票被修改或删除。重点是可用性、异常处理、审计边界和集成验证。</w:t>
+        <w:t>操作场景为局域网服务器开放端口，各客户端填写IP和端口连接，也允许本机启动多个客户端模拟多端。选票包含ID、票型、时间戳、随机标识与密文向量；通过凭证绑定和签名记录检测重复、越权及数据修改。</w:t>
       </w:r>
     </w:p>
     <w:p>
@@ -2240,13 +2203,7 @@
         <w:pStyle w:val="ReportH2"/>
       </w:pPr>
       <w:r>
-        <w:rPr>
-          <w:rFonts w:ascii="Times New Roman" w:hAnsi="Times New Roman" w:eastAsia="宋体"/>
-          <w:b/>
-          <w:color w:val="000000"/>
-          <w:sz w:val="24"/>
-        </w:rPr>
-        <w:t>1.2 课题要求与本分工责任</w:t>
+        <w:t>1.2 本分工要求</w:t>
       </w:r>
     </w:p>
     <w:p>
@@ -2254,13 +2211,7 @@
         <w:pStyle w:val="ReportBody"/>
       </w:pPr>
       <w:r>
-        <w:rPr>
-          <w:rFonts w:ascii="Times New Roman" w:hAnsi="Times New Roman" w:eastAsia="宋体"/>
-          <w:b w:val="0"/>
-          <w:color w:val="000000"/>
-          <w:sz w:val="24"/>
-        </w:rPr>
-        <w:t>四个页面分别承担创建管理、加密投票、汇总结果、审计实验。长耗时工作进入后台线程。投票必须具有合法ID、正确轮次、时间戳和密文维度；一个ID只允许登记一次。关闭后不能再投，审计失败时拒绝计票。额外功能以临时副本演示修改和删除，不破坏原始数据。</w:t>
+        <w:t>本分工负责联网收票、事务审计与可视化交互，需要说明数据输入、输出、失败条件及与其他模块的接口；通过可复跑的实验验证功能、耗时和安全边界。</w:t>
       </w:r>
     </w:p>
     <w:p>
@@ -2268,13 +2219,7 @@
         <w:pStyle w:val="ReportBody"/>
       </w:pPr>
       <w:r>
-        <w:rPr>
-          <w:rFonts w:ascii="Times New Roman" w:hAnsi="Times New Roman" w:eastAsia="宋体"/>
-          <w:b w:val="0"/>
-          <w:color w:val="000000"/>
-          <w:sz w:val="24"/>
-        </w:rPr>
-        <w:t>本报告对应的代码范围：app_ui.py；audit_service.py；election_service.py；common.py；ui_smoke.py；打包配置与集成测试。</w:t>
+        <w:t>本分工主要代码：network_store.py、network_server.py、network_ui.py、network_cli.py、network_ui_smoke.py。A/B/C表示模块责任，姓名学号与实际个人贡献由成员据实确认。</w:t>
       </w:r>
     </w:p>
     <w:p>
@@ -2282,12 +2227,6 @@
         <w:pStyle w:val="ReportH1"/>
       </w:pPr>
       <w:r>
-        <w:rPr>
-          <w:rFonts w:ascii="Times New Roman" w:hAnsi="Times New Roman" w:eastAsia="宋体"/>
-          <w:b/>
-          <w:color w:val="000000"/>
-          <w:sz w:val="28"/>
-        </w:rPr>
         <w:t>二、需求分析和总体设计</w:t>
       </w:r>
     </w:p>
@@ -2304,7 +2243,7 @@
         <w:pStyle w:val="ReportBody"/>
       </w:pPr>
       <w:r>
-        <w:t>界面提供创建、投票、结果和审计四个页面；登记服务负责名单、唯一ID、关闭状态及签名清单。审计模块校验JSON结构、签名、配置摘要和选票集合；导出功能只交付当前已审计的公开文件。后台线程执行耗时操作，主线程更新控件。</w:t>
+        <w:t>服务器开放可配置的HTTPS端口；客户端输入IP、端口并导入凭证连接。接收端把高熵票码绑定ID，在SQLite事务中检查状态和重复记录，原子写入选票及签名清单。桌面界面显示验证后的回执、接收数量和公开结果，管理员具有关闭、导出与发布操作。</w:t>
       </w:r>
     </w:p>
     <w:p>
@@ -2320,7 +2259,7 @@
         <w:pStyle w:val="ReportBody"/>
       </w:pPr>
       <w:r>
-        <w:t>先固定公开JSON接口，再把每张选票摘要加入签名清单，使修改与删除都有可比较的基准。文件损坏时统一返回可解释的VoteError，并拒绝继续计票。公开包采用明确文件清单，避免递归搜集目录中的无关JSON；GUI通过单写入锁和任务禁用防止常规并发操作。</w:t>
+        <w:t>原单机JSON文件与QLockFile只适合一个写入者。联网后使用BEGIN IMMEDIATE串行化写事务，voter_id主键与nonce唯一约束共同限制重复登记。HTTPS处理器负责消息大小、JSON格式、凭证及角色检查；存储模块负责事务与完整性。Qt后台线程处理网络和加密，主线程更新控件。</w:t>
       </w:r>
     </w:p>
     <w:p>
@@ -2328,7 +2267,15 @@
         <w:pStyle w:val="ReportH2"/>
       </w:pPr>
       <w:r>
-        <w:t>2.3 模块接口与分工</w:t>
+        <w:t>2.3 系统部署与接口</w:t>
+      </w:r>
+    </w:p>
+    <w:p>
+      <w:pPr>
+        <w:pStyle w:val="ReportBody"/>
+      </w:pPr>
+      <w:r>
+        <w:t>组织者在保管端初始化三个目录：server部署到收票电脑，trustee留在独立保管电脑，organizer内的凭证按身份分发。初始化过程中产生私钥，但运行中的网络服务器从未获得Paillier私钥；服务器TLS私钥和登记签名私钥仅用于通信、审计，不具有选票解密能力。</w:t>
       </w:r>
     </w:p>
     <w:p>
@@ -2337,168 +2284,117 @@
         <w:keepNext/>
       </w:pPr>
       <w:r>
-        <w:t>表1 小组模块划分</w:t>
+        <w:t>表1 三端职责和数据边界</w:t>
       </w:r>
     </w:p>
     <w:tbl>
       <w:tblPr>
         <w:tblW w:type="auto" w:w="0"/>
-        <w:jc w:val="center"/>
         <w:tblLayout w:type="fixed"/>
         <w:tblLook w:firstColumn="1" w:firstRow="1" w:lastColumn="0" w:lastRow="0" w:noHBand="0" w:noVBand="1" w:val="04A0"/>
       </w:tblPr>
       <w:tblGrid>
-        <w:gridCol w:w="794"/>
-        <w:gridCol w:w="2665"/>
-        <w:gridCol w:w="5726"/>
+        <w:gridCol w:w="3118"/>
+        <w:gridCol w:w="3118"/>
+        <w:gridCol w:w="3118"/>
       </w:tblGrid>
       <w:tr>
         <w:trPr>
           <w:tblHeader/>
-          <w:tblHeader/>
         </w:trPr>
         <w:tc>
           <w:tcPr>
-            <w:tcW w:type="dxa" w:w="794"/>
-            <w:vAlign w:val="center"/>
-            <w:tcBorders>
-              <w:top w:val="single" w:sz="4" w:color="D9D9D9"/>
-              <w:left w:val="single" w:sz="4" w:color="D9D9D9"/>
-              <w:bottom w:val="single" w:sz="4" w:color="D9D9D9"/>
-              <w:right w:val="single" w:sz="4" w:color="D9D9D9"/>
-              <w:top w:val="single" w:sz="4" w:color="D9D9D9"/>
-              <w:left w:val="single" w:sz="4" w:color="D9D9D9"/>
-              <w:bottom w:val="single" w:sz="4" w:color="D9D9D9"/>
-              <w:right w:val="single" w:sz="4" w:color="D9D9D9"/>
-            </w:tcBorders>
-            <w:tcMar>
-              <w:top w:w="75" w:type="dxa"/>
-              <w:left w:w="75" w:type="dxa"/>
-              <w:bottom w:w="75" w:type="dxa"/>
-              <w:right w:w="75" w:type="dxa"/>
-            </w:tcMar>
-            <w:shd w:fill="E8EDF1"/>
-          </w:tcPr>
-          <w:p>
-            <w:pPr>
-              <w:keepNext/>
-              <w:spacing w:after="40" w:line="288" w:lineRule="auto" w:before="40"/>
-            </w:pPr>
-            <w:r>
-              <w:rPr>
-                <w:rFonts w:ascii="Times New Roman" w:hAnsi="Times New Roman" w:eastAsia="宋体"/>
-                <w:b/>
-                <w:color w:val="000000"/>
-                <w:sz w:val="21"/>
-              </w:rPr>
-              <w:t>成员</w:t>
-            </w:r>
-          </w:p>
-        </w:tc>
-        <w:tc>
-          <w:tcPr>
-            <w:tcW w:type="dxa" w:w="2665"/>
-            <w:vAlign w:val="center"/>
-            <w:tcBorders>
-              <w:top w:val="single" w:sz="4" w:color="D9D9D9"/>
-              <w:left w:val="single" w:sz="4" w:color="D9D9D9"/>
-              <w:bottom w:val="single" w:sz="4" w:color="D9D9D9"/>
-              <w:right w:val="single" w:sz="4" w:color="D9D9D9"/>
-              <w:top w:val="single" w:sz="4" w:color="D9D9D9"/>
-              <w:left w:val="single" w:sz="4" w:color="D9D9D9"/>
-              <w:bottom w:val="single" w:sz="4" w:color="D9D9D9"/>
-              <w:right w:val="single" w:sz="4" w:color="D9D9D9"/>
-            </w:tcBorders>
-            <w:tcMar>
-              <w:top w:w="75" w:type="dxa"/>
-              <w:left w:w="75" w:type="dxa"/>
-              <w:bottom w:w="75" w:type="dxa"/>
-              <w:right w:w="75" w:type="dxa"/>
-            </w:tcMar>
-            <w:shd w:fill="E8EDF1"/>
-          </w:tcPr>
-          <w:p>
-            <w:pPr>
-              <w:keepNext/>
-              <w:spacing w:after="40" w:line="288" w:lineRule="auto" w:before="40"/>
-            </w:pPr>
-            <w:r>
-              <w:rPr>
-                <w:rFonts w:ascii="Times New Roman" w:hAnsi="Times New Roman" w:eastAsia="宋体"/>
-                <w:b/>
-                <w:color w:val="000000"/>
-                <w:sz w:val="21"/>
-              </w:rPr>
-              <w:t>负责模块</w:t>
-            </w:r>
-          </w:p>
-        </w:tc>
-        <w:tc>
-          <w:tcPr>
-            <w:tcW w:type="dxa" w:w="5726"/>
-            <w:vAlign w:val="center"/>
-            <w:tcBorders>
-              <w:top w:val="single" w:sz="4" w:color="D9D9D9"/>
-              <w:left w:val="single" w:sz="4" w:color="D9D9D9"/>
-              <w:bottom w:val="single" w:sz="4" w:color="D9D9D9"/>
-              <w:right w:val="single" w:sz="4" w:color="D9D9D9"/>
-              <w:top w:val="single" w:sz="4" w:color="D9D9D9"/>
-              <w:left w:val="single" w:sz="4" w:color="D9D9D9"/>
-              <w:bottom w:val="single" w:sz="4" w:color="D9D9D9"/>
-              <w:right w:val="single" w:sz="4" w:color="D9D9D9"/>
-            </w:tcBorders>
-            <w:tcMar>
-              <w:top w:w="75" w:type="dxa"/>
-              <w:left w:w="75" w:type="dxa"/>
-              <w:bottom w:w="75" w:type="dxa"/>
-              <w:right w:w="75" w:type="dxa"/>
-            </w:tcMar>
-            <w:shd w:fill="E8EDF1"/>
-          </w:tcPr>
-          <w:p>
-            <w:pPr>
-              <w:keepNext/>
-              <w:spacing w:after="40" w:line="288" w:lineRule="auto" w:before="40"/>
-            </w:pPr>
-            <w:r>
-              <w:rPr>
-                <w:rFonts w:ascii="Times New Roman" w:hAnsi="Times New Roman" w:eastAsia="宋体"/>
-                <w:b/>
-                <w:color w:val="000000"/>
-                <w:sz w:val="21"/>
-              </w:rPr>
-              <w:t>交付与验证</w:t>
+            <w:tcW w:type="dxa" w:w="1361"/>
+            <w:tcBorders>
+              <w:top w:val="single" w:sz="4" w:color="C9D4DF"/>
+              <w:left w:val="single" w:sz="4" w:color="C9D4DF"/>
+              <w:bottom w:val="single" w:sz="4" w:color="C9D4DF"/>
+              <w:right w:val="single" w:sz="4" w:color="C9D4DF"/>
+            </w:tcBorders>
+            <w:shd w:fill="E8EEF3"/>
+          </w:tcPr>
+          <w:p>
+            <w:pPr>
+              <w:spacing w:line="288" w:lineRule="auto" w:before="60" w:after="60"/>
+            </w:pPr>
+            <w:r>
+              <w:rPr>
+                <w:rFonts w:ascii="Times New Roman" w:hAnsi="Times New Roman" w:eastAsia="宋体"/>
+                <w:b/>
+                <w:color w:val="000000"/>
+                <w:sz w:val="21"/>
+              </w:rPr>
+              <w:t>角色</w:t>
+            </w:r>
+          </w:p>
+        </w:tc>
+        <w:tc>
+          <w:tcPr>
+            <w:tcW w:type="dxa" w:w="4535"/>
+            <w:tcBorders>
+              <w:top w:val="single" w:sz="4" w:color="C9D4DF"/>
+              <w:left w:val="single" w:sz="4" w:color="C9D4DF"/>
+              <w:bottom w:val="single" w:sz="4" w:color="C9D4DF"/>
+              <w:right w:val="single" w:sz="4" w:color="C9D4DF"/>
+            </w:tcBorders>
+            <w:shd w:fill="E8EEF3"/>
+          </w:tcPr>
+          <w:p>
+            <w:pPr>
+              <w:spacing w:line="288" w:lineRule="auto" w:before="60" w:after="60"/>
+            </w:pPr>
+            <w:r>
+              <w:rPr>
+                <w:rFonts w:ascii="Times New Roman" w:hAnsi="Times New Roman" w:eastAsia="宋体"/>
+                <w:b/>
+                <w:color w:val="000000"/>
+                <w:sz w:val="21"/>
+              </w:rPr>
+              <w:t>输入与操作</w:t>
+            </w:r>
+          </w:p>
+        </w:tc>
+        <w:tc>
+          <w:tcPr>
+            <w:tcW w:type="dxa" w:w="2948"/>
+            <w:tcBorders>
+              <w:top w:val="single" w:sz="4" w:color="C9D4DF"/>
+              <w:left w:val="single" w:sz="4" w:color="C9D4DF"/>
+              <w:bottom w:val="single" w:sz="4" w:color="C9D4DF"/>
+              <w:right w:val="single" w:sz="4" w:color="C9D4DF"/>
+            </w:tcBorders>
+            <w:shd w:fill="E8EEF3"/>
+          </w:tcPr>
+          <w:p>
+            <w:pPr>
+              <w:spacing w:line="288" w:lineRule="auto" w:before="60" w:after="60"/>
+            </w:pPr>
+            <w:r>
+              <w:rPr>
+                <w:rFonts w:ascii="Times New Roman" w:hAnsi="Times New Roman" w:eastAsia="宋体"/>
+                <w:b/>
+                <w:color w:val="000000"/>
+                <w:sz w:val="21"/>
+              </w:rPr>
+              <w:t>可持有的秘密</w:t>
             </w:r>
           </w:p>
         </w:tc>
       </w:tr>
       <w:tr>
-        <w:trPr/>
-        <w:tc>
-          <w:tcPr>
-            <w:tcW w:type="dxa" w:w="794"/>
-            <w:vAlign w:val="center"/>
-            <w:tcBorders>
-              <w:top w:val="single" w:sz="4" w:color="D9D9D9"/>
-              <w:left w:val="single" w:sz="4" w:color="D9D9D9"/>
-              <w:bottom w:val="single" w:sz="4" w:color="D9D9D9"/>
-              <w:right w:val="single" w:sz="4" w:color="D9D9D9"/>
-              <w:top w:val="single" w:sz="4" w:color="D9D9D9"/>
-              <w:left w:val="single" w:sz="4" w:color="D9D9D9"/>
-              <w:bottom w:val="single" w:sz="4" w:color="D9D9D9"/>
-              <w:right w:val="single" w:sz="4" w:color="D9D9D9"/>
-            </w:tcBorders>
-            <w:tcMar>
-              <w:top w:w="75" w:type="dxa"/>
-              <w:left w:w="75" w:type="dxa"/>
-              <w:bottom w:w="75" w:type="dxa"/>
-              <w:right w:w="75" w:type="dxa"/>
-            </w:tcMar>
-          </w:tcPr>
-          <w:p>
-            <w:pPr>
-              <w:keepNext/>
-              <w:spacing w:after="40" w:line="288" w:lineRule="auto" w:before="40"/>
+        <w:tc>
+          <w:tcPr>
+            <w:tcW w:type="dxa" w:w="1361"/>
+            <w:tcBorders>
+              <w:top w:val="single" w:sz="4" w:color="C9D4DF"/>
+              <w:left w:val="single" w:sz="4" w:color="C9D4DF"/>
+              <w:bottom w:val="single" w:sz="4" w:color="C9D4DF"/>
+              <w:right w:val="single" w:sz="4" w:color="C9D4DF"/>
+            </w:tcBorders>
+          </w:tcPr>
+          <w:p>
+            <w:pPr>
+              <w:spacing w:line="288" w:lineRule="auto" w:before="60" w:after="60"/>
             </w:pPr>
             <w:r>
               <w:rPr>
@@ -2507,35 +2403,23 @@
                 <w:color w:val="000000"/>
                 <w:sz w:val="21"/>
               </w:rPr>
-              <w:t>A</w:t>
-            </w:r>
-          </w:p>
-        </w:tc>
-        <w:tc>
-          <w:tcPr>
-            <w:tcW w:type="dxa" w:w="2665"/>
-            <w:vAlign w:val="center"/>
-            <w:tcBorders>
-              <w:top w:val="single" w:sz="4" w:color="D9D9D9"/>
-              <w:left w:val="single" w:sz="4" w:color="D9D9D9"/>
-              <w:bottom w:val="single" w:sz="4" w:color="D9D9D9"/>
-              <w:right w:val="single" w:sz="4" w:color="D9D9D9"/>
-              <w:top w:val="single" w:sz="4" w:color="D9D9D9"/>
-              <w:left w:val="single" w:sz="4" w:color="D9D9D9"/>
-              <w:bottom w:val="single" w:sz="4" w:color="D9D9D9"/>
-              <w:right w:val="single" w:sz="4" w:color="D9D9D9"/>
-            </w:tcBorders>
-            <w:tcMar>
-              <w:top w:w="75" w:type="dxa"/>
-              <w:left w:w="75" w:type="dxa"/>
-              <w:bottom w:w="75" w:type="dxa"/>
-              <w:right w:w="75" w:type="dxa"/>
-            </w:tcMar>
-          </w:tcPr>
-          <w:p>
-            <w:pPr>
-              <w:keepNext/>
-              <w:spacing w:after="40" w:line="288" w:lineRule="auto" w:before="40"/>
+              <w:t>客户端</w:t>
+            </w:r>
+          </w:p>
+        </w:tc>
+        <w:tc>
+          <w:tcPr>
+            <w:tcW w:type="dxa" w:w="4535"/>
+            <w:tcBorders>
+              <w:top w:val="single" w:sz="4" w:color="C9D4DF"/>
+              <w:left w:val="single" w:sz="4" w:color="C9D4DF"/>
+              <w:bottom w:val="single" w:sz="4" w:color="C9D4DF"/>
+              <w:right w:val="single" w:sz="4" w:color="C9D4DF"/>
+            </w:tcBorders>
+          </w:tcPr>
+          <w:p>
+            <w:pPr>
+              <w:spacing w:line="288" w:lineRule="auto" w:before="60" w:after="60"/>
             </w:pPr>
             <w:r>
               <w:rPr>
@@ -2544,35 +2428,23 @@
                 <w:color w:val="000000"/>
                 <w:sz w:val="21"/>
               </w:rPr>
-              <w:t>密钥与加密选票</w:t>
-            </w:r>
-          </w:p>
-        </w:tc>
-        <w:tc>
-          <w:tcPr>
-            <w:tcW w:type="dxa" w:w="5726"/>
-            <w:vAlign w:val="center"/>
-            <w:tcBorders>
-              <w:top w:val="single" w:sz="4" w:color="D9D9D9"/>
-              <w:left w:val="single" w:sz="4" w:color="D9D9D9"/>
-              <w:bottom w:val="single" w:sz="4" w:color="D9D9D9"/>
-              <w:right w:val="single" w:sz="4" w:color="D9D9D9"/>
-              <w:top w:val="single" w:sz="4" w:color="D9D9D9"/>
-              <w:left w:val="single" w:sz="4" w:color="D9D9D9"/>
-              <w:bottom w:val="single" w:sz="4" w:color="D9D9D9"/>
-              <w:right w:val="single" w:sz="4" w:color="D9D9D9"/>
-            </w:tcBorders>
-            <w:tcMar>
-              <w:top w:w="75" w:type="dxa"/>
-              <w:left w:w="75" w:type="dxa"/>
-              <w:bottom w:w="75" w:type="dxa"/>
-              <w:right w:w="75" w:type="dxa"/>
-            </w:tcMar>
-          </w:tcPr>
-          <w:p>
-            <w:pPr>
-              <w:keepNext/>
-              <w:spacing w:after="40" w:line="288" w:lineRule="auto" w:before="40"/>
+              <w:t>IP、端口、凭证；本地加密后提交密文</w:t>
+            </w:r>
+          </w:p>
+        </w:tc>
+        <w:tc>
+          <w:tcPr>
+            <w:tcW w:type="dxa" w:w="2948"/>
+            <w:tcBorders>
+              <w:top w:val="single" w:sz="4" w:color="C9D4DF"/>
+              <w:left w:val="single" w:sz="4" w:color="C9D4DF"/>
+              <w:bottom w:val="single" w:sz="4" w:color="C9D4DF"/>
+              <w:right w:val="single" w:sz="4" w:color="C9D4DF"/>
+            </w:tcBorders>
+          </w:tcPr>
+          <w:p>
+            <w:pPr>
+              <w:spacing w:line="288" w:lineRule="auto" w:before="60" w:after="60"/>
             </w:pPr>
             <w:r>
               <w:rPr>
@@ -2581,38 +2453,25 @@
                 <w:color w:val="000000"/>
                 <w:sz w:val="21"/>
               </w:rPr>
-              <w:t>编码、随机加密、密钥封装；同态和输入边界测试</w:t>
+              <w:t>本人票码、当前选择</w:t>
             </w:r>
           </w:p>
         </w:tc>
       </w:tr>
       <w:tr>
-        <w:trPr/>
-        <w:tc>
-          <w:tcPr>
-            <w:tcW w:type="dxa" w:w="794"/>
-            <w:vAlign w:val="center"/>
-            <w:tcBorders>
-              <w:top w:val="single" w:sz="4" w:color="D9D9D9"/>
-              <w:left w:val="single" w:sz="4" w:color="D9D9D9"/>
-              <w:bottom w:val="single" w:sz="4" w:color="D9D9D9"/>
-              <w:right w:val="single" w:sz="4" w:color="D9D9D9"/>
-              <w:top w:val="single" w:sz="4" w:color="D9D9D9"/>
-              <w:left w:val="single" w:sz="4" w:color="D9D9D9"/>
-              <w:bottom w:val="single" w:sz="4" w:color="D9D9D9"/>
-              <w:right w:val="single" w:sz="4" w:color="D9D9D9"/>
-            </w:tcBorders>
-            <w:tcMar>
-              <w:top w:w="75" w:type="dxa"/>
-              <w:left w:w="75" w:type="dxa"/>
-              <w:bottom w:w="75" w:type="dxa"/>
-              <w:right w:w="75" w:type="dxa"/>
-            </w:tcMar>
-          </w:tcPr>
-          <w:p>
-            <w:pPr>
-              <w:keepNext/>
-              <w:spacing w:after="40" w:line="288" w:lineRule="auto" w:before="40"/>
+        <w:tc>
+          <w:tcPr>
+            <w:tcW w:type="dxa" w:w="1361"/>
+            <w:tcBorders>
+              <w:top w:val="single" w:sz="4" w:color="C9D4DF"/>
+              <w:left w:val="single" w:sz="4" w:color="C9D4DF"/>
+              <w:bottom w:val="single" w:sz="4" w:color="C9D4DF"/>
+              <w:right w:val="single" w:sz="4" w:color="C9D4DF"/>
+            </w:tcBorders>
+          </w:tcPr>
+          <w:p>
+            <w:pPr>
+              <w:spacing w:line="288" w:lineRule="auto" w:before="60" w:after="60"/>
             </w:pPr>
             <w:r>
               <w:rPr>
@@ -2621,35 +2480,23 @@
                 <w:color w:val="000000"/>
                 <w:sz w:val="21"/>
               </w:rPr>
-              <w:t>B</w:t>
-            </w:r>
-          </w:p>
-        </w:tc>
-        <w:tc>
-          <w:tcPr>
-            <w:tcW w:type="dxa" w:w="2665"/>
-            <w:vAlign w:val="center"/>
-            <w:tcBorders>
-              <w:top w:val="single" w:sz="4" w:color="D9D9D9"/>
-              <w:left w:val="single" w:sz="4" w:color="D9D9D9"/>
-              <w:bottom w:val="single" w:sz="4" w:color="D9D9D9"/>
-              <w:right w:val="single" w:sz="4" w:color="D9D9D9"/>
-              <w:top w:val="single" w:sz="4" w:color="D9D9D9"/>
-              <w:left w:val="single" w:sz="4" w:color="D9D9D9"/>
-              <w:bottom w:val="single" w:sz="4" w:color="D9D9D9"/>
-              <w:right w:val="single" w:sz="4" w:color="D9D9D9"/>
-            </w:tcBorders>
-            <w:tcMar>
-              <w:top w:w="75" w:type="dxa"/>
-              <w:left w:w="75" w:type="dxa"/>
-              <w:bottom w:w="75" w:type="dxa"/>
-              <w:right w:w="75" w:type="dxa"/>
-            </w:tcMar>
-          </w:tcPr>
-          <w:p>
-            <w:pPr>
-              <w:keepNext/>
-              <w:spacing w:after="40" w:line="288" w:lineRule="auto" w:before="40"/>
+              <w:t>服务器</w:t>
+            </w:r>
+          </w:p>
+        </w:tc>
+        <w:tc>
+          <w:tcPr>
+            <w:tcW w:type="dxa" w:w="4535"/>
+            <w:tcBorders>
+              <w:top w:val="single" w:sz="4" w:color="C9D4DF"/>
+              <w:left w:val="single" w:sz="4" w:color="C9D4DF"/>
+              <w:bottom w:val="single" w:sz="4" w:color="C9D4DF"/>
+              <w:right w:val="single" w:sz="4" w:color="C9D4DF"/>
+            </w:tcBorders>
+          </w:tcPr>
+          <w:p>
+            <w:pPr>
+              <w:spacing w:line="288" w:lineRule="auto" w:before="60" w:after="60"/>
             </w:pPr>
             <w:r>
               <w:rPr>
@@ -2658,35 +2505,23 @@
                 <w:color w:val="000000"/>
                 <w:sz w:val="21"/>
               </w:rPr>
-              <w:t>同态汇总与受控解密</w:t>
-            </w:r>
-          </w:p>
-        </w:tc>
-        <w:tc>
-          <w:tcPr>
-            <w:tcW w:type="dxa" w:w="5726"/>
-            <w:vAlign w:val="center"/>
-            <w:tcBorders>
-              <w:top w:val="single" w:sz="4" w:color="D9D9D9"/>
-              <w:left w:val="single" w:sz="4" w:color="D9D9D9"/>
-              <w:bottom w:val="single" w:sz="4" w:color="D9D9D9"/>
-              <w:right w:val="single" w:sz="4" w:color="D9D9D9"/>
-              <w:top w:val="single" w:sz="4" w:color="D9D9D9"/>
-              <w:left w:val="single" w:sz="4" w:color="D9D9D9"/>
-              <w:bottom w:val="single" w:sz="4" w:color="D9D9D9"/>
-              <w:right w:val="single" w:sz="4" w:color="D9D9D9"/>
-            </w:tcBorders>
-            <w:tcMar>
-              <w:top w:w="75" w:type="dxa"/>
-              <w:left w:w="75" w:type="dxa"/>
-              <w:bottom w:w="75" w:type="dxa"/>
-              <w:right w:w="75" w:type="dxa"/>
-            </w:tcMar>
-          </w:tcPr>
-          <w:p>
-            <w:pPr>
-              <w:keepNext/>
-              <w:spacing w:after="40" w:line="288" w:lineRule="auto" w:before="40"/>
+              <w:t>认证登记、关闭、密文汇总与结果发布</w:t>
+            </w:r>
+          </w:p>
+        </w:tc>
+        <w:tc>
+          <w:tcPr>
+            <w:tcW w:type="dxa" w:w="2948"/>
+            <w:tcBorders>
+              <w:top w:val="single" w:sz="4" w:color="C9D4DF"/>
+              <w:left w:val="single" w:sz="4" w:color="C9D4DF"/>
+              <w:bottom w:val="single" w:sz="4" w:color="C9D4DF"/>
+              <w:right w:val="single" w:sz="4" w:color="C9D4DF"/>
+            </w:tcBorders>
+          </w:tcPr>
+          <w:p>
+            <w:pPr>
+              <w:spacing w:line="288" w:lineRule="auto" w:before="60" w:after="60"/>
             </w:pPr>
             <w:r>
               <w:rPr>
@@ -2695,38 +2530,25 @@
                 <w:color w:val="000000"/>
                 <w:sz w:val="21"/>
               </w:rPr>
-              <w:t>独立解密进程、总票数校验；准确性与性能实验</w:t>
+              <w:t>TLS和登记签名密钥、票码摘要</w:t>
             </w:r>
           </w:p>
         </w:tc>
       </w:tr>
       <w:tr>
-        <w:trPr/>
-        <w:tc>
-          <w:tcPr>
-            <w:tcW w:type="dxa" w:w="794"/>
-            <w:vAlign w:val="center"/>
-            <w:tcBorders>
-              <w:top w:val="single" w:sz="4" w:color="D9D9D9"/>
-              <w:left w:val="single" w:sz="4" w:color="D9D9D9"/>
-              <w:bottom w:val="single" w:sz="4" w:color="D9D9D9"/>
-              <w:right w:val="single" w:sz="4" w:color="D9D9D9"/>
-              <w:top w:val="single" w:sz="4" w:color="D9D9D9"/>
-              <w:left w:val="single" w:sz="4" w:color="D9D9D9"/>
-              <w:bottom w:val="single" w:sz="4" w:color="D9D9D9"/>
-              <w:right w:val="single" w:sz="4" w:color="D9D9D9"/>
-            </w:tcBorders>
-            <w:tcMar>
-              <w:top w:w="75" w:type="dxa"/>
-              <w:left w:w="75" w:type="dxa"/>
-              <w:bottom w:w="75" w:type="dxa"/>
-              <w:right w:w="75" w:type="dxa"/>
-            </w:tcMar>
-          </w:tcPr>
-          <w:p>
-            <w:pPr>
-              <w:keepNext w:val="0"/>
-              <w:spacing w:after="40" w:line="288" w:lineRule="auto" w:before="40"/>
+        <w:tc>
+          <w:tcPr>
+            <w:tcW w:type="dxa" w:w="1361"/>
+            <w:tcBorders>
+              <w:top w:val="single" w:sz="4" w:color="C9D4DF"/>
+              <w:left w:val="single" w:sz="4" w:color="C9D4DF"/>
+              <w:bottom w:val="single" w:sz="4" w:color="C9D4DF"/>
+              <w:right w:val="single" w:sz="4" w:color="C9D4DF"/>
+            </w:tcBorders>
+          </w:tcPr>
+          <w:p>
+            <w:pPr>
+              <w:spacing w:line="288" w:lineRule="auto" w:before="60" w:after="60"/>
             </w:pPr>
             <w:r>
               <w:rPr>
@@ -2735,35 +2557,23 @@
                 <w:color w:val="000000"/>
                 <w:sz w:val="21"/>
               </w:rPr>
-              <w:t>C</w:t>
-            </w:r>
-          </w:p>
-        </w:tc>
-        <w:tc>
-          <w:tcPr>
-            <w:tcW w:type="dxa" w:w="2665"/>
-            <w:vAlign w:val="center"/>
-            <w:tcBorders>
-              <w:top w:val="single" w:sz="4" w:color="D9D9D9"/>
-              <w:left w:val="single" w:sz="4" w:color="D9D9D9"/>
-              <w:bottom w:val="single" w:sz="4" w:color="D9D9D9"/>
-              <w:right w:val="single" w:sz="4" w:color="D9D9D9"/>
-              <w:top w:val="single" w:sz="4" w:color="D9D9D9"/>
-              <w:left w:val="single" w:sz="4" w:color="D9D9D9"/>
-              <w:bottom w:val="single" w:sz="4" w:color="D9D9D9"/>
-              <w:right w:val="single" w:sz="4" w:color="D9D9D9"/>
-            </w:tcBorders>
-            <w:tcMar>
-              <w:top w:w="75" w:type="dxa"/>
-              <w:left w:w="75" w:type="dxa"/>
-              <w:bottom w:w="75" w:type="dxa"/>
-              <w:right w:w="75" w:type="dxa"/>
-            </w:tcMar>
-          </w:tcPr>
-          <w:p>
-            <w:pPr>
-              <w:keepNext w:val="0"/>
-              <w:spacing w:after="40" w:line="288" w:lineRule="auto" w:before="40"/>
+              <w:t>保管端</w:t>
+            </w:r>
+          </w:p>
+        </w:tc>
+        <w:tc>
+          <w:tcPr>
+            <w:tcW w:type="dxa" w:w="4535"/>
+            <w:tcBorders>
+              <w:top w:val="single" w:sz="4" w:color="C9D4DF"/>
+              <w:left w:val="single" w:sz="4" w:color="C9D4DF"/>
+              <w:bottom w:val="single" w:sz="4" w:color="C9D4DF"/>
+              <w:right w:val="single" w:sz="4" w:color="C9D4DF"/>
+            </w:tcBorders>
+          </w:tcPr>
+          <w:p>
+            <w:pPr>
+              <w:spacing w:line="288" w:lineRule="auto" w:before="60" w:after="60"/>
             </w:pPr>
             <w:r>
               <w:rPr>
@@ -2772,35 +2582,23 @@
                 <w:color w:val="000000"/>
                 <w:sz w:val="21"/>
               </w:rPr>
-              <w:t>界面与签名审计</w:t>
-            </w:r>
-          </w:p>
-        </w:tc>
-        <w:tc>
-          <w:tcPr>
-            <w:tcW w:type="dxa" w:w="5726"/>
-            <w:vAlign w:val="center"/>
-            <w:tcBorders>
-              <w:top w:val="single" w:sz="4" w:color="D9D9D9"/>
-              <w:left w:val="single" w:sz="4" w:color="D9D9D9"/>
-              <w:bottom w:val="single" w:sz="4" w:color="D9D9D9"/>
-              <w:right w:val="single" w:sz="4" w:color="D9D9D9"/>
-              <w:top w:val="single" w:sz="4" w:color="D9D9D9"/>
-              <w:left w:val="single" w:sz="4" w:color="D9D9D9"/>
-              <w:bottom w:val="single" w:sz="4" w:color="D9D9D9"/>
-              <w:right w:val="single" w:sz="4" w:color="D9D9D9"/>
-            </w:tcBorders>
-            <w:tcMar>
-              <w:top w:w="75" w:type="dxa"/>
-              <w:left w:w="75" w:type="dxa"/>
-              <w:bottom w:w="75" w:type="dxa"/>
-              <w:right w:w="75" w:type="dxa"/>
-            </w:tcMar>
-          </w:tcPr>
-          <w:p>
-            <w:pPr>
-              <w:keepNext w:val="0"/>
-              <w:spacing w:after="40" w:line="288" w:lineRule="auto" w:before="40"/>
+              <w:t>离线核验完整汇总、解密并签署总票</w:t>
+            </w:r>
+          </w:p>
+        </w:tc>
+        <w:tc>
+          <w:tcPr>
+            <w:tcW w:type="dxa" w:w="2948"/>
+            <w:tcBorders>
+              <w:top w:val="single" w:sz="4" w:color="C9D4DF"/>
+              <w:left w:val="single" w:sz="4" w:color="C9D4DF"/>
+              <w:bottom w:val="single" w:sz="4" w:color="C9D4DF"/>
+              <w:right w:val="single" w:sz="4" w:color="C9D4DF"/>
+            </w:tcBorders>
+          </w:tcPr>
+          <w:p>
+            <w:pPr>
+              <w:spacing w:line="288" w:lineRule="auto" w:before="60" w:after="60"/>
             </w:pPr>
             <w:r>
               <w:rPr>
@@ -2809,7 +2607,7 @@
                 <w:color w:val="000000"/>
                 <w:sz w:val="21"/>
               </w:rPr>
-              <w:t>ID校验、关闭状态、签名清单、GUI与打包测试</w:t>
+              <w:t>Paillier私钥、结果签名私钥</w:t>
             </w:r>
           </w:p>
         </w:tc>
@@ -2820,7 +2618,7 @@
         <w:pStyle w:val="ReportBody"/>
       </w:pPr>
       <w:r>
-        <w:t>公开选票由A交给C登记，C把签名清单与密文交给B汇总，B向保管端提交完整汇总请求。各角色报告分别讨论编码与密钥、汇总与解密、界面与审计；实际姓名、学号和完成记录由成员核对填写。</w:t>
+        <w:t>网络接口均以/api为前缀，以JSON交换数据：election和status返回公开状态；ballots只接受密文选票；me返回绑定身份和本人回执；管理员使用close、export和results。服务器不提供接收明文choice、私钥或保管口令的接口。</w:t>
       </w:r>
     </w:p>
     <w:p>
@@ -2828,12 +2626,6 @@
         <w:pStyle w:val="ReportH1"/>
       </w:pPr>
       <w:r>
-        <w:rPr>
-          <w:rFonts w:ascii="Times New Roman" w:hAnsi="Times New Roman" w:eastAsia="宋体"/>
-          <w:b/>
-          <w:color w:val="000000"/>
-          <w:sz w:val="28"/>
-        </w:rPr>
         <w:t>三、相关功能模块详细设计</w:t>
       </w:r>
     </w:p>
@@ -2842,13 +2634,7 @@
         <w:pStyle w:val="ReportH2"/>
       </w:pPr>
       <w:r>
-        <w:rPr>
-          <w:rFonts w:ascii="Times New Roman" w:hAnsi="Times New Roman" w:eastAsia="宋体"/>
-          <w:b/>
-          <w:color w:val="000000"/>
-          <w:sz w:val="24"/>
-        </w:rPr>
-        <w:t>3.1 签名清单与信任前提</w:t>
+        <w:t>3.1 同态加密原理与计票过程</w:t>
       </w:r>
     </w:p>
     <w:p>
@@ -2856,7 +2642,7 @@
         <w:pStyle w:val="ReportBody"/>
       </w:pPr>
       <w:r>
-        <w:t>算法全流程：A生成Paillier公钥n=pq、g=n+1及私钥p、q，以c=</w:t>
+        <w:t>Paillier密钥取不同素数p、q，令n=pq、g=n+1。明文m使用与n互素的独立随机数r加密：c=</w:t>
       </w:r>
       <w:r>
         <w:t>g</w:t>
@@ -2880,7 +2666,19 @@
         <w:t>n</w:t>
       </w:r>
       <w:r>
-        <w:t xml:space="preserve"> mod n²加密独热向量；B按选项列相乘，利用E(a)·E(b) mod n² = E((a+b) mod n)，再由保管端加载私钥解密各列总票[2]。C的Ed25519签名用于发现文件变化，不能代替加密或证明独热合法性[3]。</w:t>
+        <w:t xml:space="preserve"> mod n²。私钥可用λ=lcm(p−1,q−1)与μ表示，解密为m=L(</w:t>
+      </w:r>
+      <w:r>
+        <w:t>c</w:t>
+      </w:r>
+      <w:r>
+        <w:rPr>
+          <w:vertAlign w:val="superscript"/>
+        </w:rPr>
+        <w:t>λ</w:t>
+      </w:r>
+      <w:r>
+        <w:t xml:space="preserve"> mod n²)μ mod n，其中L(u)=(u−1)/n；phe实现利用p、q及CRT加速[2]。</w:t>
       </w:r>
     </w:p>
     <w:p>
@@ -2888,13 +2686,7 @@
         <w:pStyle w:val="ReportBody"/>
       </w:pPr>
       <w:r>
-        <w:rPr>
-          <w:rFonts w:ascii="Times New Roman" w:hAnsi="Times New Roman" w:eastAsia="宋体"/>
-          <w:b w:val="0"/>
-          <w:color w:val="000000"/>
-          <w:sz w:val="24"/>
-        </w:rPr>
-        <w:t>清单payload包含轮次、配置SHA-256、状态及各选票的ID、文件名和摘要，以Ed25519签名。选票名由ID摘要推导，不能由外部输入任意路径。审计核对签名、配置、文件集合、逐票摘要、轮次、ID和密文空间。信任前提是最初公钥配置已确认、签名密钥未泄露；完整配置和全部状态替换超出该本地模型。</w:t>
+        <w:t>同态关系为E(a;r₁)E(b;r₂) mod n² = E((a+b) mod n;r₁r₂ mod n)。单选编码为独热向量，服务器对每个选项分别累乘密文，得到计数之和的加密形式。人数上限10000远小于2048位n，因此正常计数不会模n回绕。服务器计算列乘积无需解密。</w:t>
       </w:r>
     </w:p>
     <w:p>
@@ -2902,13 +2694,7 @@
         <w:pStyle w:val="ReportH2"/>
       </w:pPr>
       <w:r>
-        <w:rPr>
-          <w:rFonts w:ascii="Times New Roman" w:hAnsi="Times New Roman" w:eastAsia="宋体"/>
-          <w:b/>
-          <w:color w:val="000000"/>
-          <w:sz w:val="24"/>
-        </w:rPr>
-        <w:t>3.2 状态管理与存储</w:t>
+        <w:t>3.2 本模块设计</w:t>
       </w:r>
     </w:p>
     <w:p>
@@ -2916,13 +2702,7 @@
         <w:pStyle w:val="ReportBody"/>
       </w:pPr>
       <w:r>
-        <w:rPr>
-          <w:rFonts w:ascii="Times New Roman" w:hAnsi="Times New Roman" w:eastAsia="宋体"/>
-          <w:b w:val="0"/>
-          <w:color w:val="000000"/>
-          <w:sz w:val="24"/>
-        </w:rPr>
-        <w:t>状态只有open和closed；关闭操作需要登记签名密钥，不能从界面重新开放。文件以临时写入后替换的方式保存，单个JSON写入具备原子替换性质；选票与清单并非跨文件事务。若中途异常遗留未登记文件，审计按失败处理，不静默修复。桌面应用通过QLockFile阻止同一目录被两个应用实例同时使用。</w:t>
+        <w:t>一次登记同时写入密文选票和新的签名清单，成功提交后才返回签名回执。管理员关闭与投票登记使用同一事务机制，避免关闭状态和接收记录交叉。客户端断线后可重新查询本人回执。服务器重启时先核验数据库中的清单与选票，发现篡改即拒绝正常服务。普通投票凭证不能关闭轮次或发布结果。</w:t>
       </w:r>
     </w:p>
     <w:p>
@@ -2930,13 +2710,7 @@
         <w:pStyle w:val="ReportH2"/>
       </w:pPr>
       <w:r>
-        <w:rPr>
-          <w:rFonts w:ascii="Times New Roman" w:hAnsi="Times New Roman" w:eastAsia="宋体"/>
-          <w:b/>
-          <w:color w:val="000000"/>
-          <w:sz w:val="24"/>
-        </w:rPr>
-        <w:t>3.3 后台任务与可视化</w:t>
+        <w:t>3.3 验证与失败处理</w:t>
       </w:r>
     </w:p>
     <w:p>
@@ -2944,13 +2718,7 @@
         <w:pStyle w:val="ReportBody"/>
       </w:pPr>
       <w:r>
-        <w:rPr>
-          <w:rFonts w:ascii="Times New Roman" w:hAnsi="Times New Roman" w:eastAsia="宋体"/>
-          <w:b w:val="0"/>
-          <w:color w:val="000000"/>
-          <w:sz w:val="24"/>
-        </w:rPr>
-        <w:t>Qt主线程负责控件，Job线程执行加密、审计和实验；结果通过信号回到主线程。首次界面测试发现done信号发出时线程尚未完全结束，紧接着的实验按钮可能被忽略。修复方法是在成功处理槽等待线程退出后再开放操作。复测已完成投票、结果图和两种审计演示。</w:t>
+        <w:t>票码使用系统随机数生成并在服务器仅保存SHA-256摘要。TLS证书指纹固定在凭证中，客户端先验指纹后发送票码。接收端检查字段、轮次、ID、密文维度与合法密文空间；关闭与登记在SQLite事务内处理。保管端结果绑定完整汇总摘要，服务器和客户端分别核验Ed25519签名[3]。</w:t>
       </w:r>
     </w:p>
     <w:p>
@@ -2966,12 +2734,11 @@
         <w:pStyle w:val="ReportCaption"/>
         <w:keepNext/>
       </w:pPr>
-      <w:r/>
       <w:r>
         <w:drawing>
           <wp:inline xmlns:a="http://schemas.openxmlformats.org/drawingml/2006/main" xmlns:pic="http://schemas.openxmlformats.org/drawingml/2006/picture">
             <wp:extent cx="5760000" cy="3456000"/>
-            <wp:docPr id="2" name="Picture 2"/>
+            <wp:docPr id="1" name="Picture 1"/>
             <wp:cNvGraphicFramePr>
               <a:graphicFrameLocks noChangeAspect="1"/>
             </wp:cNvGraphicFramePr>
@@ -2979,11 +2746,11 @@
               <a:graphicData uri="http://schemas.openxmlformats.org/drawingml/2006/picture">
                 <pic:pic>
                   <pic:nvPicPr>
-                    <pic:cNvPr id="0" name="flow-C.png"/>
+                    <pic:cNvPr id="0" name="C-flow.png"/>
                     <pic:cNvPicPr/>
                   </pic:nvPicPr>
                   <pic:blipFill>
-                    <a:blip r:embed="rId12"/>
+                    <a:blip r:embed="rId13"/>
                     <a:stretch>
                       <a:fillRect/>
                     </a:stretch>
@@ -3007,7 +2774,7 @@
         <w:pStyle w:val="ReportCaption"/>
       </w:pPr>
       <w:r>
-        <w:t>图1 本模块处理流程与失败出口</w:t>
+        <w:t>图1 本模块处理流程及失败出口</w:t>
       </w:r>
     </w:p>
     <w:p>
@@ -3015,49 +2782,19 @@
         <w:pStyle w:val="ReportH2"/>
       </w:pPr>
       <w:r>
-        <w:rPr>
-          <w:rFonts w:ascii="Times New Roman" w:hAnsi="Times New Roman" w:eastAsia="宋体"/>
-          <w:b/>
-          <w:color w:val="000000"/>
-          <w:sz w:val="24"/>
-        </w:rPr>
-        <w:t>3.5 威胁模型与安全边界</w:t>
-      </w:r>
-    </w:p>
-    <w:p>
-      <w:pPr>
-        <w:pStyle w:val="ReportBody"/>
-      </w:pPr>
-      <w:r>
-        <w:rPr>
-          <w:rFonts w:ascii="Times New Roman" w:hAnsi="Times New Roman" w:eastAsia="宋体"/>
-          <w:b w:val="0"/>
-          <w:color w:val="000000"/>
-          <w:sz w:val="24"/>
-        </w:rPr>
-        <w:t>假设攻击者能够读取或修改公开选票目录，但不能获得保管口令和签名私钥，最初的公钥配置已可信确认。保护目标是隐藏单票选择并发现相对于签名清单的文件变化。应用运行在一台电脑上，角色隔离是教学流程；创建与解锁阶段可短暂接触完整密钥材料，不构成互不信任机构之间的物理隔离。</w:t>
-      </w:r>
-    </w:p>
-    <w:p>
-      <w:pPr>
-        <w:pStyle w:val="ReportH2"/>
-      </w:pPr>
-      <w:r>
-        <w:t>3.6 模块界面与数据说明</w:t>
-      </w:r>
-    </w:p>
-    <w:p>
-      <w:pPr>
-        <w:pStyle w:val="ReportBody"/>
+        <w:t>3.5 模块界面与角色隔离</w:t>
+      </w:r>
+    </w:p>
+    <w:p>
+      <w:pPr>
+        <w:pStyle w:val="ReportCaption"/>
         <w:keepNext/>
-        <w:ind w:firstLine="0"/>
-        <w:jc w:val="center"/>
       </w:pPr>
       <w:r>
         <w:drawing>
           <wp:inline xmlns:a="http://schemas.openxmlformats.org/drawingml/2006/main" xmlns:pic="http://schemas.openxmlformats.org/drawingml/2006/picture">
-            <wp:extent cx="5796000" cy="4027729"/>
-            <wp:docPr id="1" name="Picture 1"/>
+            <wp:extent cx="5760000" cy="4143157"/>
+            <wp:docPr id="2" name="Picture 2"/>
             <wp:cNvGraphicFramePr>
               <a:graphicFrameLocks noChangeAspect="1"/>
             </wp:cNvGraphicFramePr>
@@ -3065,11 +2802,11 @@
               <a:graphicData uri="http://schemas.openxmlformats.org/drawingml/2006/picture">
                 <pic:pic>
                   <pic:nvPicPr>
-                    <pic:cNvPr id="0" name="04_audit.png"/>
+                    <pic:cNvPr id="0" name="03_admin.png"/>
                     <pic:cNvPicPr/>
                   </pic:nvPicPr>
                   <pic:blipFill>
-                    <a:blip r:embed="rId11"/>
+                    <a:blip r:embed="rId14"/>
                     <a:stretch>
                       <a:fillRect/>
                     </a:stretch>
@@ -3077,7 +2814,7 @@
                   <pic:spPr>
                     <a:xfrm>
                       <a:off x="0" y="0"/>
-                      <a:ext cx="5796000" cy="4027729"/>
+                      <a:ext cx="5760000" cy="4143157"/>
                     </a:xfrm>
                     <a:prstGeom prst="rect"/>
                   </pic:spPr>
@@ -3093,7 +2830,23 @@
         <w:pStyle w:val="ReportCaption"/>
       </w:pPr>
       <w:r>
-        <w:t>图2 临时副本上的篡改和删除检测</w:t>
+        <w:t>图2 管理员使用独立凭证连接同一服务器</w:t>
+      </w:r>
+    </w:p>
+    <w:p>
+      <w:pPr>
+        <w:pStyle w:val="ReportBody"/>
+      </w:pPr>
+      <w:r>
+        <w:t>图2来自本轮Windows原生Qt实际运行。投票人和管理员导入不同凭证，连接同一端口后得到各自权限。实际部署只向服务器复制server目录，保管端通过公开汇总文件与签名结果文件交接；同机测试使用独立目录和进程，不能声称已建立物理隔离。</w:t>
+      </w:r>
+    </w:p>
+    <w:p>
+      <w:pPr>
+        <w:pStyle w:val="ReportH1"/>
+      </w:pPr>
+      <w:r>
+        <w:t>四、部分核心代码</w:t>
       </w:r>
     </w:p>
     <w:p>
@@ -3101,62 +2854,6 @@
         <w:pStyle w:val="ReportH2"/>
       </w:pPr>
       <w:r>
-        <w:t>3.7 公开数据与私有数据</w:t>
-      </w:r>
-    </w:p>
-    <w:p>
-      <w:pPr>
-        <w:pStyle w:val="ReportBody"/>
-      </w:pPr>
-      <w:r>
-        <w:rPr>
-          <w:rFonts w:ascii="Times New Roman" w:hAnsi="Times New Roman" w:eastAsia="宋体"/>
-          <w:b w:val="0"/>
-          <w:color w:val="000000"/>
-          <w:sz w:val="24"/>
-        </w:rPr>
-        <w:t>public/config.json保存标题、选项、名单、Paillier公钥n和审计公钥；public/ballots保存每张加密选票；public/manifest.json保存签名清单。private/trustee.vault保存加密后的私钥材料。公开包不包含private目录。口令经标准输入管道交给解密子进程，不放入命令行或日志。</w:t>
-      </w:r>
-    </w:p>
-    <w:p>
-      <w:pPr>
-        <w:pStyle w:val="ReportBody"/>
-      </w:pPr>
-      <w:r>
-        <w:rPr>
-          <w:rFonts w:ascii="Times New Roman" w:hAnsi="Times New Roman" w:eastAsia="宋体"/>
-          <w:b w:val="0"/>
-          <w:color w:val="000000"/>
-          <w:sz w:val="24"/>
-        </w:rPr>
-        <w:t>选票的时间戳、ID与随机标识属于公开元数据，隐私目标是投票内容保密，不是投票者匿名。演示和自动实验均使用虚构ID及合成选票。</w:t>
-      </w:r>
-    </w:p>
-    <w:p>
-      <w:pPr>
-        <w:pStyle w:val="ReportH1"/>
-      </w:pPr>
-      <w:r>
-        <w:rPr>
-          <w:rFonts w:ascii="Times New Roman" w:hAnsi="Times New Roman" w:eastAsia="宋体"/>
-          <w:b/>
-          <w:color w:val="000000"/>
-          <w:sz w:val="28"/>
-        </w:rPr>
-        <w:t>四、部分核心代码</w:t>
-      </w:r>
-    </w:p>
-    <w:p>
-      <w:pPr>
-        <w:pStyle w:val="ReportH2"/>
-      </w:pPr>
-      <w:r>
-        <w:rPr>
-          <w:rFonts w:ascii="Times New Roman" w:hAnsi="Times New Roman" w:eastAsia="宋体"/>
-          <w:b/>
-          <w:color w:val="000000"/>
-          <w:sz w:val="24"/>
-        </w:rPr>
         <w:t>4.1 核心实现片段</w:t>
       </w:r>
     </w:p>
@@ -3166,19 +2863,13 @@
         <w:keepNext/>
       </w:pPr>
       <w:r>
-        <w:rPr>
-          <w:rFonts w:ascii="Times New Roman" w:hAnsi="Times New Roman" w:eastAsia="宋体"/>
-          <w:b w:val="0"/>
-          <w:color w:val="000000"/>
-          <w:sz w:val="24"/>
-        </w:rPr>
-        <w:t>以下片段摘自 audit_service.py，完整上下文与异常处理见随附源代码。</w:t>
+        <w:t>以下片段摘自network_store.py中transaction上下文管理器，按版面折行；accept在此事务内完成检查与两项写入。完整异常处理和调用上下文以源码为准。</w:t>
       </w:r>
     </w:p>
     <w:p>
       <w:pPr>
         <w:pStyle w:val="ReportCode"/>
-        <w:keepNext/>
+        <w:keepLines/>
       </w:pPr>
       <w:r>
         <w:rPr>
@@ -3187,97 +2878,29 @@
           <w:color w:val="000000"/>
           <w:sz w:val="20"/>
         </w:rPr>
-        <w:t xml:space="preserve">        path = root / 'public' / 'ballots' / filename</w:t>
-      </w:r>
-    </w:p>
-    <w:p>
-      <w:pPr>
-        <w:pStyle w:val="ReportCode"/>
-        <w:keepNext/>
-      </w:pPr>
-      <w:r>
-        <w:rPr>
-          <w:rFonts w:ascii="Consolas" w:hAnsi="Consolas" w:eastAsia="新宋体"/>
-          <w:b w:val="0"/>
-          <w:color w:val="000000"/>
-          <w:sz w:val="20"/>
-        </w:rPr>
-        <w:t xml:space="preserve">        if not path.is_file():</w:t>
-      </w:r>
-    </w:p>
-    <w:p>
-      <w:pPr>
-        <w:pStyle w:val="ReportCode"/>
-        <w:keepNext/>
-      </w:pPr>
-      <w:r>
-        <w:rPr>
-          <w:rFonts w:ascii="Consolas" w:hAnsi="Consolas" w:eastAsia="新宋体"/>
-          <w:b w:val="0"/>
-          <w:color w:val="000000"/>
-          <w:sz w:val="20"/>
-        </w:rPr>
-        <w:t xml:space="preserve">            raise VoteError('发现选票被删除：' + voter)</w:t>
-      </w:r>
-    </w:p>
-    <w:p>
-      <w:pPr>
-        <w:pStyle w:val="ReportCode"/>
-        <w:keepNext/>
-      </w:pPr>
-      <w:r>
-        <w:rPr>
-          <w:rFonts w:ascii="Consolas" w:hAnsi="Consolas" w:eastAsia="新宋体"/>
-          <w:b w:val="0"/>
-          <w:color w:val="000000"/>
-          <w:sz w:val="20"/>
-        </w:rPr>
-        <w:t xml:space="preserve">        ballot = read_json(path, 100000)</w:t>
-      </w:r>
-    </w:p>
-    <w:p>
-      <w:pPr>
-        <w:pStyle w:val="ReportCode"/>
-        <w:keepNext/>
-      </w:pPr>
-      <w:r>
-        <w:rPr>
-          <w:rFonts w:ascii="Consolas" w:hAnsi="Consolas" w:eastAsia="新宋体"/>
-          <w:b w:val="0"/>
-          <w:color w:val="000000"/>
-          <w:sz w:val="20"/>
-        </w:rPr>
-        <w:t xml:space="preserve">        if digest(ballot) != entry['sha256']:</w:t>
-      </w:r>
-    </w:p>
-    <w:p>
-      <w:pPr>
-        <w:pStyle w:val="ReportCode"/>
-        <w:keepNext/>
-      </w:pPr>
-      <w:r>
-        <w:rPr>
-          <w:rFonts w:ascii="Consolas" w:hAnsi="Consolas" w:eastAsia="新宋体"/>
-          <w:b w:val="0"/>
-          <w:color w:val="000000"/>
-          <w:sz w:val="20"/>
-        </w:rPr>
-        <w:t xml:space="preserve">            raise VoteError('发现选票被篡改：' + voter)</w:t>
-      </w:r>
-    </w:p>
-    <w:p>
-      <w:pPr>
-        <w:pStyle w:val="ReportCode"/>
-        <w:keepNext w:val="0"/>
-      </w:pPr>
-      <w:r>
-        <w:rPr>
-          <w:rFonts w:ascii="Consolas" w:hAnsi="Consolas" w:eastAsia="新宋体"/>
-          <w:b w:val="0"/>
-          <w:color w:val="000000"/>
-          <w:sz w:val="20"/>
-        </w:rPr>
-        <w:t xml:space="preserve">        validate_ballot(config, ballot)</w:t>
+        <w:t>db = sqlite3.connect(</w:t>
+        <w:br/>
+        <w:t xml:space="preserve">    self.root/'votes.sqlite3', timeout=15,</w:t>
+        <w:br/>
+        <w:t xml:space="preserve">    isolation_level=None)</w:t>
+        <w:br/>
+        <w:t>try:</w:t>
+        <w:br/>
+        <w:t xml:space="preserve">    db.execute('BEGIN IMMEDIATE' if write else 'BEGIN')</w:t>
+        <w:br/>
+        <w:t xml:space="preserve">    yield db</w:t>
+        <w:br/>
+        <w:t xml:space="preserve">    db.commit()</w:t>
+        <w:br/>
+        <w:t>except Exception:</w:t>
+        <w:br/>
+        <w:t xml:space="preserve">    db.rollback()</w:t>
+        <w:br/>
+        <w:t xml:space="preserve">    raise</w:t>
+        <w:br/>
+        <w:t>finally:</w:t>
+        <w:br/>
+        <w:t xml:space="preserve">    db.close()</w:t>
       </w:r>
     </w:p>
     <w:p>
@@ -3285,13 +2908,7 @@
         <w:pStyle w:val="ReportH2"/>
       </w:pPr>
       <w:r>
-        <w:rPr>
-          <w:rFonts w:ascii="Times New Roman" w:hAnsi="Times New Roman" w:eastAsia="宋体"/>
-          <w:b/>
-          <w:color w:val="000000"/>
-          <w:sz w:val="24"/>
-        </w:rPr>
-        <w:t>4.2 本模块可重复实验步骤</w:t>
+        <w:t>4.2 可重复实验步骤</w:t>
       </w:r>
     </w:p>
     <w:p>
@@ -3299,7 +2916,7 @@
         <w:pStyle w:val="ReportBody"/>
       </w:pPr>
       <w:r>
-        <w:t>1．按README安装依赖并运行src/main.py；创建页填写标题、逗号分隔选项、人数及保管口令，选择目录创建新轮次。</w:t>
+        <w:t>1．按照README安装依赖，在保管者电脑运行init生成新轮次。分发server目录、各人凭证；保留trustee目录和口令。</w:t>
       </w:r>
     </w:p>
     <w:p>
@@ -3307,13 +2924,7 @@
         <w:pStyle w:val="ReportBody"/>
       </w:pPr>
       <w:r>
-        <w:rPr>
-          <w:rFonts w:ascii="Times New Roman" w:hAnsi="Times New Roman" w:eastAsia="宋体"/>
-          <w:b w:val="0"/>
-          <w:color w:val="000000"/>
-          <w:sz w:val="24"/>
-        </w:rPr>
-        <w:t>2．提交V0001选票后再次提交同一ID，确认拒绝；输入UNKNOWN确认名单校验失败。</w:t>
+        <w:t>2．服务器运行serve指定目录、监听IP和端口。客户端启动默认界面，填写服务器IPv4地址和端口，导入本人凭证并连接。本机多端使用127.0.0.1。</w:t>
       </w:r>
     </w:p>
     <w:p>
@@ -3321,13 +2932,7 @@
         <w:pStyle w:val="ReportBody"/>
       </w:pPr>
       <w:r>
-        <w:rPr>
-          <w:rFonts w:ascii="Times New Roman" w:hAnsi="Times New Roman" w:eastAsia="宋体"/>
-          <w:b w:val="0"/>
-          <w:color w:val="000000"/>
-          <w:sz w:val="24"/>
-        </w:rPr>
-        <w:t>3．双击选票列表，展开详细信息查看密文JSON，确认公开文件不显示明文选择；关闭后验证新票不能提交。</w:t>
+        <w:t>3．使用不同ID依次或同时投票，记录纸面预期计数。重复ID、名单冒用和错误指纹应被拒绝，关闭前不能导出汇总。</w:t>
       </w:r>
     </w:p>
     <w:p>
@@ -3335,13 +2940,7 @@
         <w:pStyle w:val="ReportBody"/>
       </w:pPr>
       <w:r>
-        <w:rPr>
-          <w:rFonts w:ascii="Times New Roman" w:hAnsi="Times New Roman" w:eastAsia="宋体"/>
-          <w:b w:val="0"/>
-          <w:color w:val="000000"/>
-          <w:sz w:val="24"/>
-        </w:rPr>
-        <w:t>4．在审计页检查当前投票，应显示签名、摘要、ID及文件集合一致。</w:t>
+        <w:t>4．管理员关闭并导出密文汇总；保管端运行decrypt，输入本地口令，产生签名总票；管理员发布后，各端刷新核对结果。</w:t>
       </w:r>
     </w:p>
     <w:p>
@@ -3349,13 +2948,23 @@
         <w:pStyle w:val="ReportBody"/>
       </w:pPr>
       <w:r>
-        <w:rPr>
-          <w:rFonts w:ascii="Times New Roman" w:hAnsi="Times New Roman" w:eastAsia="宋体"/>
-          <w:b w:val="0"/>
-          <w:color w:val="000000"/>
-          <w:sz w:val="24"/>
-        </w:rPr>
-        <w:t>5．分别点击演示篡改检测和演示删除检测，确认临时副本被识别为异常，再检查原始投票仍然通过审计。</w:t>
+        <w:t>5．重新连接检查回执，重启服务器检查状态；再初始化不同人数和选项的新轮次。跨电脑时核对防火墙与网络互通，现场结果单独记录。</w:t>
+      </w:r>
+    </w:p>
+    <w:p>
+      <w:pPr>
+        <w:pStyle w:val="ReportH1"/>
+      </w:pPr>
+      <w:r>
+        <w:t>五、课题完成过程中遇到的问题及解决方法</w:t>
+      </w:r>
+    </w:p>
+    <w:p>
+      <w:pPr>
+        <w:pStyle w:val="ReportH2"/>
+      </w:pPr>
+      <w:r>
+        <w:t>5.1 原实现问题与本轮修正</w:t>
       </w:r>
     </w:p>
     <w:p>
@@ -3363,27 +2972,15 @@
         <w:pStyle w:val="ReportBody"/>
       </w:pPr>
       <w:r>
-        <w:rPr>
-          <w:rFonts w:ascii="Times New Roman" w:hAnsi="Times New Roman" w:eastAsia="宋体"/>
-          <w:b w:val="0"/>
-          <w:color w:val="000000"/>
-          <w:sz w:val="24"/>
-        </w:rPr>
-        <w:t>6．点击自动实验与性能测试并选择输出目录；检查CSV和JSON。随后在关闭应用、重新打开后验证持久化数据可以读取。</w:t>
-      </w:r>
-    </w:p>
-    <w:p>
-      <w:pPr>
-        <w:pStyle w:val="ReportH1"/>
-      </w:pPr>
-      <w:r>
-        <w:rPr>
-          <w:rFonts w:ascii="Times New Roman" w:hAnsi="Times New Roman" w:eastAsia="宋体"/>
-          <w:b/>
-          <w:color w:val="000000"/>
-          <w:sz w:val="28"/>
-        </w:rPr>
-        <w:t>五、课题完成过程中遇到的问题及解决方法</w:t>
+        <w:t>真实并发会暴露“先检查再写入”的竞态，不能只依赖界面禁用按钮。本轮用8个TLS客户端同时使用同一ID提交，实测只接受1次、其余7次收到冲突拒绝。首次测试还发现SQLite连接的with块只提交事务、不会关闭连接，导致Windows清理测试目录失败；补充显式关闭后全部回归通过。</w:t>
+      </w:r>
+    </w:p>
+    <w:p>
+      <w:pPr>
+        <w:pStyle w:val="ReportBody"/>
+      </w:pPr>
+      <w:r>
+        <w:t>单机阶段已有真实密码学运算，但没有网络收票服务器，因此原整体完成判断不充分。本次把联网架构作为主要实现，原单机入口仅保留为算法实验。实验记录和报告分别标注所属阶段，避免用旧单机测试证明多端可用。</w:t>
       </w:r>
     </w:p>
     <w:p>
@@ -3391,13 +2988,7 @@
         <w:pStyle w:val="ReportH2"/>
       </w:pPr>
       <w:r>
-        <w:rPr>
-          <w:rFonts w:ascii="Times New Roman" w:hAnsi="Times New Roman" w:eastAsia="宋体"/>
-          <w:b/>
-          <w:color w:val="000000"/>
-          <w:sz w:val="24"/>
-        </w:rPr>
-        <w:t>5.1 实验环境与记录来源</w:t>
+        <w:t>5.2 实验环境与结果</w:t>
       </w:r>
     </w:p>
     <w:p>
@@ -3405,15 +2996,7 @@
         <w:pStyle w:val="ReportBody"/>
       </w:pPr>
       <w:r>
-        <w:t>本轮实测日期为2026年10月27日（北京时间）。环境为Windows-11-10.0.26200-SP0，Python 3.12.14；phe 1.5.0、gmpy2 2.3.2、cryptography 50.0.2、PySide6-Essentials 6.12.0。核心实验使用2048位Paillier模数；9项工程回归使用1024位密钥加速边界检查，不作为安全强度示范。</w:t>
-      </w:r>
-    </w:p>
-    <w:p>
-      <w:pPr>
-        <w:pStyle w:val="ReportBody"/>
-      </w:pPr>
-      <w:r>
-        <w:t>自动核心实验29项全部符合预期，另有9项工程回归和原生Qt界面测试通过。原始记录位于evidence/2026-10-27/full/，包含JSON与CSV；源码SHA-256逐文件记入JSON。表2列出本模块相关结果。“局限”用例通过表示成功复现边界，不表示已防御。</w:t>
+        <w:t>本轮日期为2026年10月27日（北京时间），Windows 11 x64、Python 3.12.14，phe 1.5.0、gmpy2 2.3.2、cryptography 50.0.2、PySide6-Essentials 6.12.0。端到端验收采用2048位Paillier；18项联网边界测试使用1024位密钥加速，不作为安全强度示范。另有9项既有工程回归。</w:t>
       </w:r>
     </w:p>
     <w:p>
@@ -3422,126 +3005,90 @@
         <w:keepNext/>
       </w:pPr>
       <w:r>
-        <w:t>表2 本模块测试结果</w:t>
+        <w:t>表2 联网与交互验证结果</w:t>
       </w:r>
     </w:p>
     <w:tbl>
       <w:tblPr>
         <w:tblW w:type="auto" w:w="0"/>
-        <w:jc w:val="center"/>
         <w:tblLayout w:type="fixed"/>
         <w:tblLook w:firstColumn="1" w:firstRow="1" w:lastColumn="0" w:lastRow="0" w:noHBand="0" w:noVBand="1" w:val="04A0"/>
       </w:tblPr>
       <w:tblGrid>
-        <w:gridCol w:w="2551"/>
-        <w:gridCol w:w="6633"/>
+        <w:gridCol w:w="4677"/>
+        <w:gridCol w:w="4677"/>
       </w:tblGrid>
       <w:tr>
         <w:trPr>
           <w:tblHeader/>
-          <w:tblHeader/>
         </w:trPr>
         <w:tc>
           <w:tcPr>
-            <w:tcW w:type="dxa" w:w="2551"/>
-            <w:vAlign w:val="center"/>
-            <w:tcBorders>
-              <w:top w:val="single" w:sz="4" w:color="D9D9D9"/>
-              <w:left w:val="single" w:sz="4" w:color="D9D9D9"/>
-              <w:bottom w:val="single" w:sz="4" w:color="D9D9D9"/>
-              <w:right w:val="single" w:sz="4" w:color="D9D9D9"/>
-              <w:top w:val="single" w:sz="4" w:color="D9D9D9"/>
-              <w:left w:val="single" w:sz="4" w:color="D9D9D9"/>
-              <w:bottom w:val="single" w:sz="4" w:color="D9D9D9"/>
-              <w:right w:val="single" w:sz="4" w:color="D9D9D9"/>
-            </w:tcBorders>
-            <w:tcMar>
-              <w:top w:w="75" w:type="dxa"/>
-              <w:left w:w="75" w:type="dxa"/>
-              <w:bottom w:w="75" w:type="dxa"/>
-              <w:right w:w="75" w:type="dxa"/>
-            </w:tcMar>
-            <w:shd w:fill="E8EDF1"/>
-          </w:tcPr>
-          <w:p>
-            <w:pPr>
-              <w:spacing w:after="40" w:line="288" w:lineRule="auto" w:before="40"/>
-            </w:pPr>
-            <w:r>
-              <w:rPr>
-                <w:rFonts w:ascii="Times New Roman" w:hAnsi="Times New Roman" w:eastAsia="宋体"/>
-                <w:b/>
-                <w:color w:val="000000"/>
-                <w:sz w:val="21"/>
-              </w:rPr>
-              <w:t>实验项</w:t>
-            </w:r>
-          </w:p>
-        </w:tc>
-        <w:tc>
-          <w:tcPr>
-            <w:tcW w:type="dxa" w:w="6633"/>
-            <w:vAlign w:val="center"/>
-            <w:tcBorders>
-              <w:top w:val="single" w:sz="4" w:color="D9D9D9"/>
-              <w:left w:val="single" w:sz="4" w:color="D9D9D9"/>
-              <w:bottom w:val="single" w:sz="4" w:color="D9D9D9"/>
-              <w:right w:val="single" w:sz="4" w:color="D9D9D9"/>
-              <w:top w:val="single" w:sz="4" w:color="D9D9D9"/>
-              <w:left w:val="single" w:sz="4" w:color="D9D9D9"/>
-              <w:bottom w:val="single" w:sz="4" w:color="D9D9D9"/>
-              <w:right w:val="single" w:sz="4" w:color="D9D9D9"/>
-            </w:tcBorders>
-            <w:tcMar>
-              <w:top w:w="75" w:type="dxa"/>
-              <w:left w:w="75" w:type="dxa"/>
-              <w:bottom w:w="75" w:type="dxa"/>
-              <w:right w:w="75" w:type="dxa"/>
-            </w:tcMar>
-            <w:shd w:fill="E8EDF1"/>
-          </w:tcPr>
-          <w:p>
-            <w:pPr>
-              <w:spacing w:after="40" w:line="288" w:lineRule="auto" w:before="40"/>
-            </w:pPr>
-            <w:r>
-              <w:rPr>
-                <w:rFonts w:ascii="Times New Roman" w:hAnsi="Times New Roman" w:eastAsia="宋体"/>
-                <w:b/>
-                <w:color w:val="000000"/>
-                <w:sz w:val="21"/>
-              </w:rPr>
-              <w:t>实测结果</w:t>
+            <w:tcW w:type="dxa" w:w="2835"/>
+            <w:tcBorders>
+              <w:top w:val="single" w:sz="4" w:color="C9D4DF"/>
+              <w:left w:val="single" w:sz="4" w:color="C9D4DF"/>
+              <w:bottom w:val="single" w:sz="4" w:color="C9D4DF"/>
+              <w:right w:val="single" w:sz="4" w:color="C9D4DF"/>
+            </w:tcBorders>
+            <w:shd w:fill="E8EEF3"/>
+          </w:tcPr>
+          <w:p>
+            <w:pPr>
+              <w:spacing w:line="288" w:lineRule="auto" w:before="60" w:after="60"/>
+            </w:pPr>
+            <w:r>
+              <w:rPr>
+                <w:rFonts w:ascii="Times New Roman" w:hAnsi="Times New Roman" w:eastAsia="宋体"/>
+                <w:b/>
+                <w:color w:val="000000"/>
+                <w:sz w:val="21"/>
+              </w:rPr>
+              <w:t>项目</w:t>
+            </w:r>
+          </w:p>
+        </w:tc>
+        <w:tc>
+          <w:tcPr>
+            <w:tcW w:type="dxa" w:w="6009"/>
+            <w:tcBorders>
+              <w:top w:val="single" w:sz="4" w:color="C9D4DF"/>
+              <w:left w:val="single" w:sz="4" w:color="C9D4DF"/>
+              <w:bottom w:val="single" w:sz="4" w:color="C9D4DF"/>
+              <w:right w:val="single" w:sz="4" w:color="C9D4DF"/>
+            </w:tcBorders>
+            <w:shd w:fill="E8EEF3"/>
+          </w:tcPr>
+          <w:p>
+            <w:pPr>
+              <w:spacing w:line="288" w:lineRule="auto" w:before="60" w:after="60"/>
+            </w:pPr>
+            <w:r>
+              <w:rPr>
+                <w:rFonts w:ascii="Times New Roman" w:hAnsi="Times New Roman" w:eastAsia="宋体"/>
+                <w:b/>
+                <w:color w:val="000000"/>
+                <w:sz w:val="21"/>
+              </w:rPr>
+              <w:t>实际结果</w:t>
             </w:r>
           </w:p>
         </w:tc>
       </w:tr>
       <w:tr>
-        <w:trPr/>
-        <w:tc>
-          <w:tcPr>
-            <w:tcW w:type="dxa" w:w="2551"/>
-            <w:vAlign w:val="center"/>
-            <w:tcBorders>
-              <w:top w:val="single" w:sz="4" w:color="D9D9D9"/>
-              <w:left w:val="single" w:sz="4" w:color="D9D9D9"/>
-              <w:bottom w:val="single" w:sz="4" w:color="D9D9D9"/>
-              <w:right w:val="single" w:sz="4" w:color="D9D9D9"/>
-              <w:top w:val="single" w:sz="4" w:color="D9D9D9"/>
-              <w:left w:val="single" w:sz="4" w:color="D9D9D9"/>
-              <w:bottom w:val="single" w:sz="4" w:color="D9D9D9"/>
-              <w:right w:val="single" w:sz="4" w:color="D9D9D9"/>
-            </w:tcBorders>
-            <w:tcMar>
-              <w:top w:w="75" w:type="dxa"/>
-              <w:left w:w="75" w:type="dxa"/>
-              <w:bottom w:w="75" w:type="dxa"/>
-              <w:right w:w="75" w:type="dxa"/>
-            </w:tcMar>
-          </w:tcPr>
-          <w:p>
-            <w:pPr>
-              <w:spacing w:after="40" w:line="288" w:lineRule="auto" w:before="40"/>
+        <w:tc>
+          <w:tcPr>
+            <w:tcW w:type="dxa" w:w="2835"/>
+            <w:tcBorders>
+              <w:top w:val="single" w:sz="4" w:color="C9D4DF"/>
+              <w:left w:val="single" w:sz="4" w:color="C9D4DF"/>
+              <w:bottom w:val="single" w:sz="4" w:color="C9D4DF"/>
+              <w:right w:val="single" w:sz="4" w:color="C9D4DF"/>
+            </w:tcBorders>
+          </w:tcPr>
+          <w:p>
+            <w:pPr>
+              <w:spacing w:line="288" w:lineRule="auto" w:before="60" w:after="60"/>
             </w:pPr>
             <w:r>
               <w:rPr>
@@ -3550,34 +3097,23 @@
                 <w:color w:val="000000"/>
                 <w:sz w:val="21"/>
               </w:rPr>
-              <w:t>名单外ID拒绝</w:t>
-            </w:r>
-          </w:p>
-        </w:tc>
-        <w:tc>
-          <w:tcPr>
-            <w:tcW w:type="dxa" w:w="6633"/>
-            <w:vAlign w:val="center"/>
-            <w:tcBorders>
-              <w:top w:val="single" w:sz="4" w:color="D9D9D9"/>
-              <w:left w:val="single" w:sz="4" w:color="D9D9D9"/>
-              <w:bottom w:val="single" w:sz="4" w:color="D9D9D9"/>
-              <w:right w:val="single" w:sz="4" w:color="D9D9D9"/>
-              <w:top w:val="single" w:sz="4" w:color="D9D9D9"/>
-              <w:left w:val="single" w:sz="4" w:color="D9D9D9"/>
-              <w:bottom w:val="single" w:sz="4" w:color="D9D9D9"/>
-              <w:right w:val="single" w:sz="4" w:color="D9D9D9"/>
-            </w:tcBorders>
-            <w:tcMar>
-              <w:top w:w="75" w:type="dxa"/>
-              <w:left w:w="75" w:type="dxa"/>
-              <w:bottom w:w="75" w:type="dxa"/>
-              <w:right w:w="75" w:type="dxa"/>
-            </w:tcMar>
-          </w:tcPr>
-          <w:p>
-            <w:pPr>
-              <w:spacing w:after="40" w:line="288" w:lineRule="auto" w:before="40"/>
+              <w:t>TLS与权限、事务、完整性</w:t>
+            </w:r>
+          </w:p>
+        </w:tc>
+        <w:tc>
+          <w:tcPr>
+            <w:tcW w:type="dxa" w:w="6009"/>
+            <w:tcBorders>
+              <w:top w:val="single" w:sz="4" w:color="C9D4DF"/>
+              <w:left w:val="single" w:sz="4" w:color="C9D4DF"/>
+              <w:bottom w:val="single" w:sz="4" w:color="C9D4DF"/>
+              <w:right w:val="single" w:sz="4" w:color="C9D4DF"/>
+            </w:tcBorders>
+          </w:tcPr>
+          <w:p>
+            <w:pPr>
+              <w:spacing w:line="288" w:lineRule="auto" w:before="60" w:after="60"/>
             </w:pPr>
             <w:r>
               <w:rPr>
@@ -3586,37 +3122,25 @@
                 <w:color w:val="000000"/>
                 <w:sz w:val="21"/>
               </w:rPr>
-              <w:t>投票者ID不在授权名单内</w:t>
+              <w:t>18项联网测试＋9项回归全部通过</w:t>
             </w:r>
           </w:p>
         </w:tc>
       </w:tr>
       <w:tr>
-        <w:trPr/>
-        <w:tc>
-          <w:tcPr>
-            <w:tcW w:type="dxa" w:w="2551"/>
-            <w:vAlign w:val="center"/>
-            <w:tcBorders>
-              <w:top w:val="single" w:sz="4" w:color="D9D9D9"/>
-              <w:left w:val="single" w:sz="4" w:color="D9D9D9"/>
-              <w:bottom w:val="single" w:sz="4" w:color="D9D9D9"/>
-              <w:right w:val="single" w:sz="4" w:color="D9D9D9"/>
-              <w:top w:val="single" w:sz="4" w:color="D9D9D9"/>
-              <w:left w:val="single" w:sz="4" w:color="D9D9D9"/>
-              <w:bottom w:val="single" w:sz="4" w:color="D9D9D9"/>
-              <w:right w:val="single" w:sz="4" w:color="D9D9D9"/>
-            </w:tcBorders>
-            <w:tcMar>
-              <w:top w:w="75" w:type="dxa"/>
-              <w:left w:w="75" w:type="dxa"/>
-              <w:bottom w:w="75" w:type="dxa"/>
-              <w:right w:w="75" w:type="dxa"/>
-            </w:tcMar>
-          </w:tcPr>
-          <w:p>
-            <w:pPr>
-              <w:spacing w:after="40" w:line="288" w:lineRule="auto" w:before="40"/>
+        <w:tc>
+          <w:tcPr>
+            <w:tcW w:type="dxa" w:w="2835"/>
+            <w:tcBorders>
+              <w:top w:val="single" w:sz="4" w:color="C9D4DF"/>
+              <w:left w:val="single" w:sz="4" w:color="C9D4DF"/>
+              <w:bottom w:val="single" w:sz="4" w:color="C9D4DF"/>
+              <w:right w:val="single" w:sz="4" w:color="C9D4DF"/>
+            </w:tcBorders>
+          </w:tcPr>
+          <w:p>
+            <w:pPr>
+              <w:spacing w:line="288" w:lineRule="auto" w:before="60" w:after="60"/>
             </w:pPr>
             <w:r>
               <w:rPr>
@@ -3625,34 +3149,23 @@
                 <w:color w:val="000000"/>
                 <w:sz w:val="21"/>
               </w:rPr>
-              <w:t>重复投票拒绝</w:t>
-            </w:r>
-          </w:p>
-        </w:tc>
-        <w:tc>
-          <w:tcPr>
-            <w:tcW w:type="dxa" w:w="6633"/>
-            <w:vAlign w:val="center"/>
-            <w:tcBorders>
-              <w:top w:val="single" w:sz="4" w:color="D9D9D9"/>
-              <w:left w:val="single" w:sz="4" w:color="D9D9D9"/>
-              <w:bottom w:val="single" w:sz="4" w:color="D9D9D9"/>
-              <w:right w:val="single" w:sz="4" w:color="D9D9D9"/>
-              <w:top w:val="single" w:sz="4" w:color="D9D9D9"/>
-              <w:left w:val="single" w:sz="4" w:color="D9D9D9"/>
-              <w:bottom w:val="single" w:sz="4" w:color="D9D9D9"/>
-              <w:right w:val="single" w:sz="4" w:color="D9D9D9"/>
-            </w:tcBorders>
-            <w:tcMar>
-              <w:top w:w="75" w:type="dxa"/>
-              <w:left w:w="75" w:type="dxa"/>
-              <w:bottom w:w="75" w:type="dxa"/>
-              <w:right w:w="75" w:type="dxa"/>
-            </w:tcMar>
-          </w:tcPr>
-          <w:p>
-            <w:pPr>
-              <w:spacing w:after="40" w:line="288" w:lineRule="auto" w:before="40"/>
+              <w:t>6个独立客户端进程</w:t>
+            </w:r>
+          </w:p>
+        </w:tc>
+        <w:tc>
+          <w:tcPr>
+            <w:tcW w:type="dxa" w:w="6009"/>
+            <w:tcBorders>
+              <w:top w:val="single" w:sz="4" w:color="C9D4DF"/>
+              <w:left w:val="single" w:sz="4" w:color="C9D4DF"/>
+              <w:bottom w:val="single" w:sz="4" w:color="C9D4DF"/>
+              <w:right w:val="single" w:sz="4" w:color="C9D4DF"/>
+            </w:tcBorders>
+          </w:tcPr>
+          <w:p>
+            <w:pPr>
+              <w:spacing w:line="288" w:lineRule="auto" w:before="60" w:after="60"/>
             </w:pPr>
             <w:r>
               <w:rPr>
@@ -3661,37 +3174,25 @@
                 <w:color w:val="000000"/>
                 <w:sz w:val="21"/>
               </w:rPr>
-              <w:t>该ID已投票，拒绝重复提交</w:t>
+              <w:t>实际连接同一TLS端口，6票结果[3,2,1]</w:t>
             </w:r>
           </w:p>
         </w:tc>
       </w:tr>
       <w:tr>
-        <w:trPr/>
-        <w:tc>
-          <w:tcPr>
-            <w:tcW w:type="dxa" w:w="2551"/>
-            <w:vAlign w:val="center"/>
-            <w:tcBorders>
-              <w:top w:val="single" w:sz="4" w:color="D9D9D9"/>
-              <w:left w:val="single" w:sz="4" w:color="D9D9D9"/>
-              <w:bottom w:val="single" w:sz="4" w:color="D9D9D9"/>
-              <w:right w:val="single" w:sz="4" w:color="D9D9D9"/>
-              <w:top w:val="single" w:sz="4" w:color="D9D9D9"/>
-              <w:left w:val="single" w:sz="4" w:color="D9D9D9"/>
-              <w:bottom w:val="single" w:sz="4" w:color="D9D9D9"/>
-              <w:right w:val="single" w:sz="4" w:color="D9D9D9"/>
-            </w:tcBorders>
-            <w:tcMar>
-              <w:top w:w="75" w:type="dxa"/>
-              <w:left w:w="75" w:type="dxa"/>
-              <w:bottom w:w="75" w:type="dxa"/>
-              <w:right w:w="75" w:type="dxa"/>
-            </w:tcMar>
-          </w:tcPr>
-          <w:p>
-            <w:pPr>
-              <w:spacing w:after="40" w:line="288" w:lineRule="auto" w:before="40"/>
+        <w:tc>
+          <w:tcPr>
+            <w:tcW w:type="dxa" w:w="2835"/>
+            <w:tcBorders>
+              <w:top w:val="single" w:sz="4" w:color="C9D4DF"/>
+              <w:left w:val="single" w:sz="4" w:color="C9D4DF"/>
+              <w:bottom w:val="single" w:sz="4" w:color="C9D4DF"/>
+              <w:right w:val="single" w:sz="4" w:color="C9D4DF"/>
+            </w:tcBorders>
+          </w:tcPr>
+          <w:p>
+            <w:pPr>
+              <w:spacing w:line="288" w:lineRule="auto" w:before="60" w:after="60"/>
             </w:pPr>
             <w:r>
               <w:rPr>
@@ -3700,34 +3201,23 @@
                 <w:color w:val="000000"/>
                 <w:sz w:val="21"/>
               </w:rPr>
-              <w:t>关闭后禁止新票</w:t>
-            </w:r>
-          </w:p>
-        </w:tc>
-        <w:tc>
-          <w:tcPr>
-            <w:tcW w:type="dxa" w:w="6633"/>
-            <w:vAlign w:val="center"/>
-            <w:tcBorders>
-              <w:top w:val="single" w:sz="4" w:color="D9D9D9"/>
-              <w:left w:val="single" w:sz="4" w:color="D9D9D9"/>
-              <w:bottom w:val="single" w:sz="4" w:color="D9D9D9"/>
-              <w:right w:val="single" w:sz="4" w:color="D9D9D9"/>
-              <w:top w:val="single" w:sz="4" w:color="D9D9D9"/>
-              <w:left w:val="single" w:sz="4" w:color="D9D9D9"/>
-              <w:bottom w:val="single" w:sz="4" w:color="D9D9D9"/>
-              <w:right w:val="single" w:sz="4" w:color="D9D9D9"/>
-            </w:tcBorders>
-            <w:tcMar>
-              <w:top w:w="75" w:type="dxa"/>
-              <w:left w:w="75" w:type="dxa"/>
-              <w:bottom w:w="75" w:type="dxa"/>
-              <w:right w:w="75" w:type="dxa"/>
-            </w:tcMar>
-          </w:tcPr>
-          <w:p>
-            <w:pPr>
-              <w:spacing w:after="40" w:line="288" w:lineRule="auto" w:before="40"/>
+              <w:t>同一ID并发8次</w:t>
+            </w:r>
+          </w:p>
+        </w:tc>
+        <w:tc>
+          <w:tcPr>
+            <w:tcW w:type="dxa" w:w="6009"/>
+            <w:tcBorders>
+              <w:top w:val="single" w:sz="4" w:color="C9D4DF"/>
+              <w:left w:val="single" w:sz="4" w:color="C9D4DF"/>
+              <w:bottom w:val="single" w:sz="4" w:color="C9D4DF"/>
+              <w:right w:val="single" w:sz="4" w:color="C9D4DF"/>
+            </w:tcBorders>
+          </w:tcPr>
+          <w:p>
+            <w:pPr>
+              <w:spacing w:line="288" w:lineRule="auto" w:before="60" w:after="60"/>
             </w:pPr>
             <w:r>
               <w:rPr>
@@ -3736,37 +3226,25 @@
                 <w:color w:val="000000"/>
                 <w:sz w:val="21"/>
               </w:rPr>
-              <w:t>投票已关闭，不能提交新票</w:t>
+              <w:t>只接受1次，其余7次拒绝</w:t>
             </w:r>
           </w:p>
         </w:tc>
       </w:tr>
       <w:tr>
-        <w:trPr/>
-        <w:tc>
-          <w:tcPr>
-            <w:tcW w:type="dxa" w:w="2551"/>
-            <w:vAlign w:val="center"/>
-            <w:tcBorders>
-              <w:top w:val="single" w:sz="4" w:color="D9D9D9"/>
-              <w:left w:val="single" w:sz="4" w:color="D9D9D9"/>
-              <w:bottom w:val="single" w:sz="4" w:color="D9D9D9"/>
-              <w:right w:val="single" w:sz="4" w:color="D9D9D9"/>
-              <w:top w:val="single" w:sz="4" w:color="D9D9D9"/>
-              <w:left w:val="single" w:sz="4" w:color="D9D9D9"/>
-              <w:bottom w:val="single" w:sz="4" w:color="D9D9D9"/>
-              <w:right w:val="single" w:sz="4" w:color="D9D9D9"/>
-            </w:tcBorders>
-            <w:tcMar>
-              <w:top w:w="75" w:type="dxa"/>
-              <w:left w:w="75" w:type="dxa"/>
-              <w:bottom w:w="75" w:type="dxa"/>
-              <w:right w:w="75" w:type="dxa"/>
-            </w:tcMar>
-          </w:tcPr>
-          <w:p>
-            <w:pPr>
-              <w:spacing w:after="40" w:line="288" w:lineRule="auto" w:before="40"/>
+        <w:tc>
+          <w:tcPr>
+            <w:tcW w:type="dxa" w:w="2835"/>
+            <w:tcBorders>
+              <w:top w:val="single" w:sz="4" w:color="C9D4DF"/>
+              <w:left w:val="single" w:sz="4" w:color="C9D4DF"/>
+              <w:bottom w:val="single" w:sz="4" w:color="C9D4DF"/>
+              <w:right w:val="single" w:sz="4" w:color="C9D4DF"/>
+            </w:tcBorders>
+          </w:tcPr>
+          <w:p>
+            <w:pPr>
+              <w:spacing w:line="288" w:lineRule="auto" w:before="60" w:after="60"/>
             </w:pPr>
             <w:r>
               <w:rPr>
@@ -3775,34 +3253,23 @@
                 <w:color w:val="000000"/>
                 <w:sz w:val="21"/>
               </w:rPr>
-              <w:t>重启加载</w:t>
-            </w:r>
-          </w:p>
-        </w:tc>
-        <w:tc>
-          <w:tcPr>
-            <w:tcW w:type="dxa" w:w="6633"/>
-            <w:vAlign w:val="center"/>
-            <w:tcBorders>
-              <w:top w:val="single" w:sz="4" w:color="D9D9D9"/>
-              <w:left w:val="single" w:sz="4" w:color="D9D9D9"/>
-              <w:bottom w:val="single" w:sz="4" w:color="D9D9D9"/>
-              <w:right w:val="single" w:sz="4" w:color="D9D9D9"/>
-              <w:top w:val="single" w:sz="4" w:color="D9D9D9"/>
-              <w:left w:val="single" w:sz="4" w:color="D9D9D9"/>
-              <w:bottom w:val="single" w:sz="4" w:color="D9D9D9"/>
-              <w:right w:val="single" w:sz="4" w:color="D9D9D9"/>
-            </w:tcBorders>
-            <w:tcMar>
-              <w:top w:w="75" w:type="dxa"/>
-              <w:left w:w="75" w:type="dxa"/>
-              <w:bottom w:w="75" w:type="dxa"/>
-              <w:right w:w="75" w:type="dxa"/>
-            </w:tcMar>
-          </w:tcPr>
-          <w:p>
-            <w:pPr>
-              <w:spacing w:after="40" w:line="288" w:lineRule="auto" w:before="40"/>
+              <w:t>凭证冒用、错误指纹</w:t>
+            </w:r>
+          </w:p>
+        </w:tc>
+        <w:tc>
+          <w:tcPr>
+            <w:tcW w:type="dxa" w:w="6009"/>
+            <w:tcBorders>
+              <w:top w:val="single" w:sz="4" w:color="C9D4DF"/>
+              <w:left w:val="single" w:sz="4" w:color="C9D4DF"/>
+              <w:bottom w:val="single" w:sz="4" w:color="C9D4DF"/>
+              <w:right w:val="single" w:sz="4" w:color="C9D4DF"/>
+            </w:tcBorders>
+          </w:tcPr>
+          <w:p>
+            <w:pPr>
+              <w:spacing w:line="288" w:lineRule="auto" w:before="60" w:after="60"/>
             </w:pPr>
             <w:r>
               <w:rPr>
@@ -3811,37 +3278,25 @@
                 <w:color w:val="000000"/>
                 <w:sz w:val="21"/>
               </w:rPr>
-              <w:t>重启后只读载入成功</w:t>
+              <w:t>被拒绝；指纹失败时未发送票码</w:t>
             </w:r>
           </w:p>
         </w:tc>
       </w:tr>
       <w:tr>
-        <w:trPr/>
-        <w:tc>
-          <w:tcPr>
-            <w:tcW w:type="dxa" w:w="2551"/>
-            <w:vAlign w:val="center"/>
-            <w:tcBorders>
-              <w:top w:val="single" w:sz="4" w:color="D9D9D9"/>
-              <w:left w:val="single" w:sz="4" w:color="D9D9D9"/>
-              <w:bottom w:val="single" w:sz="4" w:color="D9D9D9"/>
-              <w:right w:val="single" w:sz="4" w:color="D9D9D9"/>
-              <w:top w:val="single" w:sz="4" w:color="D9D9D9"/>
-              <w:left w:val="single" w:sz="4" w:color="D9D9D9"/>
-              <w:bottom w:val="single" w:sz="4" w:color="D9D9D9"/>
-              <w:right w:val="single" w:sz="4" w:color="D9D9D9"/>
-            </w:tcBorders>
-            <w:tcMar>
-              <w:top w:w="75" w:type="dxa"/>
-              <w:left w:w="75" w:type="dxa"/>
-              <w:bottom w:w="75" w:type="dxa"/>
-              <w:right w:w="75" w:type="dxa"/>
-            </w:tcMar>
-          </w:tcPr>
-          <w:p>
-            <w:pPr>
-              <w:spacing w:after="40" w:line="288" w:lineRule="auto" w:before="40"/>
+        <w:tc>
+          <w:tcPr>
+            <w:tcW w:type="dxa" w:w="2835"/>
+            <w:tcBorders>
+              <w:top w:val="single" w:sz="4" w:color="C9D4DF"/>
+              <w:left w:val="single" w:sz="4" w:color="C9D4DF"/>
+              <w:bottom w:val="single" w:sz="4" w:color="C9D4DF"/>
+              <w:right w:val="single" w:sz="4" w:color="C9D4DF"/>
+            </w:tcBorders>
+          </w:tcPr>
+          <w:p>
+            <w:pPr>
+              <w:spacing w:line="288" w:lineRule="auto" w:before="60" w:after="60"/>
             </w:pPr>
             <w:r>
               <w:rPr>
@@ -3850,34 +3305,23 @@
                 <w:color w:val="000000"/>
                 <w:sz w:val="21"/>
               </w:rPr>
-              <w:t>删除选票检测</w:t>
-            </w:r>
-          </w:p>
-        </w:tc>
-        <w:tc>
-          <w:tcPr>
-            <w:tcW w:type="dxa" w:w="6633"/>
-            <w:vAlign w:val="center"/>
-            <w:tcBorders>
-              <w:top w:val="single" w:sz="4" w:color="D9D9D9"/>
-              <w:left w:val="single" w:sz="4" w:color="D9D9D9"/>
-              <w:bottom w:val="single" w:sz="4" w:color="D9D9D9"/>
-              <w:right w:val="single" w:sz="4" w:color="D9D9D9"/>
-              <w:top w:val="single" w:sz="4" w:color="D9D9D9"/>
-              <w:left w:val="single" w:sz="4" w:color="D9D9D9"/>
-              <w:bottom w:val="single" w:sz="4" w:color="D9D9D9"/>
-              <w:right w:val="single" w:sz="4" w:color="D9D9D9"/>
-            </w:tcBorders>
-            <w:tcMar>
-              <w:top w:w="75" w:type="dxa"/>
-              <w:left w:w="75" w:type="dxa"/>
-              <w:bottom w:w="75" w:type="dxa"/>
-              <w:right w:w="75" w:type="dxa"/>
-            </w:tcMar>
-          </w:tcPr>
-          <w:p>
-            <w:pPr>
-              <w:spacing w:after="40" w:line="288" w:lineRule="auto" w:before="40"/>
+              <w:t>错误口令、部分汇总、伪造结果</w:t>
+            </w:r>
+          </w:p>
+        </w:tc>
+        <w:tc>
+          <w:tcPr>
+            <w:tcW w:type="dxa" w:w="6009"/>
+            <w:tcBorders>
+              <w:top w:val="single" w:sz="4" w:color="C9D4DF"/>
+              <w:left w:val="single" w:sz="4" w:color="C9D4DF"/>
+              <w:bottom w:val="single" w:sz="4" w:color="C9D4DF"/>
+              <w:right w:val="single" w:sz="4" w:color="C9D4DF"/>
+            </w:tcBorders>
+          </w:tcPr>
+          <w:p>
+            <w:pPr>
+              <w:spacing w:line="288" w:lineRule="auto" w:before="60" w:after="60"/>
             </w:pPr>
             <w:r>
               <w:rPr>
@@ -3886,37 +3330,25 @@
                 <w:color w:val="000000"/>
                 <w:sz w:val="21"/>
               </w:rPr>
-              <w:t>发现选票被删除：V0004</w:t>
+              <w:t>被拒绝，不发布错误总票</w:t>
             </w:r>
           </w:p>
         </w:tc>
       </w:tr>
       <w:tr>
-        <w:trPr/>
-        <w:tc>
-          <w:tcPr>
-            <w:tcW w:type="dxa" w:w="2551"/>
-            <w:vAlign w:val="center"/>
-            <w:tcBorders>
-              <w:top w:val="single" w:sz="4" w:color="D9D9D9"/>
-              <w:left w:val="single" w:sz="4" w:color="D9D9D9"/>
-              <w:bottom w:val="single" w:sz="4" w:color="D9D9D9"/>
-              <w:right w:val="single" w:sz="4" w:color="D9D9D9"/>
-              <w:top w:val="single" w:sz="4" w:color="D9D9D9"/>
-              <w:left w:val="single" w:sz="4" w:color="D9D9D9"/>
-              <w:bottom w:val="single" w:sz="4" w:color="D9D9D9"/>
-              <w:right w:val="single" w:sz="4" w:color="D9D9D9"/>
-            </w:tcBorders>
-            <w:tcMar>
-              <w:top w:w="75" w:type="dxa"/>
-              <w:left w:w="75" w:type="dxa"/>
-              <w:bottom w:w="75" w:type="dxa"/>
-              <w:right w:w="75" w:type="dxa"/>
-            </w:tcMar>
-          </w:tcPr>
-          <w:p>
-            <w:pPr>
-              <w:spacing w:after="40" w:line="288" w:lineRule="auto" w:before="40"/>
+        <w:tc>
+          <w:tcPr>
+            <w:tcW w:type="dxa" w:w="2835"/>
+            <w:tcBorders>
+              <w:top w:val="single" w:sz="4" w:color="C9D4DF"/>
+              <w:left w:val="single" w:sz="4" w:color="C9D4DF"/>
+              <w:bottom w:val="single" w:sz="4" w:color="C9D4DF"/>
+              <w:right w:val="single" w:sz="4" w:color="C9D4DF"/>
+            </w:tcBorders>
+          </w:tcPr>
+          <w:p>
+            <w:pPr>
+              <w:spacing w:line="288" w:lineRule="auto" w:before="60" w:after="60"/>
             </w:pPr>
             <w:r>
               <w:rPr>
@@ -3925,34 +3357,23 @@
                 <w:color w:val="000000"/>
                 <w:sz w:val="21"/>
               </w:rPr>
-              <w:t>篡改选票检测</w:t>
-            </w:r>
-          </w:p>
-        </w:tc>
-        <w:tc>
-          <w:tcPr>
-            <w:tcW w:type="dxa" w:w="6633"/>
-            <w:vAlign w:val="center"/>
-            <w:tcBorders>
-              <w:top w:val="single" w:sz="4" w:color="D9D9D9"/>
-              <w:left w:val="single" w:sz="4" w:color="D9D9D9"/>
-              <w:bottom w:val="single" w:sz="4" w:color="D9D9D9"/>
-              <w:right w:val="single" w:sz="4" w:color="D9D9D9"/>
-              <w:top w:val="single" w:sz="4" w:color="D9D9D9"/>
-              <w:left w:val="single" w:sz="4" w:color="D9D9D9"/>
-              <w:bottom w:val="single" w:sz="4" w:color="D9D9D9"/>
-              <w:right w:val="single" w:sz="4" w:color="D9D9D9"/>
-            </w:tcBorders>
-            <w:tcMar>
-              <w:top w:w="75" w:type="dxa"/>
-              <w:left w:w="75" w:type="dxa"/>
-              <w:bottom w:w="75" w:type="dxa"/>
-              <w:right w:w="75" w:type="dxa"/>
-            </w:tcMar>
-          </w:tcPr>
-          <w:p>
-            <w:pPr>
-              <w:spacing w:after="40" w:line="288" w:lineRule="auto" w:before="40"/>
+              <w:t>两窗口实际Qt控件</w:t>
+            </w:r>
+          </w:p>
+        </w:tc>
+        <w:tc>
+          <w:tcPr>
+            <w:tcW w:type="dxa" w:w="6009"/>
+            <w:tcBorders>
+              <w:top w:val="single" w:sz="4" w:color="C9D4DF"/>
+              <w:left w:val="single" w:sz="4" w:color="C9D4DF"/>
+              <w:bottom w:val="single" w:sz="4" w:color="C9D4DF"/>
+              <w:right w:val="single" w:sz="4" w:color="C9D4DF"/>
+            </w:tcBorders>
+          </w:tcPr>
+          <w:p>
+            <w:pPr>
+              <w:spacing w:line="288" w:lineRule="auto" w:before="60" w:after="60"/>
             </w:pPr>
             <w:r>
               <w:rPr>
@@ -3961,37 +3382,25 @@
                 <w:color w:val="000000"/>
                 <w:sz w:val="21"/>
               </w:rPr>
-              <w:t>发现选票被篡改：V0004</w:t>
+              <w:t>6次投票，回执与公开结果验签通过</w:t>
             </w:r>
           </w:p>
         </w:tc>
       </w:tr>
       <w:tr>
-        <w:trPr/>
-        <w:tc>
-          <w:tcPr>
-            <w:tcW w:type="dxa" w:w="2551"/>
-            <w:vAlign w:val="center"/>
-            <w:tcBorders>
-              <w:top w:val="single" w:sz="4" w:color="D9D9D9"/>
-              <w:left w:val="single" w:sz="4" w:color="D9D9D9"/>
-              <w:bottom w:val="single" w:sz="4" w:color="D9D9D9"/>
-              <w:right w:val="single" w:sz="4" w:color="D9D9D9"/>
-              <w:top w:val="single" w:sz="4" w:color="D9D9D9"/>
-              <w:left w:val="single" w:sz="4" w:color="D9D9D9"/>
-              <w:bottom w:val="single" w:sz="4" w:color="D9D9D9"/>
-              <w:right w:val="single" w:sz="4" w:color="D9D9D9"/>
-            </w:tcBorders>
-            <w:tcMar>
-              <w:top w:w="75" w:type="dxa"/>
-              <w:left w:w="75" w:type="dxa"/>
-              <w:bottom w:w="75" w:type="dxa"/>
-              <w:right w:w="75" w:type="dxa"/>
-            </w:tcMar>
-          </w:tcPr>
-          <w:p>
-            <w:pPr>
-              <w:spacing w:after="40" w:line="288" w:lineRule="auto" w:before="40"/>
+        <w:tc>
+          <w:tcPr>
+            <w:tcW w:type="dxa" w:w="2835"/>
+            <w:tcBorders>
+              <w:top w:val="single" w:sz="4" w:color="C9D4DF"/>
+              <w:left w:val="single" w:sz="4" w:color="C9D4DF"/>
+              <w:bottom w:val="single" w:sz="4" w:color="C9D4DF"/>
+              <w:right w:val="single" w:sz="4" w:color="C9D4DF"/>
+            </w:tcBorders>
+          </w:tcPr>
+          <w:p>
+            <w:pPr>
+              <w:spacing w:line="288" w:lineRule="auto" w:before="60" w:after="60"/>
             </w:pPr>
             <w:r>
               <w:rPr>
@@ -4000,34 +3409,23 @@
                 <w:color w:val="000000"/>
                 <w:sz w:val="21"/>
               </w:rPr>
-              <w:t>清单篡改检测</w:t>
-            </w:r>
-          </w:p>
-        </w:tc>
-        <w:tc>
-          <w:tcPr>
-            <w:tcW w:type="dxa" w:w="6633"/>
-            <w:vAlign w:val="center"/>
-            <w:tcBorders>
-              <w:top w:val="single" w:sz="4" w:color="D9D9D9"/>
-              <w:left w:val="single" w:sz="4" w:color="D9D9D9"/>
-              <w:bottom w:val="single" w:sz="4" w:color="D9D9D9"/>
-              <w:right w:val="single" w:sz="4" w:color="D9D9D9"/>
-              <w:top w:val="single" w:sz="4" w:color="D9D9D9"/>
-              <w:left w:val="single" w:sz="4" w:color="D9D9D9"/>
-              <w:bottom w:val="single" w:sz="4" w:color="D9D9D9"/>
-              <w:right w:val="single" w:sz="4" w:color="D9D9D9"/>
-            </w:tcBorders>
-            <w:tcMar>
-              <w:top w:w="75" w:type="dxa"/>
-              <w:left w:w="75" w:type="dxa"/>
-              <w:bottom w:w="75" w:type="dxa"/>
-              <w:right w:w="75" w:type="dxa"/>
-            </w:tcMar>
-          </w:tcPr>
-          <w:p>
-            <w:pPr>
-              <w:spacing w:after="40" w:line="288" w:lineRule="auto" w:before="40"/>
+              <w:t>服务重启</w:t>
+            </w:r>
+          </w:p>
+        </w:tc>
+        <w:tc>
+          <w:tcPr>
+            <w:tcW w:type="dxa" w:w="6009"/>
+            <w:tcBorders>
+              <w:top w:val="single" w:sz="4" w:color="C9D4DF"/>
+              <w:left w:val="single" w:sz="4" w:color="C9D4DF"/>
+              <w:bottom w:val="single" w:sz="4" w:color="C9D4DF"/>
+              <w:right w:val="single" w:sz="4" w:color="C9D4DF"/>
+            </w:tcBorders>
+          </w:tcPr>
+          <w:p>
+            <w:pPr>
+              <w:spacing w:line="288" w:lineRule="auto" w:before="60" w:after="60"/>
             </w:pPr>
             <w:r>
               <w:rPr>
@@ -4036,267 +3434,7 @@
                 <w:color w:val="000000"/>
                 <w:sz w:val="21"/>
               </w:rPr>
-              <w:t>清单签名无效，配置或清单可能被修改</w:t>
-            </w:r>
-          </w:p>
-        </w:tc>
-      </w:tr>
-      <w:tr>
-        <w:trPr/>
-        <w:tc>
-          <w:tcPr>
-            <w:tcW w:type="dxa" w:w="2551"/>
-            <w:vAlign w:val="center"/>
-            <w:tcBorders>
-              <w:top w:val="single" w:sz="4" w:color="D9D9D9"/>
-              <w:left w:val="single" w:sz="4" w:color="D9D9D9"/>
-              <w:bottom w:val="single" w:sz="4" w:color="D9D9D9"/>
-              <w:right w:val="single" w:sz="4" w:color="D9D9D9"/>
-              <w:top w:val="single" w:sz="4" w:color="D9D9D9"/>
-              <w:left w:val="single" w:sz="4" w:color="D9D9D9"/>
-              <w:bottom w:val="single" w:sz="4" w:color="D9D9D9"/>
-              <w:right w:val="single" w:sz="4" w:color="D9D9D9"/>
-            </w:tcBorders>
-            <w:tcMar>
-              <w:top w:w="75" w:type="dxa"/>
-              <w:left w:w="75" w:type="dxa"/>
-              <w:bottom w:w="75" w:type="dxa"/>
-              <w:right w:w="75" w:type="dxa"/>
-            </w:tcMar>
-          </w:tcPr>
-          <w:p>
-            <w:pPr>
-              <w:spacing w:after="40" w:line="288" w:lineRule="auto" w:before="40"/>
-            </w:pPr>
-            <w:r>
-              <w:rPr>
-                <w:rFonts w:ascii="Times New Roman" w:hAnsi="Times New Roman" w:eastAsia="宋体"/>
-                <w:b w:val="0"/>
-                <w:color w:val="000000"/>
-                <w:sz w:val="21"/>
-              </w:rPr>
-              <w:t>配置篡改检测</w:t>
-            </w:r>
-          </w:p>
-        </w:tc>
-        <w:tc>
-          <w:tcPr>
-            <w:tcW w:type="dxa" w:w="6633"/>
-            <w:vAlign w:val="center"/>
-            <w:tcBorders>
-              <w:top w:val="single" w:sz="4" w:color="D9D9D9"/>
-              <w:left w:val="single" w:sz="4" w:color="D9D9D9"/>
-              <w:bottom w:val="single" w:sz="4" w:color="D9D9D9"/>
-              <w:right w:val="single" w:sz="4" w:color="D9D9D9"/>
-              <w:top w:val="single" w:sz="4" w:color="D9D9D9"/>
-              <w:left w:val="single" w:sz="4" w:color="D9D9D9"/>
-              <w:bottom w:val="single" w:sz="4" w:color="D9D9D9"/>
-              <w:right w:val="single" w:sz="4" w:color="D9D9D9"/>
-            </w:tcBorders>
-            <w:tcMar>
-              <w:top w:w="75" w:type="dxa"/>
-              <w:left w:w="75" w:type="dxa"/>
-              <w:bottom w:w="75" w:type="dxa"/>
-              <w:right w:w="75" w:type="dxa"/>
-            </w:tcMar>
-          </w:tcPr>
-          <w:p>
-            <w:pPr>
-              <w:spacing w:after="40" w:line="288" w:lineRule="auto" w:before="40"/>
-            </w:pPr>
-            <w:r>
-              <w:rPr>
-                <w:rFonts w:ascii="Times New Roman" w:hAnsi="Times New Roman" w:eastAsia="宋体"/>
-                <w:b w:val="0"/>
-                <w:color w:val="000000"/>
-                <w:sz w:val="21"/>
-              </w:rPr>
-              <w:t>配置摘要或投票轮次不匹配</w:t>
-            </w:r>
-          </w:p>
-        </w:tc>
-      </w:tr>
-      <w:tr>
-        <w:trPr/>
-        <w:tc>
-          <w:tcPr>
-            <w:tcW w:type="dxa" w:w="2551"/>
-            <w:vAlign w:val="center"/>
-            <w:tcBorders>
-              <w:top w:val="single" w:sz="4" w:color="D9D9D9"/>
-              <w:left w:val="single" w:sz="4" w:color="D9D9D9"/>
-              <w:bottom w:val="single" w:sz="4" w:color="D9D9D9"/>
-              <w:right w:val="single" w:sz="4" w:color="D9D9D9"/>
-              <w:top w:val="single" w:sz="4" w:color="D9D9D9"/>
-              <w:left w:val="single" w:sz="4" w:color="D9D9D9"/>
-              <w:bottom w:val="single" w:sz="4" w:color="D9D9D9"/>
-              <w:right w:val="single" w:sz="4" w:color="D9D9D9"/>
-            </w:tcBorders>
-            <w:tcMar>
-              <w:top w:w="75" w:type="dxa"/>
-              <w:left w:w="75" w:type="dxa"/>
-              <w:bottom w:w="75" w:type="dxa"/>
-              <w:right w:w="75" w:type="dxa"/>
-            </w:tcMar>
-          </w:tcPr>
-          <w:p>
-            <w:pPr>
-              <w:spacing w:after="40" w:line="288" w:lineRule="auto" w:before="40"/>
-            </w:pPr>
-            <w:r>
-              <w:rPr>
-                <w:rFonts w:ascii="Times New Roman" w:hAnsi="Times New Roman" w:eastAsia="宋体"/>
-                <w:b w:val="0"/>
-                <w:color w:val="000000"/>
-                <w:sz w:val="21"/>
-              </w:rPr>
-              <w:t>完整回滚局限验证</w:t>
-            </w:r>
-          </w:p>
-        </w:tc>
-        <w:tc>
-          <w:tcPr>
-            <w:tcW w:type="dxa" w:w="6633"/>
-            <w:vAlign w:val="center"/>
-            <w:tcBorders>
-              <w:top w:val="single" w:sz="4" w:color="D9D9D9"/>
-              <w:left w:val="single" w:sz="4" w:color="D9D9D9"/>
-              <w:bottom w:val="single" w:sz="4" w:color="D9D9D9"/>
-              <w:right w:val="single" w:sz="4" w:color="D9D9D9"/>
-              <w:top w:val="single" w:sz="4" w:color="D9D9D9"/>
-              <w:left w:val="single" w:sz="4" w:color="D9D9D9"/>
-              <w:bottom w:val="single" w:sz="4" w:color="D9D9D9"/>
-              <w:right w:val="single" w:sz="4" w:color="D9D9D9"/>
-            </w:tcBorders>
-            <w:tcMar>
-              <w:top w:w="75" w:type="dxa"/>
-              <w:left w:w="75" w:type="dxa"/>
-              <w:bottom w:w="75" w:type="dxa"/>
-              <w:right w:w="75" w:type="dxa"/>
-            </w:tcMar>
-          </w:tcPr>
-          <w:p>
-            <w:pPr>
-              <w:spacing w:after="40" w:line="288" w:lineRule="auto" w:before="40"/>
-            </w:pPr>
-            <w:r>
-              <w:rPr>
-                <w:rFonts w:ascii="Times New Roman" w:hAnsi="Times New Roman" w:eastAsia="宋体"/>
-                <w:b w:val="0"/>
-                <w:color w:val="000000"/>
-                <w:sz w:val="21"/>
-              </w:rPr>
-              <w:t>局限确认：</w:t>
-              <w:br/>
-              <w:t>整套数据回滚到旧有效签名状态</w:t>
-              <w:br/>
-              <w:t>无法被本地审计识别</w:t>
-            </w:r>
-          </w:p>
-        </w:tc>
-      </w:tr>
-      <w:tr>
-        <w:trPr/>
-        <w:tc>
-          <w:tcPr>
-            <w:tcW w:type="dxa" w:w="2551"/>
-            <w:tcBorders>
-              <w:top w:val="single" w:sz="4" w:color="D9D9D9"/>
-              <w:left w:val="single" w:sz="4" w:color="D9D9D9"/>
-              <w:bottom w:val="single" w:sz="4" w:color="D9D9D9"/>
-              <w:right w:val="single" w:sz="4" w:color="D9D9D9"/>
-            </w:tcBorders>
-          </w:tcPr>
-          <w:p>
-            <w:pPr>
-              <w:spacing w:line="288" w:lineRule="auto" w:after="40" w:before="40"/>
-            </w:pPr>
-            <w:r>
-              <w:rPr>
-                <w:rFonts w:ascii="Times New Roman" w:hAnsi="Times New Roman" w:eastAsia="宋体"/>
-                <w:b w:val="0"/>
-                <w:color w:val="000000"/>
-                <w:sz w:val="21"/>
-              </w:rPr>
-              <w:t>公开包白名单回归</w:t>
-            </w:r>
-          </w:p>
-        </w:tc>
-        <w:tc>
-          <w:tcPr>
-            <w:tcW w:type="dxa" w:w="6633"/>
-            <w:tcBorders>
-              <w:top w:val="single" w:sz="4" w:color="D9D9D9"/>
-              <w:left w:val="single" w:sz="4" w:color="D9D9D9"/>
-              <w:bottom w:val="single" w:sz="4" w:color="D9D9D9"/>
-              <w:right w:val="single" w:sz="4" w:color="D9D9D9"/>
-            </w:tcBorders>
-          </w:tcPr>
-          <w:p>
-            <w:pPr>
-              <w:spacing w:line="288" w:lineRule="auto" w:after="40" w:before="40"/>
-            </w:pPr>
-            <w:r>
-              <w:rPr>
-                <w:rFonts w:ascii="Times New Roman" w:hAnsi="Times New Roman" w:eastAsia="宋体"/>
-                <w:b w:val="0"/>
-                <w:color w:val="000000"/>
-                <w:sz w:val="21"/>
-              </w:rPr>
-              <w:t>无关JSON不进入ZIP，无私钥目录仍可复算相同汇总</w:t>
-            </w:r>
-          </w:p>
-        </w:tc>
-      </w:tr>
-      <w:tr>
-        <w:trPr/>
-        <w:tc>
-          <w:tcPr>
-            <w:tcW w:type="dxa" w:w="2551"/>
-            <w:tcBorders>
-              <w:top w:val="single" w:sz="4" w:color="D9D9D9"/>
-              <w:left w:val="single" w:sz="4" w:color="D9D9D9"/>
-              <w:bottom w:val="single" w:sz="4" w:color="D9D9D9"/>
-              <w:right w:val="single" w:sz="4" w:color="D9D9D9"/>
-            </w:tcBorders>
-          </w:tcPr>
-          <w:p>
-            <w:pPr>
-              <w:spacing w:line="288" w:lineRule="auto" w:after="40" w:before="40"/>
-            </w:pPr>
-            <w:r>
-              <w:rPr>
-                <w:rFonts w:ascii="Times New Roman" w:hAnsi="Times New Roman" w:eastAsia="宋体"/>
-                <w:b w:val="0"/>
-                <w:color w:val="000000"/>
-                <w:sz w:val="21"/>
-              </w:rPr>
-              <w:t>损坏输入回归</w:t>
-            </w:r>
-          </w:p>
-        </w:tc>
-        <w:tc>
-          <w:tcPr>
-            <w:tcW w:type="dxa" w:w="6633"/>
-            <w:tcBorders>
-              <w:top w:val="single" w:sz="4" w:color="D9D9D9"/>
-              <w:left w:val="single" w:sz="4" w:color="D9D9D9"/>
-              <w:bottom w:val="single" w:sz="4" w:color="D9D9D9"/>
-              <w:right w:val="single" w:sz="4" w:color="D9D9D9"/>
-            </w:tcBorders>
-          </w:tcPr>
-          <w:p>
-            <w:pPr>
-              <w:spacing w:line="288" w:lineRule="auto" w:after="40" w:before="40"/>
-            </w:pPr>
-            <w:r>
-              <w:rPr>
-                <w:rFonts w:ascii="Times New Roman" w:hAnsi="Times New Roman" w:eastAsia="宋体"/>
-                <w:b w:val="0"/>
-                <w:color w:val="000000"/>
-                <w:sz w:val="21"/>
-              </w:rPr>
-              <w:t>损坏JSON、空对象及布尔版本返回VoteError</w:t>
+              <w:t>已关闭状态和已发布结果保持一致</w:t>
             </w:r>
           </w:p>
         </w:tc>
@@ -4304,68 +3442,18 @@
     </w:tbl>
     <w:p>
       <w:pPr>
+        <w:pStyle w:val="ReportBody"/>
+      </w:pPr>
+      <w:r>
+        <w:t>网络与GUI测试均使用虚拟ID和合成选票，原始证据在evidence/2026-10-27-network/。独立进程验收在一台电脑上通过真实TLS完成，不代表跨物理电脑实测；教师私有数据和现场小改仍待实际验收。</w:t>
+      </w:r>
+    </w:p>
+    <w:p>
+      <w:pPr>
         <w:pStyle w:val="ReportH2"/>
       </w:pPr>
       <w:r>
-        <w:rPr>
-          <w:rFonts w:ascii="Times New Roman" w:hAnsi="Times New Roman" w:eastAsia="宋体"/>
-          <w:b/>
-          <w:color w:val="000000"/>
-          <w:sz w:val="24"/>
-        </w:rPr>
-        <w:t>5.2 失败案例与误报分析</w:t>
-      </w:r>
-    </w:p>
-    <w:p>
-      <w:pPr>
-        <w:pStyle w:val="ReportBody"/>
-      </w:pPr>
-      <w:r>
-        <w:t>界面复测：本轮在Windows原生Qt平台执行实际按钮点击，6票结果为[3,2,1]，随后篡改与删除演示均被检测。旧版线程等待处理在此次流程中继续有效；对应记录为ui/ui_smoke.json和截图。</w:t>
-      </w:r>
-    </w:p>
-    <w:p>
-      <w:pPr>
-        <w:pStyle w:val="ReportBody"/>
-      </w:pPr>
-      <w:r>
-        <w:rPr>
-          <w:rFonts w:ascii="Times New Roman" w:hAnsi="Times New Roman" w:eastAsia="宋体"/>
-          <w:b w:val="0"/>
-          <w:color w:val="000000"/>
-          <w:sz w:val="24"/>
-        </w:rPr>
-        <w:t>失败与误报：用户手动删除文件、同步工具造成文件暂时缺失，或跨文件写入中断，都可能触发同样的完整性告警。因此程序只说明数据不一致，不断言发生了恶意攻击；应恢复可信备份后再审计。</w:t>
-      </w:r>
-    </w:p>
-    <w:p>
-      <w:pPr>
-        <w:pStyle w:val="ReportBody"/>
-      </w:pPr>
-      <w:r>
-        <w:rPr>
-          <w:rFonts w:ascii="Times New Roman" w:hAnsi="Times New Roman" w:eastAsia="宋体"/>
-          <w:b w:val="0"/>
-          <w:color w:val="000000"/>
-          <w:sz w:val="24"/>
-        </w:rPr>
-        <w:t>边界：系统按单机单写入者设计。ID不是登录认证，公钥配置没有外部证书认证，整套历史状态回滚不受本地签名清单保护。默认公开导出包含ID和时间戳，演示使用虚构ID，实际使用需考虑元数据隐私。</w:t>
-      </w:r>
-    </w:p>
-    <w:p>
-      <w:pPr>
-        <w:pStyle w:val="ReportH2"/>
-      </w:pPr>
-      <w:r>
-        <w:t>5.3 性能数据与结果分析</w:t>
-      </w:r>
-    </w:p>
-    <w:p>
-      <w:pPr>
-        <w:pStyle w:val="ReportBody"/>
-      </w:pPr>
-      <w:r>
-        <w:t>对10、100、1000名投票者各做3次三选项实验。合成明文使用种子20261026加重复序号，密码学随机数不固定；每次均核对解密计数与预期。表3取本轮JSON中的算术平均值，单位毫秒。</w:t>
+        <w:t>5.3 加密、汇总和解密耗时</w:t>
       </w:r>
     </w:p>
     <w:p>
@@ -4374,53 +3462,332 @@
         <w:keepNext/>
       </w:pPr>
       <w:r>
-        <w:t>表3 加密 汇总与解密实测均值</w:t>
+        <w:t>表3 本轮六端并发实测（毫秒）</w:t>
       </w:r>
     </w:p>
     <w:tbl>
       <w:tblPr>
         <w:tblW w:type="auto" w:w="0"/>
-        <w:jc w:val="center"/>
         <w:tblLayout w:type="fixed"/>
         <w:tblLook w:firstColumn="1" w:firstRow="1" w:lastColumn="0" w:lastRow="0" w:noHBand="0" w:noVBand="1" w:val="04A0"/>
       </w:tblPr>
       <w:tblGrid>
-        <w:gridCol w:w="1191"/>
-        <w:gridCol w:w="2665"/>
-        <w:gridCol w:w="2665"/>
-        <w:gridCol w:w="2665"/>
+        <w:gridCol w:w="4677"/>
+        <w:gridCol w:w="4677"/>
       </w:tblGrid>
       <w:tr>
         <w:trPr>
           <w:tblHeader/>
+        </w:trPr>
+        <w:tc>
+          <w:tcPr>
+            <w:tcW w:type="dxa" w:w="6520"/>
+            <w:tcBorders>
+              <w:top w:val="single" w:sz="4" w:color="C9D4DF"/>
+              <w:left w:val="single" w:sz="4" w:color="C9D4DF"/>
+              <w:bottom w:val="single" w:sz="4" w:color="C9D4DF"/>
+              <w:right w:val="single" w:sz="4" w:color="C9D4DF"/>
+            </w:tcBorders>
+            <w:shd w:fill="E8EEF3"/>
+          </w:tcPr>
+          <w:p>
+            <w:pPr>
+              <w:spacing w:line="288" w:lineRule="auto" w:before="60" w:after="60"/>
+            </w:pPr>
+            <w:r>
+              <w:rPr>
+                <w:rFonts w:ascii="Times New Roman" w:hAnsi="Times New Roman" w:eastAsia="宋体"/>
+                <w:b/>
+                <w:color w:val="000000"/>
+                <w:sz w:val="21"/>
+              </w:rPr>
+              <w:t>测量范围</w:t>
+            </w:r>
+          </w:p>
+        </w:tc>
+        <w:tc>
+          <w:tcPr>
+            <w:tcW w:type="dxa" w:w="2324"/>
+            <w:tcBorders>
+              <w:top w:val="single" w:sz="4" w:color="C9D4DF"/>
+              <w:left w:val="single" w:sz="4" w:color="C9D4DF"/>
+              <w:bottom w:val="single" w:sz="4" w:color="C9D4DF"/>
+              <w:right w:val="single" w:sz="4" w:color="C9D4DF"/>
+            </w:tcBorders>
+            <w:shd w:fill="E8EEF3"/>
+          </w:tcPr>
+          <w:p>
+            <w:pPr>
+              <w:spacing w:line="288" w:lineRule="auto" w:before="60" w:after="60"/>
+            </w:pPr>
+            <w:r>
+              <w:rPr>
+                <w:rFonts w:ascii="Times New Roman" w:hAnsi="Times New Roman" w:eastAsia="宋体"/>
+                <w:b/>
+                <w:color w:val="000000"/>
+                <w:sz w:val="21"/>
+              </w:rPr>
+              <w:t>数值</w:t>
+            </w:r>
+          </w:p>
+        </w:tc>
+      </w:tr>
+      <w:tr>
+        <w:tc>
+          <w:tcPr>
+            <w:tcW w:type="dxa" w:w="6520"/>
+            <w:tcBorders>
+              <w:top w:val="single" w:sz="4" w:color="C9D4DF"/>
+              <w:left w:val="single" w:sz="4" w:color="C9D4DF"/>
+              <w:bottom w:val="single" w:sz="4" w:color="C9D4DF"/>
+              <w:right w:val="single" w:sz="4" w:color="C9D4DF"/>
+            </w:tcBorders>
+          </w:tcPr>
+          <w:p>
+            <w:pPr>
+              <w:spacing w:line="288" w:lineRule="auto" w:before="60" w:after="60"/>
+            </w:pPr>
+            <w:r>
+              <w:rPr>
+                <w:rFonts w:ascii="Times New Roman" w:hAnsi="Times New Roman" w:eastAsia="宋体"/>
+                <w:b w:val="0"/>
+                <w:color w:val="000000"/>
+                <w:sz w:val="21"/>
+              </w:rPr>
+              <w:t>每端一票的本地加密，六端算术均值</w:t>
+            </w:r>
+          </w:p>
+        </w:tc>
+        <w:tc>
+          <w:tcPr>
+            <w:tcW w:type="dxa" w:w="2324"/>
+            <w:tcBorders>
+              <w:top w:val="single" w:sz="4" w:color="C9D4DF"/>
+              <w:left w:val="single" w:sz="4" w:color="C9D4DF"/>
+              <w:bottom w:val="single" w:sz="4" w:color="C9D4DF"/>
+              <w:right w:val="single" w:sz="4" w:color="C9D4DF"/>
+            </w:tcBorders>
+          </w:tcPr>
+          <w:p>
+            <w:pPr>
+              <w:spacing w:line="288" w:lineRule="auto" w:before="60" w:after="60"/>
+            </w:pPr>
+            <w:r>
+              <w:rPr>
+                <w:rFonts w:ascii="Times New Roman" w:hAnsi="Times New Roman" w:eastAsia="宋体"/>
+                <w:b w:val="0"/>
+                <w:color w:val="000000"/>
+                <w:sz w:val="21"/>
+              </w:rPr>
+              <w:t>19.34</w:t>
+            </w:r>
+          </w:p>
+        </w:tc>
+      </w:tr>
+      <w:tr>
+        <w:tc>
+          <w:tcPr>
+            <w:tcW w:type="dxa" w:w="6520"/>
+            <w:tcBorders>
+              <w:top w:val="single" w:sz="4" w:color="C9D4DF"/>
+              <w:left w:val="single" w:sz="4" w:color="C9D4DF"/>
+              <w:bottom w:val="single" w:sz="4" w:color="C9D4DF"/>
+              <w:right w:val="single" w:sz="4" w:color="C9D4DF"/>
+            </w:tcBorders>
+          </w:tcPr>
+          <w:p>
+            <w:pPr>
+              <w:spacing w:line="288" w:lineRule="auto" w:before="60" w:after="60"/>
+            </w:pPr>
+            <w:r>
+              <w:rPr>
+                <w:rFonts w:ascii="Times New Roman" w:hAnsi="Times New Roman" w:eastAsia="宋体"/>
+                <w:b w:val="0"/>
+                <w:color w:val="000000"/>
+                <w:sz w:val="21"/>
+              </w:rPr>
+              <w:t>提交密文至收到回执，六端均值</w:t>
+            </w:r>
+          </w:p>
+        </w:tc>
+        <w:tc>
+          <w:tcPr>
+            <w:tcW w:type="dxa" w:w="2324"/>
+            <w:tcBorders>
+              <w:top w:val="single" w:sz="4" w:color="C9D4DF"/>
+              <w:left w:val="single" w:sz="4" w:color="C9D4DF"/>
+              <w:bottom w:val="single" w:sz="4" w:color="C9D4DF"/>
+              <w:right w:val="single" w:sz="4" w:color="C9D4DF"/>
+            </w:tcBorders>
+          </w:tcPr>
+          <w:p>
+            <w:pPr>
+              <w:spacing w:line="288" w:lineRule="auto" w:before="60" w:after="60"/>
+            </w:pPr>
+            <w:r>
+              <w:rPr>
+                <w:rFonts w:ascii="Times New Roman" w:hAnsi="Times New Roman" w:eastAsia="宋体"/>
+                <w:b w:val="0"/>
+                <w:color w:val="000000"/>
+                <w:sz w:val="21"/>
+              </w:rPr>
+              <w:t>151.91</w:t>
+            </w:r>
+          </w:p>
+        </w:tc>
+      </w:tr>
+      <w:tr>
+        <w:tc>
+          <w:tcPr>
+            <w:tcW w:type="dxa" w:w="6520"/>
+            <w:tcBorders>
+              <w:top w:val="single" w:sz="4" w:color="C9D4DF"/>
+              <w:left w:val="single" w:sz="4" w:color="C9D4DF"/>
+              <w:bottom w:val="single" w:sz="4" w:color="C9D4DF"/>
+              <w:right w:val="single" w:sz="4" w:color="C9D4DF"/>
+            </w:tcBorders>
+          </w:tcPr>
+          <w:p>
+            <w:pPr>
+              <w:spacing w:line="288" w:lineRule="auto" w:before="60" w:after="60"/>
+            </w:pPr>
+            <w:r>
+              <w:rPr>
+                <w:rFonts w:ascii="Times New Roman" w:hAnsi="Times New Roman" w:eastAsia="宋体"/>
+                <w:b w:val="0"/>
+                <w:color w:val="000000"/>
+                <w:sz w:val="21"/>
+              </w:rPr>
+              <w:t>服务器6票列乘积（不含审计）</w:t>
+            </w:r>
+          </w:p>
+        </w:tc>
+        <w:tc>
+          <w:tcPr>
+            <w:tcW w:type="dxa" w:w="2324"/>
+            <w:tcBorders>
+              <w:top w:val="single" w:sz="4" w:color="C9D4DF"/>
+              <w:left w:val="single" w:sz="4" w:color="C9D4DF"/>
+              <w:bottom w:val="single" w:sz="4" w:color="C9D4DF"/>
+              <w:right w:val="single" w:sz="4" w:color="C9D4DF"/>
+            </w:tcBorders>
+          </w:tcPr>
+          <w:p>
+            <w:pPr>
+              <w:spacing w:line="288" w:lineRule="auto" w:before="60" w:after="60"/>
+            </w:pPr>
+            <w:r>
+              <w:rPr>
+                <w:rFonts w:ascii="Times New Roman" w:hAnsi="Times New Roman" w:eastAsia="宋体"/>
+                <w:b w:val="0"/>
+                <w:color w:val="000000"/>
+                <w:sz w:val="21"/>
+              </w:rPr>
+              <w:t>0.59</w:t>
+            </w:r>
+          </w:p>
+        </w:tc>
+      </w:tr>
+      <w:tr>
+        <w:tc>
+          <w:tcPr>
+            <w:tcW w:type="dxa" w:w="6520"/>
+            <w:tcBorders>
+              <w:top w:val="single" w:sz="4" w:color="C9D4DF"/>
+              <w:left w:val="single" w:sz="4" w:color="C9D4DF"/>
+              <w:bottom w:val="single" w:sz="4" w:color="C9D4DF"/>
+              <w:right w:val="single" w:sz="4" w:color="C9D4DF"/>
+            </w:tcBorders>
+          </w:tcPr>
+          <w:p>
+            <w:pPr>
+              <w:spacing w:line="288" w:lineRule="auto" w:before="60" w:after="60"/>
+            </w:pPr>
+            <w:r>
+              <w:rPr>
+                <w:rFonts w:ascii="Times New Roman" w:hAnsi="Times New Roman" w:eastAsia="宋体"/>
+                <w:b w:val="0"/>
+                <w:color w:val="000000"/>
+                <w:sz w:val="21"/>
+              </w:rPr>
+              <w:t>保管端3列总票解密</w:t>
+            </w:r>
+          </w:p>
+        </w:tc>
+        <w:tc>
+          <w:tcPr>
+            <w:tcW w:type="dxa" w:w="2324"/>
+            <w:tcBorders>
+              <w:top w:val="single" w:sz="4" w:color="C9D4DF"/>
+              <w:left w:val="single" w:sz="4" w:color="C9D4DF"/>
+              <w:bottom w:val="single" w:sz="4" w:color="C9D4DF"/>
+              <w:right w:val="single" w:sz="4" w:color="C9D4DF"/>
+            </w:tcBorders>
+          </w:tcPr>
+          <w:p>
+            <w:pPr>
+              <w:spacing w:line="288" w:lineRule="auto" w:before="60" w:after="60"/>
+            </w:pPr>
+            <w:r>
+              <w:rPr>
+                <w:rFonts w:ascii="Times New Roman" w:hAnsi="Times New Roman" w:eastAsia="宋体"/>
+                <w:b w:val="0"/>
+                <w:color w:val="000000"/>
+                <w:sz w:val="21"/>
+              </w:rPr>
+              <w:t>5.16</w:t>
+            </w:r>
+          </w:p>
+        </w:tc>
+      </w:tr>
+    </w:tbl>
+    <w:p>
+      <w:pPr>
+        <w:pStyle w:val="ReportBody"/>
+      </w:pPr>
+      <w:r>
+        <w:t>加密计时包含独热向量构造与三分量随机加密，提交往返包含TLS、服务器事务和响应；汇总与解密计时只覆盖各自运算。六端在同一机器并发，包含CPU竞争；不能把一次运行当作网络部署性能保证。逐端原始值、进程耗时与源码哈希均保存在network-processes.json。</w:t>
+      </w:r>
+    </w:p>
+    <w:p>
+      <w:pPr>
+        <w:pStyle w:val="ReportCaption"/>
+        <w:keepNext/>
+      </w:pPr>
+      <w:r>
+        <w:t>表4 历史原语性能对照（各三次均值，毫秒）</w:t>
+      </w:r>
+    </w:p>
+    <w:tbl>
+      <w:tblPr>
+        <w:tblW w:type="auto" w:w="0"/>
+        <w:tblLayout w:type="fixed"/>
+        <w:tblLook w:firstColumn="1" w:firstRow="1" w:lastColumn="0" w:lastRow="0" w:noHBand="0" w:noVBand="1" w:val="04A0"/>
+      </w:tblPr>
+      <w:tblGrid>
+        <w:gridCol w:w="2338"/>
+        <w:gridCol w:w="2338"/>
+        <w:gridCol w:w="2338"/>
+        <w:gridCol w:w="2338"/>
+      </w:tblGrid>
+      <w:tr>
+        <w:trPr>
           <w:tblHeader/>
         </w:trPr>
         <w:tc>
           <w:tcPr>
-            <w:tcW w:type="dxa" w:w="1191"/>
-            <w:vAlign w:val="center"/>
-            <w:tcBorders>
-              <w:top w:val="single" w:sz="4" w:color="D9D9D9"/>
-              <w:left w:val="single" w:sz="4" w:color="D9D9D9"/>
-              <w:bottom w:val="single" w:sz="4" w:color="D9D9D9"/>
-              <w:right w:val="single" w:sz="4" w:color="D9D9D9"/>
-              <w:top w:val="single" w:sz="4" w:color="D9D9D9"/>
-              <w:left w:val="single" w:sz="4" w:color="D9D9D9"/>
-              <w:bottom w:val="single" w:sz="4" w:color="D9D9D9"/>
-              <w:right w:val="single" w:sz="4" w:color="D9D9D9"/>
-            </w:tcBorders>
-            <w:tcMar>
-              <w:top w:w="75" w:type="dxa"/>
-              <w:left w:w="75" w:type="dxa"/>
-              <w:bottom w:w="75" w:type="dxa"/>
-              <w:right w:w="75" w:type="dxa"/>
-            </w:tcMar>
-            <w:shd w:fill="E8EDF1"/>
-          </w:tcPr>
-          <w:p>
-            <w:pPr>
-              <w:keepNext/>
-              <w:spacing w:after="40" w:line="288" w:lineRule="auto" w:before="40"/>
+            <w:tcW w:type="dxa" w:w="1361"/>
+            <w:tcBorders>
+              <w:top w:val="single" w:sz="4" w:color="C9D4DF"/>
+              <w:left w:val="single" w:sz="4" w:color="C9D4DF"/>
+              <w:bottom w:val="single" w:sz="4" w:color="C9D4DF"/>
+              <w:right w:val="single" w:sz="4" w:color="C9D4DF"/>
+            </w:tcBorders>
+            <w:shd w:fill="E8EEF3"/>
+          </w:tcPr>
+          <w:p>
+            <w:pPr>
+              <w:spacing w:line="288" w:lineRule="auto" w:before="60" w:after="60"/>
             </w:pPr>
             <w:r>
               <w:rPr>
@@ -4435,146 +3802,97 @@
         </w:tc>
         <w:tc>
           <w:tcPr>
-            <w:tcW w:type="dxa" w:w="2665"/>
-            <w:vAlign w:val="center"/>
-            <w:tcBorders>
-              <w:top w:val="single" w:sz="4" w:color="D9D9D9"/>
-              <w:left w:val="single" w:sz="4" w:color="D9D9D9"/>
-              <w:bottom w:val="single" w:sz="4" w:color="D9D9D9"/>
-              <w:right w:val="single" w:sz="4" w:color="D9D9D9"/>
-              <w:top w:val="single" w:sz="4" w:color="D9D9D9"/>
-              <w:left w:val="single" w:sz="4" w:color="D9D9D9"/>
-              <w:bottom w:val="single" w:sz="4" w:color="D9D9D9"/>
-              <w:right w:val="single" w:sz="4" w:color="D9D9D9"/>
-            </w:tcBorders>
-            <w:tcMar>
-              <w:top w:w="75" w:type="dxa"/>
-              <w:left w:w="75" w:type="dxa"/>
-              <w:bottom w:w="75" w:type="dxa"/>
-              <w:right w:w="75" w:type="dxa"/>
-            </w:tcMar>
-            <w:shd w:fill="E8EDF1"/>
-          </w:tcPr>
-          <w:p>
-            <w:pPr>
-              <w:keepNext/>
-              <w:spacing w:after="40" w:line="288" w:lineRule="auto" w:before="40"/>
-            </w:pPr>
-            <w:r>
-              <w:rPr>
-                <w:rFonts w:ascii="Times New Roman" w:hAnsi="Times New Roman" w:eastAsia="宋体"/>
-                <w:b/>
-                <w:color w:val="000000"/>
-                <w:sz w:val="21"/>
-              </w:rPr>
-              <w:t>加密均值 ms</w:t>
-            </w:r>
-          </w:p>
-        </w:tc>
-        <w:tc>
-          <w:tcPr>
-            <w:tcW w:type="dxa" w:w="2665"/>
-            <w:vAlign w:val="center"/>
-            <w:tcBorders>
-              <w:top w:val="single" w:sz="4" w:color="D9D9D9"/>
-              <w:left w:val="single" w:sz="4" w:color="D9D9D9"/>
-              <w:bottom w:val="single" w:sz="4" w:color="D9D9D9"/>
-              <w:right w:val="single" w:sz="4" w:color="D9D9D9"/>
-              <w:top w:val="single" w:sz="4" w:color="D9D9D9"/>
-              <w:left w:val="single" w:sz="4" w:color="D9D9D9"/>
-              <w:bottom w:val="single" w:sz="4" w:color="D9D9D9"/>
-              <w:right w:val="single" w:sz="4" w:color="D9D9D9"/>
-            </w:tcBorders>
-            <w:tcMar>
-              <w:top w:w="75" w:type="dxa"/>
-              <w:left w:w="75" w:type="dxa"/>
-              <w:bottom w:w="75" w:type="dxa"/>
-              <w:right w:w="75" w:type="dxa"/>
-            </w:tcMar>
-            <w:shd w:fill="E8EDF1"/>
-          </w:tcPr>
-          <w:p>
-            <w:pPr>
-              <w:keepNext/>
-              <w:spacing w:after="40" w:line="288" w:lineRule="auto" w:before="40"/>
-            </w:pPr>
-            <w:r>
-              <w:rPr>
-                <w:rFonts w:ascii="Times New Roman" w:hAnsi="Times New Roman" w:eastAsia="宋体"/>
-                <w:b/>
-                <w:color w:val="000000"/>
-                <w:sz w:val="21"/>
-              </w:rPr>
-              <w:t>汇总均值 ms</w:t>
-            </w:r>
-          </w:p>
-        </w:tc>
-        <w:tc>
-          <w:tcPr>
-            <w:tcW w:type="dxa" w:w="2665"/>
-            <w:vAlign w:val="center"/>
-            <w:tcBorders>
-              <w:top w:val="single" w:sz="4" w:color="D9D9D9"/>
-              <w:left w:val="single" w:sz="4" w:color="D9D9D9"/>
-              <w:bottom w:val="single" w:sz="4" w:color="D9D9D9"/>
-              <w:right w:val="single" w:sz="4" w:color="D9D9D9"/>
-              <w:top w:val="single" w:sz="4" w:color="D9D9D9"/>
-              <w:left w:val="single" w:sz="4" w:color="D9D9D9"/>
-              <w:bottom w:val="single" w:sz="4" w:color="D9D9D9"/>
-              <w:right w:val="single" w:sz="4" w:color="D9D9D9"/>
-            </w:tcBorders>
-            <w:tcMar>
-              <w:top w:w="75" w:type="dxa"/>
-              <w:left w:w="75" w:type="dxa"/>
-              <w:bottom w:w="75" w:type="dxa"/>
-              <w:right w:w="75" w:type="dxa"/>
-            </w:tcMar>
-            <w:shd w:fill="E8EDF1"/>
-          </w:tcPr>
-          <w:p>
-            <w:pPr>
-              <w:keepNext/>
-              <w:spacing w:after="40" w:line="288" w:lineRule="auto" w:before="40"/>
-            </w:pPr>
-            <w:r>
-              <w:rPr>
-                <w:rFonts w:ascii="Times New Roman" w:hAnsi="Times New Roman" w:eastAsia="宋体"/>
-                <w:b/>
-                <w:color w:val="000000"/>
-                <w:sz w:val="21"/>
-              </w:rPr>
-              <w:t>解密均值 ms</w:t>
+            <w:tcW w:type="dxa" w:w="2494"/>
+            <w:tcBorders>
+              <w:top w:val="single" w:sz="4" w:color="C9D4DF"/>
+              <w:left w:val="single" w:sz="4" w:color="C9D4DF"/>
+              <w:bottom w:val="single" w:sz="4" w:color="C9D4DF"/>
+              <w:right w:val="single" w:sz="4" w:color="C9D4DF"/>
+            </w:tcBorders>
+            <w:shd w:fill="E8EEF3"/>
+          </w:tcPr>
+          <w:p>
+            <w:pPr>
+              <w:spacing w:line="288" w:lineRule="auto" w:before="60" w:after="60"/>
+            </w:pPr>
+            <w:r>
+              <w:rPr>
+                <w:rFonts w:ascii="Times New Roman" w:hAnsi="Times New Roman" w:eastAsia="宋体"/>
+                <w:b/>
+                <w:color w:val="000000"/>
+                <w:sz w:val="21"/>
+              </w:rPr>
+              <w:t>加密</w:t>
+            </w:r>
+          </w:p>
+        </w:tc>
+        <w:tc>
+          <w:tcPr>
+            <w:tcW w:type="dxa" w:w="2494"/>
+            <w:tcBorders>
+              <w:top w:val="single" w:sz="4" w:color="C9D4DF"/>
+              <w:left w:val="single" w:sz="4" w:color="C9D4DF"/>
+              <w:bottom w:val="single" w:sz="4" w:color="C9D4DF"/>
+              <w:right w:val="single" w:sz="4" w:color="C9D4DF"/>
+            </w:tcBorders>
+            <w:shd w:fill="E8EEF3"/>
+          </w:tcPr>
+          <w:p>
+            <w:pPr>
+              <w:spacing w:line="288" w:lineRule="auto" w:before="60" w:after="60"/>
+            </w:pPr>
+            <w:r>
+              <w:rPr>
+                <w:rFonts w:ascii="Times New Roman" w:hAnsi="Times New Roman" w:eastAsia="宋体"/>
+                <w:b/>
+                <w:color w:val="000000"/>
+                <w:sz w:val="21"/>
+              </w:rPr>
+              <w:t>汇总</w:t>
+            </w:r>
+          </w:p>
+        </w:tc>
+        <w:tc>
+          <w:tcPr>
+            <w:tcW w:type="dxa" w:w="2494"/>
+            <w:tcBorders>
+              <w:top w:val="single" w:sz="4" w:color="C9D4DF"/>
+              <w:left w:val="single" w:sz="4" w:color="C9D4DF"/>
+              <w:bottom w:val="single" w:sz="4" w:color="C9D4DF"/>
+              <w:right w:val="single" w:sz="4" w:color="C9D4DF"/>
+            </w:tcBorders>
+            <w:shd w:fill="E8EEF3"/>
+          </w:tcPr>
+          <w:p>
+            <w:pPr>
+              <w:spacing w:line="288" w:lineRule="auto" w:before="60" w:after="60"/>
+            </w:pPr>
+            <w:r>
+              <w:rPr>
+                <w:rFonts w:ascii="Times New Roman" w:hAnsi="Times New Roman" w:eastAsia="宋体"/>
+                <w:b/>
+                <w:color w:val="000000"/>
+                <w:sz w:val="21"/>
+              </w:rPr>
+              <w:t>解密</w:t>
             </w:r>
           </w:p>
         </w:tc>
       </w:tr>
       <w:tr>
-        <w:trPr/>
-        <w:tc>
-          <w:tcPr>
-            <w:tcW w:type="dxa" w:w="1191"/>
-            <w:vAlign w:val="center"/>
-            <w:tcBorders>
-              <w:top w:val="single" w:sz="4" w:color="D9D9D9"/>
-              <w:left w:val="single" w:sz="4" w:color="D9D9D9"/>
-              <w:bottom w:val="single" w:sz="4" w:color="D9D9D9"/>
-              <w:right w:val="single" w:sz="4" w:color="D9D9D9"/>
-              <w:top w:val="single" w:sz="4" w:color="D9D9D9"/>
-              <w:left w:val="single" w:sz="4" w:color="D9D9D9"/>
-              <w:bottom w:val="single" w:sz="4" w:color="D9D9D9"/>
-              <w:right w:val="single" w:sz="4" w:color="D9D9D9"/>
-            </w:tcBorders>
-            <w:tcMar>
-              <w:top w:w="75" w:type="dxa"/>
-              <w:left w:w="75" w:type="dxa"/>
-              <w:bottom w:w="75" w:type="dxa"/>
-              <w:right w:w="75" w:type="dxa"/>
-            </w:tcMar>
-          </w:tcPr>
-          <w:p>
-            <w:pPr>
-              <w:keepNext/>
-              <w:spacing w:line="288" w:lineRule="auto" w:after="40" w:before="40"/>
+        <w:tc>
+          <w:tcPr>
+            <w:tcW w:type="dxa" w:w="1361"/>
+            <w:tcBorders>
+              <w:top w:val="single" w:sz="4" w:color="C9D4DF"/>
+              <w:left w:val="single" w:sz="4" w:color="C9D4DF"/>
+              <w:bottom w:val="single" w:sz="4" w:color="C9D4DF"/>
+              <w:right w:val="single" w:sz="4" w:color="C9D4DF"/>
+            </w:tcBorders>
+          </w:tcPr>
+          <w:p>
+            <w:pPr>
+              <w:spacing w:line="288" w:lineRule="auto" w:before="60" w:after="60"/>
             </w:pPr>
             <w:r>
               <w:rPr>
@@ -4589,29 +3907,17 @@
         </w:tc>
         <w:tc>
           <w:tcPr>
-            <w:tcW w:type="dxa" w:w="2665"/>
-            <w:vAlign w:val="center"/>
-            <w:tcBorders>
-              <w:top w:val="single" w:sz="4" w:color="D9D9D9"/>
-              <w:left w:val="single" w:sz="4" w:color="D9D9D9"/>
-              <w:bottom w:val="single" w:sz="4" w:color="D9D9D9"/>
-              <w:right w:val="single" w:sz="4" w:color="D9D9D9"/>
-              <w:top w:val="single" w:sz="4" w:color="D9D9D9"/>
-              <w:left w:val="single" w:sz="4" w:color="D9D9D9"/>
-              <w:bottom w:val="single" w:sz="4" w:color="D9D9D9"/>
-              <w:right w:val="single" w:sz="4" w:color="D9D9D9"/>
-            </w:tcBorders>
-            <w:tcMar>
-              <w:top w:w="75" w:type="dxa"/>
-              <w:left w:w="75" w:type="dxa"/>
-              <w:bottom w:w="75" w:type="dxa"/>
-              <w:right w:w="75" w:type="dxa"/>
-            </w:tcMar>
-          </w:tcPr>
-          <w:p>
-            <w:pPr>
-              <w:keepNext/>
-              <w:spacing w:line="288" w:lineRule="auto" w:after="40" w:before="40"/>
+            <w:tcW w:type="dxa" w:w="2494"/>
+            <w:tcBorders>
+              <w:top w:val="single" w:sz="4" w:color="C9D4DF"/>
+              <w:left w:val="single" w:sz="4" w:color="C9D4DF"/>
+              <w:bottom w:val="single" w:sz="4" w:color="C9D4DF"/>
+              <w:right w:val="single" w:sz="4" w:color="C9D4DF"/>
+            </w:tcBorders>
+          </w:tcPr>
+          <w:p>
+            <w:pPr>
+              <w:spacing w:line="288" w:lineRule="auto" w:before="60" w:after="60"/>
             </w:pPr>
             <w:r>
               <w:rPr>
@@ -4626,29 +3932,17 @@
         </w:tc>
         <w:tc>
           <w:tcPr>
-            <w:tcW w:type="dxa" w:w="2665"/>
-            <w:vAlign w:val="center"/>
-            <w:tcBorders>
-              <w:top w:val="single" w:sz="4" w:color="D9D9D9"/>
-              <w:left w:val="single" w:sz="4" w:color="D9D9D9"/>
-              <w:bottom w:val="single" w:sz="4" w:color="D9D9D9"/>
-              <w:right w:val="single" w:sz="4" w:color="D9D9D9"/>
-              <w:top w:val="single" w:sz="4" w:color="D9D9D9"/>
-              <w:left w:val="single" w:sz="4" w:color="D9D9D9"/>
-              <w:bottom w:val="single" w:sz="4" w:color="D9D9D9"/>
-              <w:right w:val="single" w:sz="4" w:color="D9D9D9"/>
-            </w:tcBorders>
-            <w:tcMar>
-              <w:top w:w="75" w:type="dxa"/>
-              <w:left w:w="75" w:type="dxa"/>
-              <w:bottom w:w="75" w:type="dxa"/>
-              <w:right w:w="75" w:type="dxa"/>
-            </w:tcMar>
-          </w:tcPr>
-          <w:p>
-            <w:pPr>
-              <w:keepNext/>
-              <w:spacing w:line="288" w:lineRule="auto" w:after="40" w:before="40"/>
+            <w:tcW w:type="dxa" w:w="2494"/>
+            <w:tcBorders>
+              <w:top w:val="single" w:sz="4" w:color="C9D4DF"/>
+              <w:left w:val="single" w:sz="4" w:color="C9D4DF"/>
+              <w:bottom w:val="single" w:sz="4" w:color="C9D4DF"/>
+              <w:right w:val="single" w:sz="4" w:color="C9D4DF"/>
+            </w:tcBorders>
+          </w:tcPr>
+          <w:p>
+            <w:pPr>
+              <w:spacing w:line="288" w:lineRule="auto" w:before="60" w:after="60"/>
             </w:pPr>
             <w:r>
               <w:rPr>
@@ -4663,29 +3957,17 @@
         </w:tc>
         <w:tc>
           <w:tcPr>
-            <w:tcW w:type="dxa" w:w="2665"/>
-            <w:vAlign w:val="center"/>
-            <w:tcBorders>
-              <w:top w:val="single" w:sz="4" w:color="D9D9D9"/>
-              <w:left w:val="single" w:sz="4" w:color="D9D9D9"/>
-              <w:bottom w:val="single" w:sz="4" w:color="D9D9D9"/>
-              <w:right w:val="single" w:sz="4" w:color="D9D9D9"/>
-              <w:top w:val="single" w:sz="4" w:color="D9D9D9"/>
-              <w:left w:val="single" w:sz="4" w:color="D9D9D9"/>
-              <w:bottom w:val="single" w:sz="4" w:color="D9D9D9"/>
-              <w:right w:val="single" w:sz="4" w:color="D9D9D9"/>
-            </w:tcBorders>
-            <w:tcMar>
-              <w:top w:w="75" w:type="dxa"/>
-              <w:left w:w="75" w:type="dxa"/>
-              <w:bottom w:w="75" w:type="dxa"/>
-              <w:right w:w="75" w:type="dxa"/>
-            </w:tcMar>
-          </w:tcPr>
-          <w:p>
-            <w:pPr>
-              <w:keepNext/>
-              <w:spacing w:line="288" w:lineRule="auto" w:after="40" w:before="40"/>
+            <w:tcW w:type="dxa" w:w="2494"/>
+            <w:tcBorders>
+              <w:top w:val="single" w:sz="4" w:color="C9D4DF"/>
+              <w:left w:val="single" w:sz="4" w:color="C9D4DF"/>
+              <w:bottom w:val="single" w:sz="4" w:color="C9D4DF"/>
+              <w:right w:val="single" w:sz="4" w:color="C9D4DF"/>
+            </w:tcBorders>
+          </w:tcPr>
+          <w:p>
+            <w:pPr>
+              <w:spacing w:line="288" w:lineRule="auto" w:before="60" w:after="60"/>
             </w:pPr>
             <w:r>
               <w:rPr>
@@ -4700,32 +3982,19 @@
         </w:tc>
       </w:tr>
       <w:tr>
-        <w:trPr/>
-        <w:tc>
-          <w:tcPr>
-            <w:tcW w:type="dxa" w:w="1191"/>
-            <w:vAlign w:val="center"/>
-            <w:tcBorders>
-              <w:top w:val="single" w:sz="4" w:color="D9D9D9"/>
-              <w:left w:val="single" w:sz="4" w:color="D9D9D9"/>
-              <w:bottom w:val="single" w:sz="4" w:color="D9D9D9"/>
-              <w:right w:val="single" w:sz="4" w:color="D9D9D9"/>
-              <w:top w:val="single" w:sz="4" w:color="D9D9D9"/>
-              <w:left w:val="single" w:sz="4" w:color="D9D9D9"/>
-              <w:bottom w:val="single" w:sz="4" w:color="D9D9D9"/>
-              <w:right w:val="single" w:sz="4" w:color="D9D9D9"/>
-            </w:tcBorders>
-            <w:tcMar>
-              <w:top w:w="75" w:type="dxa"/>
-              <w:left w:w="75" w:type="dxa"/>
-              <w:bottom w:w="75" w:type="dxa"/>
-              <w:right w:w="75" w:type="dxa"/>
-            </w:tcMar>
-          </w:tcPr>
-          <w:p>
-            <w:pPr>
-              <w:keepNext/>
-              <w:spacing w:line="288" w:lineRule="auto" w:after="40" w:before="40"/>
+        <w:tc>
+          <w:tcPr>
+            <w:tcW w:type="dxa" w:w="1361"/>
+            <w:tcBorders>
+              <w:top w:val="single" w:sz="4" w:color="C9D4DF"/>
+              <w:left w:val="single" w:sz="4" w:color="C9D4DF"/>
+              <w:bottom w:val="single" w:sz="4" w:color="C9D4DF"/>
+              <w:right w:val="single" w:sz="4" w:color="C9D4DF"/>
+            </w:tcBorders>
+          </w:tcPr>
+          <w:p>
+            <w:pPr>
+              <w:spacing w:line="288" w:lineRule="auto" w:before="60" w:after="60"/>
             </w:pPr>
             <w:r>
               <w:rPr>
@@ -4740,29 +4009,17 @@
         </w:tc>
         <w:tc>
           <w:tcPr>
-            <w:tcW w:type="dxa" w:w="2665"/>
-            <w:vAlign w:val="center"/>
-            <w:tcBorders>
-              <w:top w:val="single" w:sz="4" w:color="D9D9D9"/>
-              <w:left w:val="single" w:sz="4" w:color="D9D9D9"/>
-              <w:bottom w:val="single" w:sz="4" w:color="D9D9D9"/>
-              <w:right w:val="single" w:sz="4" w:color="D9D9D9"/>
-              <w:top w:val="single" w:sz="4" w:color="D9D9D9"/>
-              <w:left w:val="single" w:sz="4" w:color="D9D9D9"/>
-              <w:bottom w:val="single" w:sz="4" w:color="D9D9D9"/>
-              <w:right w:val="single" w:sz="4" w:color="D9D9D9"/>
-            </w:tcBorders>
-            <w:tcMar>
-              <w:top w:w="75" w:type="dxa"/>
-              <w:left w:w="75" w:type="dxa"/>
-              <w:bottom w:w="75" w:type="dxa"/>
-              <w:right w:w="75" w:type="dxa"/>
-            </w:tcMar>
-          </w:tcPr>
-          <w:p>
-            <w:pPr>
-              <w:keepNext/>
-              <w:spacing w:line="288" w:lineRule="auto" w:after="40" w:before="40"/>
+            <w:tcW w:type="dxa" w:w="2494"/>
+            <w:tcBorders>
+              <w:top w:val="single" w:sz="4" w:color="C9D4DF"/>
+              <w:left w:val="single" w:sz="4" w:color="C9D4DF"/>
+              <w:bottom w:val="single" w:sz="4" w:color="C9D4DF"/>
+              <w:right w:val="single" w:sz="4" w:color="C9D4DF"/>
+            </w:tcBorders>
+          </w:tcPr>
+          <w:p>
+            <w:pPr>
+              <w:spacing w:line="288" w:lineRule="auto" w:before="60" w:after="60"/>
             </w:pPr>
             <w:r>
               <w:rPr>
@@ -4777,29 +4034,17 @@
         </w:tc>
         <w:tc>
           <w:tcPr>
-            <w:tcW w:type="dxa" w:w="2665"/>
-            <w:vAlign w:val="center"/>
-            <w:tcBorders>
-              <w:top w:val="single" w:sz="4" w:color="D9D9D9"/>
-              <w:left w:val="single" w:sz="4" w:color="D9D9D9"/>
-              <w:bottom w:val="single" w:sz="4" w:color="D9D9D9"/>
-              <w:right w:val="single" w:sz="4" w:color="D9D9D9"/>
-              <w:top w:val="single" w:sz="4" w:color="D9D9D9"/>
-              <w:left w:val="single" w:sz="4" w:color="D9D9D9"/>
-              <w:bottom w:val="single" w:sz="4" w:color="D9D9D9"/>
-              <w:right w:val="single" w:sz="4" w:color="D9D9D9"/>
-            </w:tcBorders>
-            <w:tcMar>
-              <w:top w:w="75" w:type="dxa"/>
-              <w:left w:w="75" w:type="dxa"/>
-              <w:bottom w:w="75" w:type="dxa"/>
-              <w:right w:w="75" w:type="dxa"/>
-            </w:tcMar>
-          </w:tcPr>
-          <w:p>
-            <w:pPr>
-              <w:keepNext/>
-              <w:spacing w:line="288" w:lineRule="auto" w:after="40" w:before="40"/>
+            <w:tcW w:type="dxa" w:w="2494"/>
+            <w:tcBorders>
+              <w:top w:val="single" w:sz="4" w:color="C9D4DF"/>
+              <w:left w:val="single" w:sz="4" w:color="C9D4DF"/>
+              <w:bottom w:val="single" w:sz="4" w:color="C9D4DF"/>
+              <w:right w:val="single" w:sz="4" w:color="C9D4DF"/>
+            </w:tcBorders>
+          </w:tcPr>
+          <w:p>
+            <w:pPr>
+              <w:spacing w:line="288" w:lineRule="auto" w:before="60" w:after="60"/>
             </w:pPr>
             <w:r>
               <w:rPr>
@@ -4814,29 +4059,17 @@
         </w:tc>
         <w:tc>
           <w:tcPr>
-            <w:tcW w:type="dxa" w:w="2665"/>
-            <w:vAlign w:val="center"/>
-            <w:tcBorders>
-              <w:top w:val="single" w:sz="4" w:color="D9D9D9"/>
-              <w:left w:val="single" w:sz="4" w:color="D9D9D9"/>
-              <w:bottom w:val="single" w:sz="4" w:color="D9D9D9"/>
-              <w:right w:val="single" w:sz="4" w:color="D9D9D9"/>
-              <w:top w:val="single" w:sz="4" w:color="D9D9D9"/>
-              <w:left w:val="single" w:sz="4" w:color="D9D9D9"/>
-              <w:bottom w:val="single" w:sz="4" w:color="D9D9D9"/>
-              <w:right w:val="single" w:sz="4" w:color="D9D9D9"/>
-            </w:tcBorders>
-            <w:tcMar>
-              <w:top w:w="75" w:type="dxa"/>
-              <w:left w:w="75" w:type="dxa"/>
-              <w:bottom w:w="75" w:type="dxa"/>
-              <w:right w:w="75" w:type="dxa"/>
-            </w:tcMar>
-          </w:tcPr>
-          <w:p>
-            <w:pPr>
-              <w:keepNext/>
-              <w:spacing w:line="288" w:lineRule="auto" w:after="40" w:before="40"/>
+            <w:tcW w:type="dxa" w:w="2494"/>
+            <w:tcBorders>
+              <w:top w:val="single" w:sz="4" w:color="C9D4DF"/>
+              <w:left w:val="single" w:sz="4" w:color="C9D4DF"/>
+              <w:bottom w:val="single" w:sz="4" w:color="C9D4DF"/>
+              <w:right w:val="single" w:sz="4" w:color="C9D4DF"/>
+            </w:tcBorders>
+          </w:tcPr>
+          <w:p>
+            <w:pPr>
+              <w:spacing w:line="288" w:lineRule="auto" w:before="60" w:after="60"/>
             </w:pPr>
             <w:r>
               <w:rPr>
@@ -4851,32 +4084,19 @@
         </w:tc>
       </w:tr>
       <w:tr>
-        <w:trPr/>
-        <w:tc>
-          <w:tcPr>
-            <w:tcW w:type="dxa" w:w="1191"/>
-            <w:vAlign w:val="center"/>
-            <w:tcBorders>
-              <w:top w:val="single" w:sz="4" w:color="D9D9D9"/>
-              <w:left w:val="single" w:sz="4" w:color="D9D9D9"/>
-              <w:bottom w:val="single" w:sz="4" w:color="D9D9D9"/>
-              <w:right w:val="single" w:sz="4" w:color="D9D9D9"/>
-              <w:top w:val="single" w:sz="4" w:color="D9D9D9"/>
-              <w:left w:val="single" w:sz="4" w:color="D9D9D9"/>
-              <w:bottom w:val="single" w:sz="4" w:color="D9D9D9"/>
-              <w:right w:val="single" w:sz="4" w:color="D9D9D9"/>
-            </w:tcBorders>
-            <w:tcMar>
-              <w:top w:w="75" w:type="dxa"/>
-              <w:left w:w="75" w:type="dxa"/>
-              <w:bottom w:w="75" w:type="dxa"/>
-              <w:right w:w="75" w:type="dxa"/>
-            </w:tcMar>
-          </w:tcPr>
-          <w:p>
-            <w:pPr>
-              <w:keepNext w:val="0"/>
-              <w:spacing w:line="288" w:lineRule="auto" w:after="40" w:before="40"/>
+        <w:tc>
+          <w:tcPr>
+            <w:tcW w:type="dxa" w:w="1361"/>
+            <w:tcBorders>
+              <w:top w:val="single" w:sz="4" w:color="C9D4DF"/>
+              <w:left w:val="single" w:sz="4" w:color="C9D4DF"/>
+              <w:bottom w:val="single" w:sz="4" w:color="C9D4DF"/>
+              <w:right w:val="single" w:sz="4" w:color="C9D4DF"/>
+            </w:tcBorders>
+          </w:tcPr>
+          <w:p>
+            <w:pPr>
+              <w:spacing w:line="288" w:lineRule="auto" w:before="60" w:after="60"/>
             </w:pPr>
             <w:r>
               <w:rPr>
@@ -4891,29 +4111,17 @@
         </w:tc>
         <w:tc>
           <w:tcPr>
-            <w:tcW w:type="dxa" w:w="2665"/>
-            <w:vAlign w:val="center"/>
-            <w:tcBorders>
-              <w:top w:val="single" w:sz="4" w:color="D9D9D9"/>
-              <w:left w:val="single" w:sz="4" w:color="D9D9D9"/>
-              <w:bottom w:val="single" w:sz="4" w:color="D9D9D9"/>
-              <w:right w:val="single" w:sz="4" w:color="D9D9D9"/>
-              <w:top w:val="single" w:sz="4" w:color="D9D9D9"/>
-              <w:left w:val="single" w:sz="4" w:color="D9D9D9"/>
-              <w:bottom w:val="single" w:sz="4" w:color="D9D9D9"/>
-              <w:right w:val="single" w:sz="4" w:color="D9D9D9"/>
-            </w:tcBorders>
-            <w:tcMar>
-              <w:top w:w="75" w:type="dxa"/>
-              <w:left w:w="75" w:type="dxa"/>
-              <w:bottom w:w="75" w:type="dxa"/>
-              <w:right w:w="75" w:type="dxa"/>
-            </w:tcMar>
-          </w:tcPr>
-          <w:p>
-            <w:pPr>
-              <w:keepNext w:val="0"/>
-              <w:spacing w:line="288" w:lineRule="auto" w:after="40" w:before="40"/>
+            <w:tcW w:type="dxa" w:w="2494"/>
+            <w:tcBorders>
+              <w:top w:val="single" w:sz="4" w:color="C9D4DF"/>
+              <w:left w:val="single" w:sz="4" w:color="C9D4DF"/>
+              <w:bottom w:val="single" w:sz="4" w:color="C9D4DF"/>
+              <w:right w:val="single" w:sz="4" w:color="C9D4DF"/>
+            </w:tcBorders>
+          </w:tcPr>
+          <w:p>
+            <w:pPr>
+              <w:spacing w:line="288" w:lineRule="auto" w:before="60" w:after="60"/>
             </w:pPr>
             <w:r>
               <w:rPr>
@@ -4928,29 +4136,17 @@
         </w:tc>
         <w:tc>
           <w:tcPr>
-            <w:tcW w:type="dxa" w:w="2665"/>
-            <w:vAlign w:val="center"/>
-            <w:tcBorders>
-              <w:top w:val="single" w:sz="4" w:color="D9D9D9"/>
-              <w:left w:val="single" w:sz="4" w:color="D9D9D9"/>
-              <w:bottom w:val="single" w:sz="4" w:color="D9D9D9"/>
-              <w:right w:val="single" w:sz="4" w:color="D9D9D9"/>
-              <w:top w:val="single" w:sz="4" w:color="D9D9D9"/>
-              <w:left w:val="single" w:sz="4" w:color="D9D9D9"/>
-              <w:bottom w:val="single" w:sz="4" w:color="D9D9D9"/>
-              <w:right w:val="single" w:sz="4" w:color="D9D9D9"/>
-            </w:tcBorders>
-            <w:tcMar>
-              <w:top w:w="75" w:type="dxa"/>
-              <w:left w:w="75" w:type="dxa"/>
-              <w:bottom w:w="75" w:type="dxa"/>
-              <w:right w:w="75" w:type="dxa"/>
-            </w:tcMar>
-          </w:tcPr>
-          <w:p>
-            <w:pPr>
-              <w:keepNext w:val="0"/>
-              <w:spacing w:line="288" w:lineRule="auto" w:after="40" w:before="40"/>
+            <w:tcW w:type="dxa" w:w="2494"/>
+            <w:tcBorders>
+              <w:top w:val="single" w:sz="4" w:color="C9D4DF"/>
+              <w:left w:val="single" w:sz="4" w:color="C9D4DF"/>
+              <w:bottom w:val="single" w:sz="4" w:color="C9D4DF"/>
+              <w:right w:val="single" w:sz="4" w:color="C9D4DF"/>
+            </w:tcBorders>
+          </w:tcPr>
+          <w:p>
+            <w:pPr>
+              <w:spacing w:line="288" w:lineRule="auto" w:before="60" w:after="60"/>
             </w:pPr>
             <w:r>
               <w:rPr>
@@ -4965,29 +4161,17 @@
         </w:tc>
         <w:tc>
           <w:tcPr>
-            <w:tcW w:type="dxa" w:w="2665"/>
-            <w:vAlign w:val="center"/>
-            <w:tcBorders>
-              <w:top w:val="single" w:sz="4" w:color="D9D9D9"/>
-              <w:left w:val="single" w:sz="4" w:color="D9D9D9"/>
-              <w:bottom w:val="single" w:sz="4" w:color="D9D9D9"/>
-              <w:right w:val="single" w:sz="4" w:color="D9D9D9"/>
-              <w:top w:val="single" w:sz="4" w:color="D9D9D9"/>
-              <w:left w:val="single" w:sz="4" w:color="D9D9D9"/>
-              <w:bottom w:val="single" w:sz="4" w:color="D9D9D9"/>
-              <w:right w:val="single" w:sz="4" w:color="D9D9D9"/>
-            </w:tcBorders>
-            <w:tcMar>
-              <w:top w:w="75" w:type="dxa"/>
-              <w:left w:w="75" w:type="dxa"/>
-              <w:bottom w:w="75" w:type="dxa"/>
-              <w:right w:w="75" w:type="dxa"/>
-            </w:tcMar>
-          </w:tcPr>
-          <w:p>
-            <w:pPr>
-              <w:keepNext w:val="0"/>
-              <w:spacing w:line="288" w:lineRule="auto" w:after="40" w:before="40"/>
+            <w:tcW w:type="dxa" w:w="2494"/>
+            <w:tcBorders>
+              <w:top w:val="single" w:sz="4" w:color="C9D4DF"/>
+              <w:left w:val="single" w:sz="4" w:color="C9D4DF"/>
+              <w:bottom w:val="single" w:sz="4" w:color="C9D4DF"/>
+              <w:right w:val="single" w:sz="4" w:color="C9D4DF"/>
+            </w:tcBorders>
+          </w:tcPr>
+          <w:p>
+            <w:pPr>
+              <w:spacing w:line="288" w:lineRule="auto" w:before="60" w:after="60"/>
             </w:pPr>
             <w:r>
               <w:rPr>
@@ -5007,7 +4191,15 @@
         <w:pStyle w:val="ReportBody"/>
       </w:pPr>
       <w:r>
-        <w:t>计时仅覆盖Paillier原语，不包括文件、签名、口令派生、进程及GUI；界面耗时则来自当前轮次的实际审计和解密端复算，二者口径不同。测试期间计算机有其他任务，三次原始记录保存在JSON中，均值不能当作部署保证。</w:t>
+        <w:t>表4来自本次架构修正前保留的完整原语实验evidence/2026-10-27/full/，仅作规模对照。它不包含联网、事务和TLS开销，也不是重新执行的联网千人测试；原始运行环境和哈希在其JSON中保留。</w:t>
+      </w:r>
+    </w:p>
+    <w:p>
+      <w:pPr>
+        <w:pStyle w:val="ReportH2"/>
+      </w:pPr>
+      <w:r>
+        <w:t>5.4 失败、误报与安全局限</w:t>
       </w:r>
     </w:p>
     <w:p>
@@ -5015,13 +4207,31 @@
         <w:pStyle w:val="ReportBody"/>
       </w:pPr>
       <w:r>
-        <w:rPr>
-          <w:rFonts w:ascii="Times New Roman" w:hAnsi="Times New Roman" w:eastAsia="宋体"/>
-          <w:b w:val="0"/>
-          <w:color w:val="000000"/>
-          <w:sz w:val="24"/>
-        </w:rPr>
-        <w:t>系统的额外价值在于解释“已接收的密文集合是否仍与签名清单一致”。摘要比对本身不能证明身份，清单签名也不能证明选票内容合法。完整回滚实验故意恢复旧清单并删除之后的选票，审计仍通过；这表明需要外部保存的最新检查点或独立见证才能识别回滚。</w:t>
+        <w:t>文件损坏、网络断开、错误凭证与攻击可能出现相似提示，程序只报告可验证的失败原因。数据库内容与签名不一致时拒绝继续；连接中断时通过回执确认是否已接收，而不是直接重新计票。首次打包复测发现Windows重定向输出使用GBK，已统一管道输出UTF-8，再通过实际EXE进程验证。</w:t>
+      </w:r>
+    </w:p>
+    <w:p>
+      <w:pPr>
+        <w:pStyle w:val="ReportBody"/>
+      </w:pPr>
+      <w:r>
+        <w:t>未实现逐票独热零知识证明，[2,0]与[0,0]等非法组合可能仍满足总票数约束。单人结果会暴露选择。一次批准只限制同轮重复解密不同集合；若恶意服务器重新签署删票集合，首次集合是否完整仍需独立回执或外部见证，不能只靠服务器自己的签名。</w:t>
+      </w:r>
+    </w:p>
+    <w:p>
+      <w:pPr>
+        <w:pStyle w:val="ReportH1"/>
+      </w:pPr>
+      <w:r>
+        <w:t>六、总结</w:t>
+      </w:r>
+    </w:p>
+    <w:p>
+      <w:pPr>
+        <w:pStyle w:val="ReportBody"/>
+      </w:pPr>
+      <w:r>
+        <w:t>本模块把实验算法组织为可连接的局域网服务，并用事务、凭证权限和签名回执处理多端协作。当前已完成同机真实网络与多进程验证；跨物理电脑仍需核验网络互通和防火墙设置，不能以本机测试代替。</w:t>
       </w:r>
     </w:p>
     <w:p>
@@ -5029,7 +4239,7 @@
         <w:pStyle w:val="ReportH2"/>
       </w:pPr>
       <w:r>
-        <w:t>5.4 准确性与可重复性</w:t>
+        <w:t>6.1 威胁模型与后续改进</w:t>
       </w:r>
     </w:p>
     <w:p>
@@ -5037,7 +4247,7 @@
         <w:pStyle w:val="ReportBody"/>
       </w:pPr>
       <w:r>
-        <w:t>基准6票序列[0,1,0,2,0,1]得到[3,2,1]；2、4、8选项各投一票均得到全1向量，零票返回全0。原生Qt测试记录在evidence/2026-10-27/ui/，验证6次控件投票、子进程计票和两种审计演示。图2采用本轮实际截图。</w:t>
+        <w:t>主要模型是服务器按协议收票与汇总、但可能试图了解个人选择；在Paillier私钥留在可信保管端、客户端可信的条件下，服务器无法直接解密单票。该模型不覆盖客户端中毒、私钥泄露、组织者错误分发凭证或服务器与保管者串通。后续可增加独热证明、门限解密、独立透明日志、凭证撤销与抗拒绝服务措施。</w:t>
       </w:r>
     </w:p>
     <w:p>
@@ -5045,7 +4255,7 @@
         <w:pStyle w:val="ReportH2"/>
       </w:pPr>
       <w:r>
-        <w:t>5.5 本轮发现的问题与处理</w:t>
+        <w:t>6.2 分工验收与个人复核</w:t>
       </w:r>
     </w:p>
     <w:p>
@@ -5053,21 +4263,7 @@
         <w:pStyle w:val="ReportBody"/>
       </w:pPr>
       <w:r>
-        <w:t>公开导出原先递归收集public下的全部JSON。复现时在该目录加入accidental-secret.json，文件也进入ZIP。修复后仅导出config.json、manifest.json和签名清单列出的选票；额外顶层JSON与备份子目录不再外发。另将损坏JSON、布尔版本号和空对象改为明确拒绝，并使选票子目录中的未登记文件触发审计失败。</w:t>
-      </w:r>
-    </w:p>
-    <w:p>
-      <w:pPr>
-        <w:pStyle w:val="ReportH1"/>
-      </w:pPr>
-      <w:r>
-        <w:rPr>
-          <w:rFonts w:ascii="Times New Roman" w:hAnsi="Times New Roman" w:eastAsia="宋体"/>
-          <w:b/>
-          <w:color w:val="000000"/>
-          <w:sz w:val="28"/>
-        </w:rPr>
-        <w:t>六、总结</w:t>
+        <w:t>文件锁为何不足以处理多端投票？检查重复与登记为何必须在同一事务内？连接中断后怎样确认选票是否收到？证书指纹错误时是否已经发送票码？</w:t>
       </w:r>
     </w:p>
     <w:p>
@@ -5075,13 +4271,7 @@
         <w:pStyle w:val="ReportBody"/>
       </w:pPr>
       <w:r>
-        <w:rPr>
-          <w:rFonts w:ascii="Times New Roman" w:hAnsi="Times New Roman" w:eastAsia="宋体"/>
-          <w:b w:val="0"/>
-          <w:color w:val="000000"/>
-          <w:sz w:val="24"/>
-        </w:rPr>
-        <w:t>本模块把密码学操作组织为可检查的桌面流程，额外提供关闭投票和签名清单审计，并让用户可视化观察失败案例。后续工作应优先补充独立审计检查点、真实身份认证和事务化存储，而不是仅增加界面按钮。</w:t>
+        <w:t>成员应在自己的电脑复跑相关实验，补全姓名学号、实际贡献与本人修改记录，并现场解释代码、完成教师要求的小改。当前分工是模块划分，不代替个人完成证明。</w:t>
       </w:r>
     </w:p>
     <w:p>
@@ -5089,13 +4279,7 @@
         <w:pStyle w:val="ReportH2"/>
       </w:pPr>
       <w:r>
-        <w:rPr>
-          <w:rFonts w:ascii="Times New Roman" w:hAnsi="Times New Roman" w:eastAsia="宋体"/>
-          <w:b/>
-          <w:color w:val="000000"/>
-          <w:sz w:val="24"/>
-        </w:rPr>
-        <w:t>6.1 安全局限与后续改进</w:t>
+        <w:t>6.3 AI使用声明</w:t>
       </w:r>
     </w:p>
     <w:p>
@@ -5103,13 +4287,7 @@
         <w:pStyle w:val="ReportBody"/>
       </w:pPr>
       <w:r>
-        <w:rPr>
-          <w:rFonts w:ascii="Times New Roman" w:hAnsi="Times New Roman" w:eastAsia="宋体"/>
-          <w:b w:val="0"/>
-          <w:color w:val="000000"/>
-          <w:sz w:val="24"/>
-        </w:rPr>
-        <w:t>系统未实现零知识证明、门限解密、证书认证及完整状态回滚保护。名单ID不是身份认证；私钥持有者能在程序之外解密单票；小群体结果可能暴露个体偏好。签名验证依赖最初可信配置，攻击者若同时替换所有配置、密钥与历史数据，本地应用无法自行建立原始信任。单文件原子写入不等于跨文件事务，当前只支持单机单写入者。</w:t>
+        <w:t>本项目使用OpenAI Codex辅助需求对照、代码与界面实现、联网架构修正、测试执行、报告修订及Git提交。测试数据来自实际运行的合成选票，AI参与范围详见根目录AI使用声明.txt；教师评分、签名和个人复核记录由实际参与者填写。</w:t>
       </w:r>
     </w:p>
     <w:p>
@@ -5117,104 +4295,6 @@
         <w:pStyle w:val="ReportH2"/>
       </w:pPr>
       <w:r>
-        <w:rPr>
-          <w:rFonts w:ascii="Times New Roman" w:hAnsi="Times New Roman" w:eastAsia="宋体"/>
-          <w:b/>
-          <w:color w:val="000000"/>
-          <w:sz w:val="24"/>
-        </w:rPr>
-        <w:t>6.2 分工验收与口试准备</w:t>
-      </w:r>
-    </w:p>
-    <w:p>
-      <w:pPr>
-        <w:pStyle w:val="ReportBody"/>
-      </w:pPr>
-      <w:r>
-        <w:rPr>
-          <w:rFonts w:ascii="Times New Roman" w:hAnsi="Times New Roman" w:eastAsia="宋体"/>
-          <w:b w:val="0"/>
-          <w:color w:val="000000"/>
-          <w:sz w:val="24"/>
-        </w:rPr>
-        <w:t>为什么只存SHA-256不够？攻击者可同时改文件与摘要，需签名和可信公钥。</w:t>
-      </w:r>
-    </w:p>
-    <w:p>
-      <w:pPr>
-        <w:pStyle w:val="ReportBody"/>
-      </w:pPr>
-      <w:r>
-        <w:rPr>
-          <w:rFonts w:ascii="Times New Roman" w:hAnsi="Times New Roman" w:eastAsia="宋体"/>
-          <w:b w:val="0"/>
-          <w:color w:val="000000"/>
-          <w:sz w:val="24"/>
-        </w:rPr>
-        <w:t>为什么删除文件也能发现？签名清单仍保留应存在的文件记录。</w:t>
-      </w:r>
-    </w:p>
-    <w:p>
-      <w:pPr>
-        <w:pStyle w:val="ReportBody"/>
-      </w:pPr>
-      <w:r>
-        <w:rPr>
-          <w:rFonts w:ascii="Times New Roman" w:hAnsi="Times New Roman" w:eastAsia="宋体"/>
-          <w:b w:val="0"/>
-          <w:color w:val="000000"/>
-          <w:sz w:val="24"/>
-        </w:rPr>
-        <w:t>为什么整套回滚不能发现？旧清单签名仍有效，本地缺少可信的最新状态锚点。</w:t>
-      </w:r>
-    </w:p>
-    <w:p>
-      <w:pPr>
-        <w:pStyle w:val="ReportBody"/>
-      </w:pPr>
-      <w:r>
-        <w:rPr>
-          <w:rFonts w:ascii="Times New Roman" w:hAnsi="Times New Roman" w:eastAsia="宋体"/>
-          <w:b w:val="0"/>
-          <w:color w:val="000000"/>
-          <w:sz w:val="24"/>
-        </w:rPr>
-        <w:t>个人验收建议：在自己电脑上重新运行本模块实验，保存截图和测试记录；现场修改一个参数或校验条件，说明修改影响；根据真实参与情况补全姓名、学号与个人总结。</w:t>
-      </w:r>
-    </w:p>
-    <w:p>
-      <w:pPr>
-        <w:pStyle w:val="ReportH2"/>
-      </w:pPr>
-      <w:r>
-        <w:rPr>
-          <w:rFonts w:ascii="Times New Roman" w:hAnsi="Times New Roman" w:eastAsia="宋体"/>
-          <w:b/>
-          <w:color w:val="000000"/>
-          <w:sz w:val="24"/>
-        </w:rPr>
-        <w:t>6.3 AI使用声明</w:t>
-      </w:r>
-    </w:p>
-    <w:p>
-      <w:pPr>
-        <w:pStyle w:val="ReportBody"/>
-      </w:pPr>
-      <w:r>
-        <w:t>本次使用OpenAI Codex辅助审查代码、修订报告、执行实验和拆分Git提交。初稿与本轮修改均有仓库记录，AI参与范围详见根目录AI使用声明.txt。A/B/C为模块责任标识，学生需据真实贡献补全个人信息和复核记录，并独立解释代码。</w:t>
-      </w:r>
-    </w:p>
-    <w:p>
-      <w:pPr>
-        <w:pStyle w:val="ReportH2"/>
-      </w:pPr>
-      <w:r>
-        <w:rPr>
-          <w:rFonts w:ascii="Times New Roman" w:hAnsi="Times New Roman" w:eastAsia="宋体"/>
-          <w:b/>
-          <w:color w:val="000000"/>
-          <w:sz w:val="24"/>
-        </w:rPr>
         <w:t>参考资料</w:t>
       </w:r>
     </w:p>
@@ -5232,7 +4312,7 @@
           <w:color w:val="000000"/>
           <w:sz w:val="21"/>
         </w:rPr>
-        <w:t>[1] 专业课程设计任务书 B230414 2026—2027第一学期。</w:t>
+        <w:t>[1] 专业课程设计任务书，B230414，2026—2027学年第一学期。</w:t>
       </w:r>
     </w:p>
     <w:p>
@@ -5249,7 +4329,7 @@
           <w:color w:val="000000"/>
           <w:sz w:val="21"/>
         </w:rPr>
-        <w:t>[2] python-paillier API Documentation. https://python-paillier.readthedocs.io/en/stable/phe.html</w:t>
+        <w:t>[2] python-paillier API. https://python-paillier.readthedocs.io/en/stable/phe.html</w:t>
       </w:r>
     </w:p>
     <w:p>
@@ -5266,7 +4346,7 @@
           <w:color w:val="000000"/>
           <w:sz w:val="21"/>
         </w:rPr>
-        <w:t>[3] Cryptography Ed25519 signing. https://cryptography.io/en/latest/hazmat/primitives/asymmetric/ed25519/</w:t>
+        <w:t>[3] Cryptography Ed25519. https://cryptography.io/en/latest/hazmat/primitives/asymmetric/ed25519/</w:t>
       </w:r>
     </w:p>
     <w:p>
@@ -5283,7 +4363,24 @@
           <w:color w:val="000000"/>
           <w:sz w:val="21"/>
         </w:rPr>
-        <w:t>[4] PyInstaller Using PyInstaller. https://pyinstaller.org/en/stable/usage.html</w:t>
+        <w:t>[4] Python sqlite3. https://docs.python.org/3/library/sqlite3.html</w:t>
+      </w:r>
+    </w:p>
+    <w:p>
+      <w:pPr>
+        <w:pStyle w:val="ReportBody"/>
+        <w:spacing w:line="288" w:lineRule="auto"/>
+        <w:ind w:firstLine="0"/>
+        <w:jc w:val="left"/>
+      </w:pPr>
+      <w:r>
+        <w:rPr>
+          <w:rFonts w:ascii="Times New Roman" w:hAnsi="Times New Roman" w:eastAsia="宋体"/>
+          <w:b w:val="0"/>
+          <w:color w:val="000000"/>
+          <w:sz w:val="21"/>
+        </w:rPr>
+        <w:t>[5] Python ssl. https://docs.python.org/3/library/ssl.html</w:t>
       </w:r>
     </w:p>
     <w:sectPr>
@@ -5907,7 +5004,7 @@
       <w:keepLines/>
       <w:widowControl/>
       <w:spacing w:after="0" w:before="0" w:line="240" w:lineRule="auto"/>
-      <w:ind w:firstLine="0" w:left="240"/>
+      <w:ind w:left="240" w:firstLine="0"/>
       <w:jc w:val="left"/>
     </w:pPr>
     <w:rPr>

</xml_diff>